<commit_message>
update UI & logic
</commit_message>
<xml_diff>
--- a/FIT_HCMUS_EC_Project_Assigment_2026_v1.0.docx
+++ b/FIT_HCMUS_EC_Project_Assigment_2026_v1.0.docx
@@ -1,6 +1,6 @@
 
 <file path=word/document.xml><?xml version="1.0" encoding="utf-8"?>
-<w:document xmlns:wpc="http://schemas.microsoft.com/office/word/2010/wordprocessingCanvas" xmlns:cx="http://schemas.microsoft.com/office/drawing/2014/chartex" xmlns:mc="http://schemas.openxmlformats.org/markup-compatibility/2006" xmlns:o="urn:schemas-microsoft-com:office:office" xmlns:r="http://schemas.openxmlformats.org/officeDocument/2006/relationships" xmlns:m="http://schemas.openxmlformats.org/officeDocument/2006/math" xmlns:v="urn:schemas-microsoft-com:vml" xmlns:wp14="http://schemas.microsoft.com/office/word/2010/wordprocessingDrawing" xmlns:wp="http://schemas.openxmlformats.org/drawingml/2006/wordprocessingDrawing" xmlns:w10="urn:schemas-microsoft-com:office:word" xmlns:w="http://schemas.openxmlformats.org/wordprocessingml/2006/main" xmlns:w14="http://schemas.microsoft.com/office/word/2010/wordml" xmlns:w15="http://schemas.microsoft.com/office/word/2012/wordml" xmlns:w16se="http://schemas.microsoft.com/office/word/2015/wordml/symex" xmlns:wpg="http://schemas.microsoft.com/office/word/2010/wordprocessingGroup" xmlns:wpi="http://schemas.microsoft.com/office/word/2010/wordprocessingInk" xmlns:wne="http://schemas.microsoft.com/office/word/2006/wordml" xmlns:wps="http://schemas.microsoft.com/office/word/2010/wordprocessingShape" mc:Ignorable="w14 w15 w16se wp14">
+<w:document xmlns:wpc="http://schemas.microsoft.com/office/word/2010/wordprocessingCanvas" xmlns:cx="http://schemas.microsoft.com/office/drawing/2014/chartex" xmlns:cx1="http://schemas.microsoft.com/office/drawing/2015/9/8/chartex" xmlns:cx2="http://schemas.microsoft.com/office/drawing/2015/10/21/chartex" xmlns:cx3="http://schemas.microsoft.com/office/drawing/2016/5/9/chartex" xmlns:cx4="http://schemas.microsoft.com/office/drawing/2016/5/10/chartex" xmlns:cx5="http://schemas.microsoft.com/office/drawing/2016/5/11/chartex" xmlns:cx6="http://schemas.microsoft.com/office/drawing/2016/5/12/chartex" xmlns:cx7="http://schemas.microsoft.com/office/drawing/2016/5/13/chartex" xmlns:cx8="http://schemas.microsoft.com/office/drawing/2016/5/14/chartex" xmlns:mc="http://schemas.openxmlformats.org/markup-compatibility/2006" xmlns:aink="http://schemas.microsoft.com/office/drawing/2016/ink" xmlns:am3d="http://schemas.microsoft.com/office/drawing/2017/model3d" xmlns:o="urn:schemas-microsoft-com:office:office" xmlns:oel="http://schemas.microsoft.com/office/2019/extlst" xmlns:r="http://schemas.openxmlformats.org/officeDocument/2006/relationships" xmlns:m="http://schemas.openxmlformats.org/officeDocument/2006/math" xmlns:v="urn:schemas-microsoft-com:vml" xmlns:wp14="http://schemas.microsoft.com/office/word/2010/wordprocessingDrawing" xmlns:wp="http://schemas.openxmlformats.org/drawingml/2006/wordprocessingDrawing" xmlns:w10="urn:schemas-microsoft-com:office:word" xmlns:w="http://schemas.openxmlformats.org/wordprocessingml/2006/main" xmlns:w14="http://schemas.microsoft.com/office/word/2010/wordml" xmlns:w15="http://schemas.microsoft.com/office/word/2012/wordml" xmlns:w16cex="http://schemas.microsoft.com/office/word/2018/wordml/cex" xmlns:w16cid="http://schemas.microsoft.com/office/word/2016/wordml/cid" xmlns:w16="http://schemas.microsoft.com/office/word/2018/wordml" xmlns:w16du="http://schemas.microsoft.com/office/word/2023/wordml/word16du" xmlns:w16sdtdh="http://schemas.microsoft.com/office/word/2020/wordml/sdtdatahash" xmlns:w16sdtfl="http://schemas.microsoft.com/office/word/2024/wordml/sdtformatlock" xmlns:w16se="http://schemas.microsoft.com/office/word/2015/wordml/symex" xmlns:wpg="http://schemas.microsoft.com/office/word/2010/wordprocessingGroup" xmlns:wpi="http://schemas.microsoft.com/office/word/2010/wordprocessingInk" xmlns:wne="http://schemas.microsoft.com/office/word/2006/wordml" xmlns:wps="http://schemas.microsoft.com/office/word/2010/wordprocessingShape" mc:Ignorable="w14 w15 w16se w16cid w16 w16cex w16sdtdh w16sdtfl w16du wp14">
   <w:body>
     <w:p>
       <w:pPr>
@@ -177,7 +177,7 @@
         <mc:AlternateContent>
           <mc:Choice Requires="wpg">
             <w:drawing>
-              <wp:anchor distT="0" distB="0" distL="114300" distR="114300" simplePos="0" relativeHeight="251658240" behindDoc="0" locked="0" layoutInCell="1" allowOverlap="1">
+              <wp:anchor distT="0" distB="0" distL="114300" distR="114300" simplePos="0" relativeHeight="251658240" behindDoc="0" locked="0" layoutInCell="1" allowOverlap="1" wp14:anchorId="1A055076" wp14:editId="58EC8154">
                 <wp:simplePos x="0" y="0"/>
                 <wp:positionH relativeFrom="page">
                   <wp:posOffset>0</wp:posOffset>
@@ -441,7 +441,7 @@
           </mc:Choice>
           <mc:Fallback>
             <w:pict>
-              <v:group id="Group 36931" o:spid="_x0000_s1026" style="position:absolute;left:0;text-align:left;margin-left:0;margin-top:.45pt;width:611.25pt;height:267.7pt;z-index:251658240;mso-position-horizontal-relative:page;mso-position-vertical-relative:page" coordsize="77628,33996" o:gfxdata="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">
+              <v:group w14:anchorId="1A055076" id="Group 36931" o:spid="_x0000_s1026" style="position:absolute;left:0;text-align:left;margin-left:0;margin-top:.45pt;width:611.25pt;height:267.7pt;z-index:251658240;mso-position-horizontal-relative:page;mso-position-vertical-relative:page" coordsize="77628,33996" o:gfxdata="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">
                 <v:shape id="Shape 17" o:spid="_x0000_s1027" style="position:absolute;width:77628;height:12571;visibility:visible;mso-wrap-style:square;v-text-anchor:top" coordsize="7762875,1257173" o:gfxdata="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" path="m,l7762875,r,1257173l3842385,816229,,1214755,,xe" fillcolor="#4f81bd" stroked="f" strokeweight="0">
                   <v:stroke miterlimit="83231f" joinstyle="miter"/>
                   <v:path arrowok="t" textboxrect="0,0,7762875,1257173"/>
@@ -561,7 +561,7 @@
         <mc:AlternateContent>
           <mc:Choice Requires="wpg">
             <w:drawing>
-              <wp:inline distT="0" distB="0" distL="0" distR="0">
+              <wp:inline distT="0" distB="0" distL="0" distR="0" wp14:anchorId="042A51C8" wp14:editId="66900619">
                 <wp:extent cx="3991610" cy="2712085"/>
                 <wp:effectExtent l="0" t="0" r="0" b="0"/>
                 <wp:docPr id="36932" name="Group 36932"/>
@@ -1012,7 +1012,7 @@
           </mc:Choice>
           <mc:Fallback>
             <w:pict>
-              <v:group id="Group 36932" o:spid="_x0000_s1034" style="width:314.3pt;height:213.55pt;mso-position-horizontal-relative:char;mso-position-vertical-relative:line" coordsize="39916,27120" o:gfxdata="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">
+              <v:group w14:anchorId="042A51C8" id="Group 36932" o:spid="_x0000_s1034" style="width:314.3pt;height:213.55pt;mso-position-horizontal-relative:char;mso-position-vertical-relative:line" coordsize="39916,27120" o:gfxdata="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">
                 <v:rect id="Rectangle 36" o:spid="_x0000_s1035" style="position:absolute;left:7128;top:5229;width:760;height:2717;visibility:visible;mso-wrap-style:square;v-text-anchor:top" o:gfxdata="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" filled="f" stroked="f">
                   <v:textbox inset="0,0,0,0">
                     <w:txbxContent>
@@ -1429,7 +1429,7 @@
         <mc:AlternateContent>
           <mc:Choice Requires="wpg">
             <w:drawing>
-              <wp:anchor distT="0" distB="0" distL="114300" distR="114300" simplePos="0" relativeHeight="251659264" behindDoc="0" locked="0" layoutInCell="1" allowOverlap="1">
+              <wp:anchor distT="0" distB="0" distL="114300" distR="114300" simplePos="0" relativeHeight="251659264" behindDoc="0" locked="0" layoutInCell="1" allowOverlap="1" wp14:anchorId="3E46DFDF" wp14:editId="40075257">
                 <wp:simplePos x="0" y="0"/>
                 <wp:positionH relativeFrom="page">
                   <wp:posOffset>905193</wp:posOffset>
@@ -2440,7 +2440,7 @@
           </mc:Choice>
           <mc:Fallback>
             <w:pict>
-              <v:group id="Group 38742" o:spid="_x0000_s1045" style="position:absolute;left:0;text-align:left;margin-left:71.3pt;margin-top:36pt;width:468.95pt;height:23.8pt;z-index:251659264;mso-position-horizontal-relative:page;mso-position-vertical-relative:page" coordsize="59557,3019" o:gfxdata="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">
+              <v:group w14:anchorId="3E46DFDF" id="Group 38742" o:spid="_x0000_s1045" style="position:absolute;left:0;text-align:left;margin-left:71.3pt;margin-top:36pt;width:468.95pt;height:23.8pt;z-index:251659264;mso-position-horizontal-relative:page;mso-position-vertical-relative:page" coordsize="59557,3019" o:gfxdata="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">
                 <v:shape id="Shape 44377" o:spid="_x0000_s1046" style="position:absolute;left:95;width:33894;height:2924;visibility:visible;mso-wrap-style:square;v-text-anchor:top" coordsize="3389376,292418" o:gfxdata="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" path="m,l3389376,r,292418l,292418,,e" fillcolor="#0070c0" stroked="f" strokeweight="0">
                   <v:stroke miterlimit="83231f" joinstyle="miter"/>
                   <v:path arrowok="t" textboxrect="0,0,3389376,292418"/>
@@ -3205,7 +3205,7 @@
         <mc:AlternateContent>
           <mc:Choice Requires="wpg">
             <w:drawing>
-              <wp:inline distT="0" distB="0" distL="0" distR="0">
+              <wp:inline distT="0" distB="0" distL="0" distR="0" wp14:anchorId="73EEB5C2" wp14:editId="27BFD1BC">
                 <wp:extent cx="5946141" cy="282575"/>
                 <wp:effectExtent l="0" t="0" r="0" b="0"/>
                 <wp:docPr id="38743" name="Group 38743"/>
@@ -3946,7 +3946,7 @@
           </mc:Choice>
           <mc:Fallback>
             <w:pict>
-              <v:group id="Group 38743" o:spid="_x0000_s1072" style="width:468.2pt;height:22.25pt;mso-position-horizontal-relative:char;mso-position-vertical-relative:line" coordsize="59461,2825" o:gfxdata="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">
+              <v:group w14:anchorId="73EEB5C2" id="Group 38743" o:spid="_x0000_s1072" style="width:468.2pt;height:22.25pt;mso-position-horizontal-relative:char;mso-position-vertical-relative:line" coordsize="59461,2825" o:gfxdata="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">
                 <v:rect id="Rectangle 105" o:spid="_x0000_s1073" style="position:absolute;left:4225;top:1063;width:929;height:1690;visibility:visible;mso-wrap-style:square;v-text-anchor:top" o:gfxdata="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" filled="f" stroked="f">
                   <v:textbox inset="0,0,0,0">
                     <w:txbxContent>
@@ -4601,7 +4601,7 @@
         <mc:AlternateContent>
           <mc:Choice Requires="wpg">
             <w:drawing>
-              <wp:anchor distT="0" distB="0" distL="114300" distR="114300" simplePos="0" relativeHeight="251660288" behindDoc="0" locked="0" layoutInCell="1" allowOverlap="1">
+              <wp:anchor distT="0" distB="0" distL="114300" distR="114300" simplePos="0" relativeHeight="251660288" behindDoc="0" locked="0" layoutInCell="1" allowOverlap="1" wp14:anchorId="04DDCF53" wp14:editId="4C675534">
                 <wp:simplePos x="0" y="0"/>
                 <wp:positionH relativeFrom="page">
                   <wp:posOffset>905193</wp:posOffset>
@@ -5580,7 +5580,7 @@
           </mc:Choice>
           <mc:Fallback>
             <w:pict>
-              <v:group id="Group 38553" o:spid="_x0000_s1090" style="position:absolute;left:0;text-align:left;margin-left:71.3pt;margin-top:36pt;width:468.95pt;height:23.8pt;z-index:251660288;mso-position-horizontal-relative:page;mso-position-vertical-relative:page" coordsize="59557,3019" o:gfxdata="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">
+              <v:group w14:anchorId="04DDCF53" id="Group 38553" o:spid="_x0000_s1090" style="position:absolute;left:0;text-align:left;margin-left:71.3pt;margin-top:36pt;width:468.95pt;height:23.8pt;z-index:251660288;mso-position-horizontal-relative:page;mso-position-vertical-relative:page" coordsize="59557,3019" o:gfxdata="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">
                 <v:shape id="Shape 44405" o:spid="_x0000_s1091" style="position:absolute;left:95;width:33894;height:2924;visibility:visible;mso-wrap-style:square;v-text-anchor:top" coordsize="3389376,292418" o:gfxdata="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" path="m,l3389376,r,292418l,292418,,e" fillcolor="#0070c0" stroked="f" strokeweight="0">
                   <v:stroke miterlimit="83231f" joinstyle="miter"/>
                   <v:path arrowok="t" textboxrect="0,0,3389376,292418"/>
@@ -6101,7 +6101,7 @@
         <mc:AlternateContent>
           <mc:Choice Requires="wpg">
             <w:drawing>
-              <wp:inline distT="0" distB="0" distL="0" distR="0">
+              <wp:inline distT="0" distB="0" distL="0" distR="0" wp14:anchorId="333C929E" wp14:editId="35D1925D">
                 <wp:extent cx="5946141" cy="282575"/>
                 <wp:effectExtent l="0" t="0" r="0" b="0"/>
                 <wp:docPr id="38556" name="Group 38556"/>
@@ -6842,7 +6842,7 @@
           </mc:Choice>
           <mc:Fallback>
             <w:pict>
-              <v:group id="Group 38556" o:spid="_x0000_s1116" style="width:468.2pt;height:22.25pt;mso-position-horizontal-relative:char;mso-position-vertical-relative:line" coordsize="59461,2825" o:gfxdata="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">
+              <v:group w14:anchorId="333C929E" id="Group 38556" o:spid="_x0000_s1116" style="width:468.2pt;height:22.25pt;mso-position-horizontal-relative:char;mso-position-vertical-relative:line" coordsize="59461,2825" o:gfxdata="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">
                 <v:rect id="Rectangle 553" o:spid="_x0000_s1117" style="position:absolute;left:4225;top:1063;width:929;height:1690;visibility:visible;mso-wrap-style:square;v-text-anchor:top" o:gfxdata="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" filled="f" stroked="f">
                   <v:textbox inset="0,0,0,0">
                     <w:txbxContent>
@@ -12678,6 +12678,7 @@
               <w:rPr>
                 <w:rFonts w:ascii="Times New Roman" w:eastAsia="Times New Roman" w:hAnsi="Times New Roman" w:cs="Times New Roman"/>
                 <w:b/>
+                <w:color w:val="00B050"/>
                 <w:sz w:val="19"/>
               </w:rPr>
               <w:t>BR-ADM-01</w:t>
@@ -12686,6 +12687,7 @@
               <w:rPr>
                 <w:rFonts w:ascii="Times New Roman" w:eastAsia="Times New Roman" w:hAnsi="Times New Roman" w:cs="Times New Roman"/>
                 <w:b/>
+                <w:color w:val="00B050"/>
                 <w:sz w:val="26"/>
               </w:rPr>
               <w:t xml:space="preserve"> </w:t>
@@ -12810,6 +12812,7 @@
               <w:rPr>
                 <w:rFonts w:ascii="Times New Roman" w:eastAsia="Times New Roman" w:hAnsi="Times New Roman" w:cs="Times New Roman"/>
                 <w:b/>
+                <w:color w:val="00B050"/>
                 <w:sz w:val="19"/>
               </w:rPr>
               <w:t>BR-ADM-02</w:t>
@@ -12818,6 +12821,7 @@
               <w:rPr>
                 <w:rFonts w:ascii="Times New Roman" w:eastAsia="Times New Roman" w:hAnsi="Times New Roman" w:cs="Times New Roman"/>
                 <w:b/>
+                <w:color w:val="00B050"/>
                 <w:sz w:val="26"/>
               </w:rPr>
               <w:t xml:space="preserve"> </w:t>
@@ -12942,6 +12946,7 @@
               <w:rPr>
                 <w:rFonts w:ascii="Times New Roman" w:eastAsia="Times New Roman" w:hAnsi="Times New Roman" w:cs="Times New Roman"/>
                 <w:b/>
+                <w:color w:val="00B050"/>
                 <w:sz w:val="19"/>
               </w:rPr>
               <w:t>BR-ADM-03</w:t>
@@ -12950,6 +12955,7 @@
               <w:rPr>
                 <w:rFonts w:ascii="Times New Roman" w:eastAsia="Times New Roman" w:hAnsi="Times New Roman" w:cs="Times New Roman"/>
                 <w:b/>
+                <w:color w:val="00B050"/>
                 <w:sz w:val="26"/>
               </w:rPr>
               <w:t xml:space="preserve"> </w:t>
@@ -13334,6 +13340,7 @@
               <w:rPr>
                 <w:rFonts w:ascii="Times New Roman" w:eastAsia="Times New Roman" w:hAnsi="Times New Roman" w:cs="Times New Roman"/>
                 <w:b/>
+                <w:color w:val="00B050"/>
                 <w:sz w:val="19"/>
               </w:rPr>
               <w:t>BR-ADM-06</w:t>
@@ -13342,6 +13349,7 @@
               <w:rPr>
                 <w:rFonts w:ascii="Times New Roman" w:eastAsia="Times New Roman" w:hAnsi="Times New Roman" w:cs="Times New Roman"/>
                 <w:b/>
+                <w:color w:val="00B050"/>
                 <w:sz w:val="26"/>
               </w:rPr>
               <w:t xml:space="preserve"> </w:t>
@@ -15938,8 +15946,6 @@
         </w:rPr>
         <w:t>Chưa hoàn thành: không</w:t>
       </w:r>
-      <w:bookmarkStart w:id="0" w:name="_GoBack"/>
-      <w:bookmarkEnd w:id="0"/>
     </w:p>
     <w:p>
       <w:pPr>
@@ -20313,7 +20319,7 @@
 </file>
 
 <file path=word/endnotes.xml><?xml version="1.0" encoding="utf-8"?>
-<w:endnotes xmlns:wpc="http://schemas.microsoft.com/office/word/2010/wordprocessingCanvas" xmlns:cx="http://schemas.microsoft.com/office/drawing/2014/chartex" xmlns:mc="http://schemas.openxmlformats.org/markup-compatibility/2006" xmlns:o="urn:schemas-microsoft-com:office:office" xmlns:r="http://schemas.openxmlformats.org/officeDocument/2006/relationships" xmlns:m="http://schemas.openxmlformats.org/officeDocument/2006/math" xmlns:v="urn:schemas-microsoft-com:vml" xmlns:wp14="http://schemas.microsoft.com/office/word/2010/wordprocessingDrawing" xmlns:wp="http://schemas.openxmlformats.org/drawingml/2006/wordprocessingDrawing" xmlns:w10="urn:schemas-microsoft-com:office:word" xmlns:w="http://schemas.openxmlformats.org/wordprocessingml/2006/main" xmlns:w14="http://schemas.microsoft.com/office/word/2010/wordml" xmlns:w15="http://schemas.microsoft.com/office/word/2012/wordml" xmlns:w16se="http://schemas.microsoft.com/office/word/2015/wordml/symex" xmlns:wpg="http://schemas.microsoft.com/office/word/2010/wordprocessingGroup" xmlns:wpi="http://schemas.microsoft.com/office/word/2010/wordprocessingInk" xmlns:wne="http://schemas.microsoft.com/office/word/2006/wordml" xmlns:wps="http://schemas.microsoft.com/office/word/2010/wordprocessingShape" mc:Ignorable="w14 w15 w16se wp14">
+<w:endnotes xmlns:wpc="http://schemas.microsoft.com/office/word/2010/wordprocessingCanvas" xmlns:cx="http://schemas.microsoft.com/office/drawing/2014/chartex" xmlns:cx1="http://schemas.microsoft.com/office/drawing/2015/9/8/chartex" xmlns:cx2="http://schemas.microsoft.com/office/drawing/2015/10/21/chartex" xmlns:cx3="http://schemas.microsoft.com/office/drawing/2016/5/9/chartex" xmlns:cx4="http://schemas.microsoft.com/office/drawing/2016/5/10/chartex" xmlns:cx5="http://schemas.microsoft.com/office/drawing/2016/5/11/chartex" xmlns:cx6="http://schemas.microsoft.com/office/drawing/2016/5/12/chartex" xmlns:cx7="http://schemas.microsoft.com/office/drawing/2016/5/13/chartex" xmlns:cx8="http://schemas.microsoft.com/office/drawing/2016/5/14/chartex" xmlns:mc="http://schemas.openxmlformats.org/markup-compatibility/2006" xmlns:aink="http://schemas.microsoft.com/office/drawing/2016/ink" xmlns:am3d="http://schemas.microsoft.com/office/drawing/2017/model3d" xmlns:o="urn:schemas-microsoft-com:office:office" xmlns:oel="http://schemas.microsoft.com/office/2019/extlst" xmlns:r="http://schemas.openxmlformats.org/officeDocument/2006/relationships" xmlns:m="http://schemas.openxmlformats.org/officeDocument/2006/math" xmlns:v="urn:schemas-microsoft-com:vml" xmlns:wp14="http://schemas.microsoft.com/office/word/2010/wordprocessingDrawing" xmlns:wp="http://schemas.openxmlformats.org/drawingml/2006/wordprocessingDrawing" xmlns:w10="urn:schemas-microsoft-com:office:word" xmlns:w="http://schemas.openxmlformats.org/wordprocessingml/2006/main" xmlns:w14="http://schemas.microsoft.com/office/word/2010/wordml" xmlns:w15="http://schemas.microsoft.com/office/word/2012/wordml" xmlns:w16cex="http://schemas.microsoft.com/office/word/2018/wordml/cex" xmlns:w16cid="http://schemas.microsoft.com/office/word/2016/wordml/cid" xmlns:w16="http://schemas.microsoft.com/office/word/2018/wordml" xmlns:w16du="http://schemas.microsoft.com/office/word/2023/wordml/word16du" xmlns:w16sdtdh="http://schemas.microsoft.com/office/word/2020/wordml/sdtdatahash" xmlns:w16sdtfl="http://schemas.microsoft.com/office/word/2024/wordml/sdtformatlock" xmlns:w16se="http://schemas.microsoft.com/office/word/2015/wordml/symex" xmlns:wpg="http://schemas.microsoft.com/office/word/2010/wordprocessingGroup" xmlns:wpi="http://schemas.microsoft.com/office/word/2010/wordprocessingInk" xmlns:wne="http://schemas.microsoft.com/office/word/2006/wordml" xmlns:wps="http://schemas.microsoft.com/office/word/2010/wordprocessingShape" mc:Ignorable="w14 w15 w16se w16cid w16 w16cex w16sdtdh w16sdtfl w16du wp14">
   <w:endnote w:type="separator" w:id="-1">
     <w:p>
       <w:pPr>
@@ -20338,25 +20344,25 @@
 </file>
 
 <file path=word/footer1.xml><?xml version="1.0" encoding="utf-8"?>
-<w:ftr xmlns:wpc="http://schemas.microsoft.com/office/word/2010/wordprocessingCanvas" xmlns:cx="http://schemas.microsoft.com/office/drawing/2014/chartex" xmlns:mc="http://schemas.openxmlformats.org/markup-compatibility/2006" xmlns:o="urn:schemas-microsoft-com:office:office" xmlns:r="http://schemas.openxmlformats.org/officeDocument/2006/relationships" xmlns:m="http://schemas.openxmlformats.org/officeDocument/2006/math" xmlns:v="urn:schemas-microsoft-com:vml" xmlns:wp14="http://schemas.microsoft.com/office/word/2010/wordprocessingDrawing" xmlns:wp="http://schemas.openxmlformats.org/drawingml/2006/wordprocessingDrawing" xmlns:w10="urn:schemas-microsoft-com:office:word" xmlns:w="http://schemas.openxmlformats.org/wordprocessingml/2006/main" xmlns:w14="http://schemas.microsoft.com/office/word/2010/wordml" xmlns:w15="http://schemas.microsoft.com/office/word/2012/wordml" xmlns:w16se="http://schemas.microsoft.com/office/word/2015/wordml/symex" xmlns:wpg="http://schemas.microsoft.com/office/word/2010/wordprocessingGroup" xmlns:wpi="http://schemas.microsoft.com/office/word/2010/wordprocessingInk" xmlns:wne="http://schemas.microsoft.com/office/word/2006/wordml" xmlns:wps="http://schemas.microsoft.com/office/word/2010/wordprocessingShape" mc:Ignorable="w14 w15 w16se wp14">
+<w:ftr xmlns:wpc="http://schemas.microsoft.com/office/word/2010/wordprocessingCanvas" xmlns:cx="http://schemas.microsoft.com/office/drawing/2014/chartex" xmlns:cx1="http://schemas.microsoft.com/office/drawing/2015/9/8/chartex" xmlns:cx2="http://schemas.microsoft.com/office/drawing/2015/10/21/chartex" xmlns:cx3="http://schemas.microsoft.com/office/drawing/2016/5/9/chartex" xmlns:cx4="http://schemas.microsoft.com/office/drawing/2016/5/10/chartex" xmlns:cx5="http://schemas.microsoft.com/office/drawing/2016/5/11/chartex" xmlns:cx6="http://schemas.microsoft.com/office/drawing/2016/5/12/chartex" xmlns:cx7="http://schemas.microsoft.com/office/drawing/2016/5/13/chartex" xmlns:cx8="http://schemas.microsoft.com/office/drawing/2016/5/14/chartex" xmlns:mc="http://schemas.openxmlformats.org/markup-compatibility/2006" xmlns:aink="http://schemas.microsoft.com/office/drawing/2016/ink" xmlns:am3d="http://schemas.microsoft.com/office/drawing/2017/model3d" xmlns:o="urn:schemas-microsoft-com:office:office" xmlns:oel="http://schemas.microsoft.com/office/2019/extlst" xmlns:r="http://schemas.openxmlformats.org/officeDocument/2006/relationships" xmlns:m="http://schemas.openxmlformats.org/officeDocument/2006/math" xmlns:v="urn:schemas-microsoft-com:vml" xmlns:wp14="http://schemas.microsoft.com/office/word/2010/wordprocessingDrawing" xmlns:wp="http://schemas.openxmlformats.org/drawingml/2006/wordprocessingDrawing" xmlns:w10="urn:schemas-microsoft-com:office:word" xmlns:w="http://schemas.openxmlformats.org/wordprocessingml/2006/main" xmlns:w14="http://schemas.microsoft.com/office/word/2010/wordml" xmlns:w15="http://schemas.microsoft.com/office/word/2012/wordml" xmlns:w16cex="http://schemas.microsoft.com/office/word/2018/wordml/cex" xmlns:w16cid="http://schemas.microsoft.com/office/word/2016/wordml/cid" xmlns:w16="http://schemas.microsoft.com/office/word/2018/wordml" xmlns:w16du="http://schemas.microsoft.com/office/word/2023/wordml/word16du" xmlns:w16sdtdh="http://schemas.microsoft.com/office/word/2020/wordml/sdtdatahash" xmlns:w16sdtfl="http://schemas.microsoft.com/office/word/2024/wordml/sdtformatlock" xmlns:w16se="http://schemas.microsoft.com/office/word/2015/wordml/symex" xmlns:wpg="http://schemas.microsoft.com/office/word/2010/wordprocessingGroup" xmlns:wpi="http://schemas.microsoft.com/office/word/2010/wordprocessingInk" xmlns:wne="http://schemas.microsoft.com/office/word/2006/wordml" xmlns:wps="http://schemas.microsoft.com/office/word/2010/wordprocessingShape" mc:Ignorable="w14 w15 w16se w16cid w16 w16cex w16sdtdh w16sdtfl w16du wp14">
   <w:p/>
 </w:ftr>
 </file>
 
 <file path=word/footer2.xml><?xml version="1.0" encoding="utf-8"?>
-<w:ftr xmlns:wpc="http://schemas.microsoft.com/office/word/2010/wordprocessingCanvas" xmlns:cx="http://schemas.microsoft.com/office/drawing/2014/chartex" xmlns:mc="http://schemas.openxmlformats.org/markup-compatibility/2006" xmlns:o="urn:schemas-microsoft-com:office:office" xmlns:r="http://schemas.openxmlformats.org/officeDocument/2006/relationships" xmlns:m="http://schemas.openxmlformats.org/officeDocument/2006/math" xmlns:v="urn:schemas-microsoft-com:vml" xmlns:wp14="http://schemas.microsoft.com/office/word/2010/wordprocessingDrawing" xmlns:wp="http://schemas.openxmlformats.org/drawingml/2006/wordprocessingDrawing" xmlns:w10="urn:schemas-microsoft-com:office:word" xmlns:w="http://schemas.openxmlformats.org/wordprocessingml/2006/main" xmlns:w14="http://schemas.microsoft.com/office/word/2010/wordml" xmlns:w15="http://schemas.microsoft.com/office/word/2012/wordml" xmlns:w16se="http://schemas.microsoft.com/office/word/2015/wordml/symex" xmlns:wpg="http://schemas.microsoft.com/office/word/2010/wordprocessingGroup" xmlns:wpi="http://schemas.microsoft.com/office/word/2010/wordprocessingInk" xmlns:wne="http://schemas.microsoft.com/office/word/2006/wordml" xmlns:wps="http://schemas.microsoft.com/office/word/2010/wordprocessingShape" mc:Ignorable="w14 w15 w16se wp14">
+<w:ftr xmlns:wpc="http://schemas.microsoft.com/office/word/2010/wordprocessingCanvas" xmlns:cx="http://schemas.microsoft.com/office/drawing/2014/chartex" xmlns:cx1="http://schemas.microsoft.com/office/drawing/2015/9/8/chartex" xmlns:cx2="http://schemas.microsoft.com/office/drawing/2015/10/21/chartex" xmlns:cx3="http://schemas.microsoft.com/office/drawing/2016/5/9/chartex" xmlns:cx4="http://schemas.microsoft.com/office/drawing/2016/5/10/chartex" xmlns:cx5="http://schemas.microsoft.com/office/drawing/2016/5/11/chartex" xmlns:cx6="http://schemas.microsoft.com/office/drawing/2016/5/12/chartex" xmlns:cx7="http://schemas.microsoft.com/office/drawing/2016/5/13/chartex" xmlns:cx8="http://schemas.microsoft.com/office/drawing/2016/5/14/chartex" xmlns:mc="http://schemas.openxmlformats.org/markup-compatibility/2006" xmlns:aink="http://schemas.microsoft.com/office/drawing/2016/ink" xmlns:am3d="http://schemas.microsoft.com/office/drawing/2017/model3d" xmlns:o="urn:schemas-microsoft-com:office:office" xmlns:oel="http://schemas.microsoft.com/office/2019/extlst" xmlns:r="http://schemas.openxmlformats.org/officeDocument/2006/relationships" xmlns:m="http://schemas.openxmlformats.org/officeDocument/2006/math" xmlns:v="urn:schemas-microsoft-com:vml" xmlns:wp14="http://schemas.microsoft.com/office/word/2010/wordprocessingDrawing" xmlns:wp="http://schemas.openxmlformats.org/drawingml/2006/wordprocessingDrawing" xmlns:w10="urn:schemas-microsoft-com:office:word" xmlns:w="http://schemas.openxmlformats.org/wordprocessingml/2006/main" xmlns:w14="http://schemas.microsoft.com/office/word/2010/wordml" xmlns:w15="http://schemas.microsoft.com/office/word/2012/wordml" xmlns:w16cex="http://schemas.microsoft.com/office/word/2018/wordml/cex" xmlns:w16cid="http://schemas.microsoft.com/office/word/2016/wordml/cid" xmlns:w16="http://schemas.microsoft.com/office/word/2018/wordml" xmlns:w16du="http://schemas.microsoft.com/office/word/2023/wordml/word16du" xmlns:w16sdtdh="http://schemas.microsoft.com/office/word/2020/wordml/sdtdatahash" xmlns:w16sdtfl="http://schemas.microsoft.com/office/word/2024/wordml/sdtformatlock" xmlns:w16se="http://schemas.microsoft.com/office/word/2015/wordml/symex" xmlns:wpg="http://schemas.microsoft.com/office/word/2010/wordprocessingGroup" xmlns:wpi="http://schemas.microsoft.com/office/word/2010/wordprocessingInk" xmlns:wne="http://schemas.microsoft.com/office/word/2006/wordml" xmlns:wps="http://schemas.microsoft.com/office/word/2010/wordprocessingShape" mc:Ignorable="w14 w15 w16se w16cid w16 w16cex w16sdtdh w16sdtfl w16du wp14">
   <w:p/>
 </w:ftr>
 </file>
 
 <file path=word/footer3.xml><?xml version="1.0" encoding="utf-8"?>
-<w:ftr xmlns:wpc="http://schemas.microsoft.com/office/word/2010/wordprocessingCanvas" xmlns:cx="http://schemas.microsoft.com/office/drawing/2014/chartex" xmlns:mc="http://schemas.openxmlformats.org/markup-compatibility/2006" xmlns:o="urn:schemas-microsoft-com:office:office" xmlns:r="http://schemas.openxmlformats.org/officeDocument/2006/relationships" xmlns:m="http://schemas.openxmlformats.org/officeDocument/2006/math" xmlns:v="urn:schemas-microsoft-com:vml" xmlns:wp14="http://schemas.microsoft.com/office/word/2010/wordprocessingDrawing" xmlns:wp="http://schemas.openxmlformats.org/drawingml/2006/wordprocessingDrawing" xmlns:w10="urn:schemas-microsoft-com:office:word" xmlns:w="http://schemas.openxmlformats.org/wordprocessingml/2006/main" xmlns:w14="http://schemas.microsoft.com/office/word/2010/wordml" xmlns:w15="http://schemas.microsoft.com/office/word/2012/wordml" xmlns:w16se="http://schemas.microsoft.com/office/word/2015/wordml/symex" xmlns:wpg="http://schemas.microsoft.com/office/word/2010/wordprocessingGroup" xmlns:wpi="http://schemas.microsoft.com/office/word/2010/wordprocessingInk" xmlns:wne="http://schemas.microsoft.com/office/word/2006/wordml" xmlns:wps="http://schemas.microsoft.com/office/word/2010/wordprocessingShape" mc:Ignorable="w14 w15 w16se wp14">
+<w:ftr xmlns:wpc="http://schemas.microsoft.com/office/word/2010/wordprocessingCanvas" xmlns:cx="http://schemas.microsoft.com/office/drawing/2014/chartex" xmlns:cx1="http://schemas.microsoft.com/office/drawing/2015/9/8/chartex" xmlns:cx2="http://schemas.microsoft.com/office/drawing/2015/10/21/chartex" xmlns:cx3="http://schemas.microsoft.com/office/drawing/2016/5/9/chartex" xmlns:cx4="http://schemas.microsoft.com/office/drawing/2016/5/10/chartex" xmlns:cx5="http://schemas.microsoft.com/office/drawing/2016/5/11/chartex" xmlns:cx6="http://schemas.microsoft.com/office/drawing/2016/5/12/chartex" xmlns:cx7="http://schemas.microsoft.com/office/drawing/2016/5/13/chartex" xmlns:cx8="http://schemas.microsoft.com/office/drawing/2016/5/14/chartex" xmlns:mc="http://schemas.openxmlformats.org/markup-compatibility/2006" xmlns:aink="http://schemas.microsoft.com/office/drawing/2016/ink" xmlns:am3d="http://schemas.microsoft.com/office/drawing/2017/model3d" xmlns:o="urn:schemas-microsoft-com:office:office" xmlns:oel="http://schemas.microsoft.com/office/2019/extlst" xmlns:r="http://schemas.openxmlformats.org/officeDocument/2006/relationships" xmlns:m="http://schemas.openxmlformats.org/officeDocument/2006/math" xmlns:v="urn:schemas-microsoft-com:vml" xmlns:wp14="http://schemas.microsoft.com/office/word/2010/wordprocessingDrawing" xmlns:wp="http://schemas.openxmlformats.org/drawingml/2006/wordprocessingDrawing" xmlns:w10="urn:schemas-microsoft-com:office:word" xmlns:w="http://schemas.openxmlformats.org/wordprocessingml/2006/main" xmlns:w14="http://schemas.microsoft.com/office/word/2010/wordml" xmlns:w15="http://schemas.microsoft.com/office/word/2012/wordml" xmlns:w16cex="http://schemas.microsoft.com/office/word/2018/wordml/cex" xmlns:w16cid="http://schemas.microsoft.com/office/word/2016/wordml/cid" xmlns:w16="http://schemas.microsoft.com/office/word/2018/wordml" xmlns:w16du="http://schemas.microsoft.com/office/word/2023/wordml/word16du" xmlns:w16sdtdh="http://schemas.microsoft.com/office/word/2020/wordml/sdtdatahash" xmlns:w16sdtfl="http://schemas.microsoft.com/office/word/2024/wordml/sdtformatlock" xmlns:w16se="http://schemas.microsoft.com/office/word/2015/wordml/symex" xmlns:wpg="http://schemas.microsoft.com/office/word/2010/wordprocessingGroup" xmlns:wpi="http://schemas.microsoft.com/office/word/2010/wordprocessingInk" xmlns:wne="http://schemas.microsoft.com/office/word/2006/wordml" xmlns:wps="http://schemas.microsoft.com/office/word/2010/wordprocessingShape" mc:Ignorable="w14 w15 w16se w16cid w16 w16cex w16sdtdh w16sdtfl w16du wp14">
   <w:p/>
 </w:ftr>
 </file>
 
 <file path=word/footer4.xml><?xml version="1.0" encoding="utf-8"?>
-<w:ftr xmlns:wpc="http://schemas.microsoft.com/office/word/2010/wordprocessingCanvas" xmlns:cx="http://schemas.microsoft.com/office/drawing/2014/chartex" xmlns:mc="http://schemas.openxmlformats.org/markup-compatibility/2006" xmlns:o="urn:schemas-microsoft-com:office:office" xmlns:r="http://schemas.openxmlformats.org/officeDocument/2006/relationships" xmlns:m="http://schemas.openxmlformats.org/officeDocument/2006/math" xmlns:v="urn:schemas-microsoft-com:vml" xmlns:wp14="http://schemas.microsoft.com/office/word/2010/wordprocessingDrawing" xmlns:wp="http://schemas.openxmlformats.org/drawingml/2006/wordprocessingDrawing" xmlns:w10="urn:schemas-microsoft-com:office:word" xmlns:w="http://schemas.openxmlformats.org/wordprocessingml/2006/main" xmlns:w14="http://schemas.microsoft.com/office/word/2010/wordml" xmlns:w15="http://schemas.microsoft.com/office/word/2012/wordml" xmlns:w16se="http://schemas.microsoft.com/office/word/2015/wordml/symex" xmlns:wpg="http://schemas.microsoft.com/office/word/2010/wordprocessingGroup" xmlns:wpi="http://schemas.microsoft.com/office/word/2010/wordprocessingInk" xmlns:wne="http://schemas.microsoft.com/office/word/2006/wordml" xmlns:wps="http://schemas.microsoft.com/office/word/2010/wordprocessingShape" mc:Ignorable="w14 w15 w16se wp14">
+<w:ftr xmlns:wpc="http://schemas.microsoft.com/office/word/2010/wordprocessingCanvas" xmlns:cx="http://schemas.microsoft.com/office/drawing/2014/chartex" xmlns:cx1="http://schemas.microsoft.com/office/drawing/2015/9/8/chartex" xmlns:cx2="http://schemas.microsoft.com/office/drawing/2015/10/21/chartex" xmlns:cx3="http://schemas.microsoft.com/office/drawing/2016/5/9/chartex" xmlns:cx4="http://schemas.microsoft.com/office/drawing/2016/5/10/chartex" xmlns:cx5="http://schemas.microsoft.com/office/drawing/2016/5/11/chartex" xmlns:cx6="http://schemas.microsoft.com/office/drawing/2016/5/12/chartex" xmlns:cx7="http://schemas.microsoft.com/office/drawing/2016/5/13/chartex" xmlns:cx8="http://schemas.microsoft.com/office/drawing/2016/5/14/chartex" xmlns:mc="http://schemas.openxmlformats.org/markup-compatibility/2006" xmlns:aink="http://schemas.microsoft.com/office/drawing/2016/ink" xmlns:am3d="http://schemas.microsoft.com/office/drawing/2017/model3d" xmlns:o="urn:schemas-microsoft-com:office:office" xmlns:oel="http://schemas.microsoft.com/office/2019/extlst" xmlns:r="http://schemas.openxmlformats.org/officeDocument/2006/relationships" xmlns:m="http://schemas.openxmlformats.org/officeDocument/2006/math" xmlns:v="urn:schemas-microsoft-com:vml" xmlns:wp14="http://schemas.microsoft.com/office/word/2010/wordprocessingDrawing" xmlns:wp="http://schemas.openxmlformats.org/drawingml/2006/wordprocessingDrawing" xmlns:w10="urn:schemas-microsoft-com:office:word" xmlns:w="http://schemas.openxmlformats.org/wordprocessingml/2006/main" xmlns:w14="http://schemas.microsoft.com/office/word/2010/wordml" xmlns:w15="http://schemas.microsoft.com/office/word/2012/wordml" xmlns:w16cex="http://schemas.microsoft.com/office/word/2018/wordml/cex" xmlns:w16cid="http://schemas.microsoft.com/office/word/2016/wordml/cid" xmlns:w16="http://schemas.microsoft.com/office/word/2018/wordml" xmlns:w16du="http://schemas.microsoft.com/office/word/2023/wordml/word16du" xmlns:w16sdtdh="http://schemas.microsoft.com/office/word/2020/wordml/sdtdatahash" xmlns:w16sdtfl="http://schemas.microsoft.com/office/word/2024/wordml/sdtformatlock" xmlns:w16se="http://schemas.microsoft.com/office/word/2015/wordml/symex" xmlns:wpg="http://schemas.microsoft.com/office/word/2010/wordprocessingGroup" xmlns:wpi="http://schemas.microsoft.com/office/word/2010/wordprocessingInk" xmlns:wne="http://schemas.microsoft.com/office/word/2006/wordml" xmlns:wps="http://schemas.microsoft.com/office/word/2010/wordprocessingShape" mc:Ignorable="w14 w15 w16se w16cid w16 w16cex w16sdtdh w16sdtfl w16du wp14">
   <w:p>
     <w:pPr>
       <w:spacing w:after="75"/>
@@ -20368,7 +20374,7 @@
       <mc:AlternateContent>
         <mc:Choice Requires="wpg">
           <w:drawing>
-            <wp:anchor distT="0" distB="0" distL="114300" distR="114300" simplePos="0" relativeHeight="251667456" behindDoc="0" locked="0" layoutInCell="1" allowOverlap="1">
+            <wp:anchor distT="0" distB="0" distL="114300" distR="114300" simplePos="0" relativeHeight="251667456" behindDoc="0" locked="0" layoutInCell="1" allowOverlap="1" wp14:anchorId="402B8022" wp14:editId="5FDF7BEE">
               <wp:simplePos x="0" y="0"/>
               <wp:positionH relativeFrom="page">
                 <wp:posOffset>686118</wp:posOffset>
@@ -21133,19 +21139,16 @@
             </wp:anchor>
           </w:drawing>
         </mc:Choice>
-        <mc:Fallback xmlns:a="http://schemas.openxmlformats.org/drawingml/2006/main">
+        <mc:Fallback>
           <w:pict>
-            <v:group id="Group 43298" style="width:504.2pt;height:22.245pt;position:absolute;mso-position-horizontal-relative:page;mso-position-horizontal:absolute;margin-left:54.025pt;mso-position-vertical-relative:page;margin-top:686.73pt;" coordsize="64033,2825">
-              <v:rect id="Rectangle 43308" style="position:absolute;width:929;height:1690;left:4222;top:1062;" filled="f" stroked="f">
+            <v:group w14:anchorId="402B8022" id="Group 43298" o:spid="_x0000_s1190" style="position:absolute;margin-left:54.05pt;margin-top:686.75pt;width:504.2pt;height:22.25pt;z-index:251667456;mso-position-horizontal-relative:page;mso-position-vertical-relative:page" coordsize="64033,2825" o:gfxdata="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">
+              <v:rect id="Rectangle 43308" o:spid="_x0000_s1191" style="position:absolute;left:4222;top:1062;width:929;height:1690;visibility:visible;mso-wrap-style:square;v-text-anchor:top" o:gfxdata="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" filled="f" stroked="f">
                 <v:textbox inset="0,0,0,0">
                   <w:txbxContent>
                     <w:p>
-                      <w:pPr>
-                        <w:spacing w:before="0" w:after="160" w:line="259" w:lineRule="auto"/>
-                      </w:pPr>
                       <w:r>
                         <w:rPr>
-                          <w:rFonts w:cs="Times New Roman" w:hAnsi="Times New Roman" w:eastAsia="Times New Roman" w:ascii="Times New Roman"/>
+                          <w:rFonts w:ascii="Times New Roman" w:eastAsia="Times New Roman" w:hAnsi="Times New Roman" w:cs="Times New Roman"/>
                         </w:rPr>
                         <w:t xml:space="preserve">  </w:t>
                       </w:r>
@@ -21153,56 +21156,47 @@
                   </w:txbxContent>
                 </v:textbox>
               </v:rect>
-              <v:rect id="Rectangle 43309" style="position:absolute;width:13821;height:1819;left:4924;top:1014;" filled="f" stroked="f">
+              <v:rect id="Rectangle 43309" o:spid="_x0000_s1192" style="position:absolute;left:4924;top:1014;width:13822;height:1819;visibility:visible;mso-wrap-style:square;v-text-anchor:top" o:gfxdata="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" filled="f" stroked="f">
                 <v:textbox inset="0,0,0,0">
                   <w:txbxContent>
                     <w:p>
-                      <w:pPr>
-                        <w:spacing w:before="0" w:after="160" w:line="259" w:lineRule="auto"/>
-                      </w:pPr>
                       <w:r>
                         <w:rPr>
-                          <w:rFonts w:cs="Segoe UI" w:hAnsi="Segoe UI" w:eastAsia="Segoe UI" w:ascii="Segoe UI"/>
-                          <w:b w:val="1"/>
-                          <w:color w:val="0070c0"/>
+                          <w:rFonts w:ascii="Segoe UI" w:eastAsia="Segoe UI" w:hAnsi="Segoe UI" w:cs="Segoe UI"/>
+                          <w:b/>
+                          <w:color w:val="0070C0"/>
                         </w:rPr>
-                        <w:t xml:space="preserve">Khoa Công Ngh</w:t>
+                        <w:t>Khoa Công Ngh</w:t>
                       </w:r>
                     </w:p>
                   </w:txbxContent>
                 </v:textbox>
               </v:rect>
-              <v:rect id="Rectangle 43310" style="position:absolute;width:1005;height:1819;left:15310;top:1014;" filled="f" stroked="f">
+              <v:rect id="Rectangle 43310" o:spid="_x0000_s1193" style="position:absolute;left:15310;top:1014;width:1005;height:1819;visibility:visible;mso-wrap-style:square;v-text-anchor:top" o:gfxdata="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" filled="f" stroked="f">
                 <v:textbox inset="0,0,0,0">
                   <w:txbxContent>
                     <w:p>
-                      <w:pPr>
-                        <w:spacing w:before="0" w:after="160" w:line="259" w:lineRule="auto"/>
-                      </w:pPr>
                       <w:r>
                         <w:rPr>
-                          <w:rFonts w:cs="Segoe UI" w:hAnsi="Segoe UI" w:eastAsia="Segoe UI" w:ascii="Segoe UI"/>
-                          <w:b w:val="1"/>
-                          <w:color w:val="0070c0"/>
+                          <w:rFonts w:ascii="Segoe UI" w:eastAsia="Segoe UI" w:hAnsi="Segoe UI" w:cs="Segoe UI"/>
+                          <w:b/>
+                          <w:color w:val="0070C0"/>
                         </w:rPr>
-                        <w:t xml:space="preserve">ệ</w:t>
+                        <w:t>ệ</w:t>
                       </w:r>
                     </w:p>
                   </w:txbxContent>
                 </v:textbox>
               </v:rect>
-              <v:rect id="Rectangle 43311" style="position:absolute;width:512;height:1819;left:16072;top:1014;" filled="f" stroked="f">
+              <v:rect id="Rectangle 43311" o:spid="_x0000_s1194" style="position:absolute;left:16072;top:1014;width:513;height:1819;visibility:visible;mso-wrap-style:square;v-text-anchor:top" o:gfxdata="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" filled="f" stroked="f">
                 <v:textbox inset="0,0,0,0">
                   <w:txbxContent>
                     <w:p>
-                      <w:pPr>
-                        <w:spacing w:before="0" w:after="160" w:line="259" w:lineRule="auto"/>
-                      </w:pPr>
                       <w:r>
                         <w:rPr>
-                          <w:rFonts w:cs="Segoe UI" w:hAnsi="Segoe UI" w:eastAsia="Segoe UI" w:ascii="Segoe UI"/>
-                          <w:b w:val="1"/>
-                          <w:color w:val="0070c0"/>
+                          <w:rFonts w:ascii="Segoe UI" w:eastAsia="Segoe UI" w:hAnsi="Segoe UI" w:cs="Segoe UI"/>
+                          <w:b/>
+                          <w:color w:val="0070C0"/>
                         </w:rPr>
                         <w:t xml:space="preserve"> </w:t>
                       </w:r>
@@ -21210,35 +21204,29 @@
                   </w:txbxContent>
                 </v:textbox>
               </v:rect>
-              <v:rect id="Rectangle 43312" style="position:absolute;width:8886;height:1819;left:16453;top:1014;" filled="f" stroked="f">
+              <v:rect id="Rectangle 43312" o:spid="_x0000_s1195" style="position:absolute;left:16453;top:1014;width:8887;height:1819;visibility:visible;mso-wrap-style:square;v-text-anchor:top" o:gfxdata="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" filled="f" stroked="f">
                 <v:textbox inset="0,0,0,0">
                   <w:txbxContent>
                     <w:p>
-                      <w:pPr>
-                        <w:spacing w:before="0" w:after="160" w:line="259" w:lineRule="auto"/>
-                      </w:pPr>
                       <w:r>
                         <w:rPr>
-                          <w:rFonts w:cs="Segoe UI" w:hAnsi="Segoe UI" w:eastAsia="Segoe UI" w:ascii="Segoe UI"/>
-                          <w:b w:val="1"/>
-                          <w:color w:val="0070c0"/>
+                          <w:rFonts w:ascii="Segoe UI" w:eastAsia="Segoe UI" w:hAnsi="Segoe UI" w:cs="Segoe UI"/>
+                          <w:b/>
+                          <w:color w:val="0070C0"/>
                         </w:rPr>
-                        <w:t xml:space="preserve">Thông Tin</w:t>
+                        <w:t>Thông Tin</w:t>
                       </w:r>
                     </w:p>
                   </w:txbxContent>
                 </v:textbox>
               </v:rect>
-              <v:rect id="Rectangle 43313" style="position:absolute;width:548;height:1997;left:23123;top:886;" filled="f" stroked="f">
+              <v:rect id="Rectangle 43313" o:spid="_x0000_s1196" style="position:absolute;left:23123;top:886;width:549;height:1998;visibility:visible;mso-wrap-style:square;v-text-anchor:top" o:gfxdata="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" filled="f" stroked="f">
                 <v:textbox inset="0,0,0,0">
                   <w:txbxContent>
                     <w:p>
-                      <w:pPr>
-                        <w:spacing w:before="0" w:after="160" w:line="259" w:lineRule="auto"/>
-                      </w:pPr>
                       <w:r>
                         <w:rPr>
-                          <w:rFonts w:cs="Times New Roman" w:hAnsi="Times New Roman" w:eastAsia="Times New Roman" w:ascii="Times New Roman"/>
+                          <w:rFonts w:ascii="Times New Roman" w:eastAsia="Times New Roman" w:hAnsi="Times New Roman" w:cs="Times New Roman"/>
                           <w:sz w:val="26"/>
                         </w:rPr>
                         <w:t xml:space="preserve"> </w:t>
@@ -21247,48 +21235,58 @@
                   </w:txbxContent>
                 </v:textbox>
               </v:rect>
-              <v:shape id="Shape 44519" style="position:absolute;width:6416;height:2730;left:57616;top:94;" coordsize="641668,273050" path="m0,0l641668,0l641668,273050l0,273050l0,0">
-                <v:stroke weight="0pt" endcap="flat" joinstyle="miter" miterlimit="10" on="false" color="#000000" opacity="0"/>
-                <v:fill on="true" color="#0070c0"/>
+              <v:shape id="Shape 44511" o:spid="_x0000_s1197" style="position:absolute;left:57616;top:94;width:6417;height:2731;visibility:visible;mso-wrap-style:square;v-text-anchor:top" coordsize="641668,273050" o:gfxdata="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" path="m,l641668,r,273050l,273050,,e" fillcolor="#0070c0" stroked="f" strokeweight="0">
+                <v:stroke miterlimit="83231f" joinstyle="miter"/>
+                <v:path arrowok="t" textboxrect="0,0,641668,273050"/>
               </v:shape>
-              <v:shape id="Shape 44520" style="position:absolute;width:4953;height:1746;left:58350;top:539;" coordsize="495300,174625" path="m0,0l495300,0l495300,174625l0,174625l0,0">
-                <v:stroke weight="0pt" endcap="flat" joinstyle="miter" miterlimit="10" on="false" color="#000000" opacity="0"/>
-                <v:fill on="true" color="#0070c0"/>
+              <v:shape id="Shape 44512" o:spid="_x0000_s1198" style="position:absolute;left:58350;top:539;width:4953;height:1746;visibility:visible;mso-wrap-style:square;v-text-anchor:top" coordsize="495300,174625" o:gfxdata="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" path="m,l495300,r,174625l,174625,,e" fillcolor="#0070c0" stroked="f" strokeweight="0">
+                <v:stroke miterlimit="83231f" joinstyle="miter"/>
+                <v:path arrowok="t" textboxrect="0,0,495300,174625"/>
               </v:shape>
-              <v:rect id="Rectangle 43314" style="position:absolute;width:1013;height:1811;left:60446;top:935;" filled="f" stroked="f">
+              <v:rect id="Rectangle 43314" o:spid="_x0000_s1199" style="position:absolute;left:60446;top:935;width:1013;height:1811;visibility:visible;mso-wrap-style:square;v-text-anchor:top" o:gfxdata="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" filled="f" stroked="f">
                 <v:textbox inset="0,0,0,0">
                   <w:txbxContent>
                     <w:p>
-                      <w:pPr>
-                        <w:spacing w:before="0" w:after="160" w:line="259" w:lineRule="auto"/>
-                      </w:pPr>
-                      <w:fldSimple w:instr=" PAGE   \* MERGEFORMAT ">
-                        <w:r>
-                          <w:rPr>
-                            <w:rFonts w:cs="Times New Roman" w:hAnsi="Times New Roman" w:eastAsia="Times New Roman" w:ascii="Times New Roman"/>
-                            <w:b w:val="1"/>
-                            <w:color w:val="ffffff"/>
-                            <w:sz w:val="24"/>
-                          </w:rPr>
-                          <w:t xml:space="preserve">3</w:t>
-                        </w:r>
-                      </w:fldSimple>
+                      <w:r>
+                        <w:fldChar w:fldCharType="begin"/>
+                      </w:r>
+                      <w:r>
+                        <w:instrText xml:space="preserve"> PAGE   \* MERGEFORMAT </w:instrText>
+                      </w:r>
+                      <w:r>
+                        <w:fldChar w:fldCharType="separate"/>
+                      </w:r>
+                      <w:r>
+                        <w:rPr>
+                          <w:rFonts w:ascii="Times New Roman" w:eastAsia="Times New Roman" w:hAnsi="Times New Roman" w:cs="Times New Roman"/>
+                          <w:b/>
+                          <w:color w:val="FFFFFF"/>
+                          <w:sz w:val="24"/>
+                        </w:rPr>
+                        <w:t>3</w:t>
+                      </w:r>
+                      <w:r>
+                        <w:rPr>
+                          <w:rFonts w:ascii="Times New Roman" w:eastAsia="Times New Roman" w:hAnsi="Times New Roman" w:cs="Times New Roman"/>
+                          <w:b/>
+                          <w:color w:val="FFFFFF"/>
+                          <w:sz w:val="24"/>
+                        </w:rPr>
+                        <w:fldChar w:fldCharType="end"/>
+                      </w:r>
                     </w:p>
                   </w:txbxContent>
                 </v:textbox>
               </v:rect>
-              <v:rect id="Rectangle 43315" style="position:absolute;width:548;height:1962;left:61207;top:849;" filled="f" stroked="f">
+              <v:rect id="Rectangle 43315" o:spid="_x0000_s1200" style="position:absolute;left:61207;top:849;width:548;height:1962;visibility:visible;mso-wrap-style:square;v-text-anchor:top" o:gfxdata="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" filled="f" stroked="f">
                 <v:textbox inset="0,0,0,0">
                   <w:txbxContent>
                     <w:p>
-                      <w:pPr>
-                        <w:spacing w:before="0" w:after="160" w:line="259" w:lineRule="auto"/>
-                      </w:pPr>
                       <w:r>
                         <w:rPr>
-                          <w:rFonts w:cs="Times New Roman" w:hAnsi="Times New Roman" w:eastAsia="Times New Roman" w:ascii="Times New Roman"/>
-                          <w:b w:val="1"/>
-                          <w:color w:val="ffffff"/>
+                          <w:rFonts w:ascii="Times New Roman" w:eastAsia="Times New Roman" w:hAnsi="Times New Roman" w:cs="Times New Roman"/>
+                          <w:b/>
+                          <w:color w:val="FFFFFF"/>
                           <w:sz w:val="26"/>
                         </w:rPr>
                         <w:t xml:space="preserve"> </w:t>
@@ -21297,34 +21295,53 @@
                   </w:txbxContent>
                 </v:textbox>
               </v:rect>
-              <v:shape id="Shape 44521" style="position:absolute;width:57617;height:91;left:0;top:0;" coordsize="5761736,9144" path="m0,0l5761736,0l5761736,9144l0,9144l0,0">
-                <v:stroke weight="0pt" endcap="flat" joinstyle="miter" miterlimit="10" on="false" color="#000000" opacity="0"/>
-                <v:fill on="true" color="#0070c0"/>
+              <v:shape id="Shape 44513" o:spid="_x0000_s1201" style="position:absolute;width:57617;height:91;visibility:visible;mso-wrap-style:square;v-text-anchor:top" coordsize="5761736,9144" o:gfxdata="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" path="m,l5761736,r,9144l,9144,,e" fillcolor="#0070c0" stroked="f" strokeweight="0">
+                <v:stroke miterlimit="83231f" joinstyle="miter"/>
+                <v:path arrowok="t" textboxrect="0,0,5761736,9144"/>
               </v:shape>
-              <v:shape id="Shape 44522" style="position:absolute;width:91;height:444;left:57616;top:63;" coordsize="9144,44450" path="m0,0l9144,0l9144,44450l0,44450l0,0">
-                <v:stroke weight="0pt" endcap="flat" joinstyle="miter" miterlimit="10" on="false" color="#000000" opacity="0"/>
-                <v:fill on="true" color="#0070c0"/>
+              <v:shape id="Shape 44514" o:spid="_x0000_s1202" style="position:absolute;left:57616;top:63;width:92;height:445;visibility:visible;mso-wrap-style:square;v-text-anchor:top" coordsize="9144,44450" o:gfxdata="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" path="m,l9144,r,44450l,44450,,e" fillcolor="#0070c0" stroked="f" strokeweight="0">
+                <v:stroke miterlimit="83231f" joinstyle="miter"/>
+                <v:path arrowok="t" textboxrect="0,0,9144,44450"/>
               </v:shape>
-              <v:shape id="Shape 44523" style="position:absolute;width:91;height:91;left:57616;top:0;" coordsize="9144,9144" path="m0,0l9144,0l9144,9144l0,9144l0,0">
-                <v:stroke weight="0pt" endcap="flat" joinstyle="miter" miterlimit="10" on="false" color="#000000" opacity="0"/>
-                <v:fill on="true" color="#0070c0"/>
+              <v:shape id="Shape 44515" o:spid="_x0000_s1203" style="position:absolute;left:57616;width:92;height:91;visibility:visible;mso-wrap-style:square;v-text-anchor:top" coordsize="9144,9144" o:gfxdata="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" path="m,l9144,r,9144l,9144,,e" fillcolor="#0070c0" stroked="f" strokeweight="0">
+                <v:stroke miterlimit="83231f" joinstyle="miter"/>
+                <v:path arrowok="t" textboxrect="0,0,9144,9144"/>
               </v:shape>
-              <v:shape id="Shape 44524" style="position:absolute;width:6353;height:91;left:57680;top:0;" coordsize="635318,9144" path="m0,0l635318,0l635318,9144l0,9144l0,0">
-                <v:stroke weight="0pt" endcap="flat" joinstyle="miter" miterlimit="10" on="false" color="#000000" opacity="0"/>
-                <v:fill on="true" color="#0070c0"/>
+              <v:shape id="Shape 44516" o:spid="_x0000_s1204" style="position:absolute;left:57680;width:6353;height:91;visibility:visible;mso-wrap-style:square;v-text-anchor:top" coordsize="635318,9144" o:gfxdata="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" path="m,l635318,r,9144l,9144,,e" fillcolor="#0070c0" stroked="f" strokeweight="0">
+                <v:stroke miterlimit="83231f" joinstyle="miter"/>
+                <v:path arrowok="t" textboxrect="0,0,635318,9144"/>
               </v:shape>
-              <v:shape id="Shape 44525" style="position:absolute;width:6353;height:444;left:57680;top:63;" coordsize="635318,44450" path="m0,0l635318,0l635318,44450l0,44450l0,0">
-                <v:stroke weight="0pt" endcap="flat" joinstyle="miter" miterlimit="10" on="false" color="#000000" opacity="0"/>
-                <v:fill on="true" color="#0070c0"/>
+              <v:shape id="Shape 44517" o:spid="_x0000_s1205" style="position:absolute;left:57680;top:63;width:6353;height:445;visibility:visible;mso-wrap-style:square;v-text-anchor:top" coordsize="635318,44450" o:gfxdata="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" path="m,l635318,r,44450l,44450,,e" fillcolor="#0070c0" stroked="f" strokeweight="0">
+                <v:stroke miterlimit="83231f" joinstyle="miter"/>
+                <v:path arrowok="t" textboxrect="0,0,635318,44450"/>
               </v:shape>
-              <v:shape id="Shape 44526" style="position:absolute;width:6416;height:444;left:57616;top:2380;" coordsize="641668,44450" path="m0,0l641668,0l641668,44450l0,44450l0,0">
-                <v:stroke weight="0pt" endcap="flat" joinstyle="miter" miterlimit="10" on="false" color="#000000" opacity="0"/>
-                <v:fill on="true" color="#0070c0"/>
+              <v:shape id="Shape 44518" o:spid="_x0000_s1206" style="position:absolute;left:57616;top:2380;width:6417;height:445;visibility:visible;mso-wrap-style:square;v-text-anchor:top" coordsize="641668,44450" o:gfxdata="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" path="m,l641668,r,44450l,44450,,e" fillcolor="#0070c0" stroked="f" strokeweight="0">
+                <v:stroke miterlimit="83231f" joinstyle="miter"/>
+                <v:path arrowok="t" textboxrect="0,0,641668,44450"/>
               </v:shape>
-              <v:shape id="Picture 43307" style="position:absolute;width:3490;height:1162;left:727;top:840;" filled="f">
-                <v:imagedata r:id="rId16"/>
+              <v:shapetype id="_x0000_t75" coordsize="21600,21600" o:spt="75" o:preferrelative="t" path="m@4@5l@4@11@9@11@9@5xe" filled="f" stroked="f">
+                <v:stroke joinstyle="miter"/>
+                <v:formulas>
+                  <v:f eqn="if lineDrawn pixelLineWidth 0"/>
+                  <v:f eqn="sum @0 1 0"/>
+                  <v:f eqn="sum 0 0 @1"/>
+                  <v:f eqn="prod @2 1 2"/>
+                  <v:f eqn="prod @3 21600 pixelWidth"/>
+                  <v:f eqn="prod @3 21600 pixelHeight"/>
+                  <v:f eqn="sum @0 0 1"/>
+                  <v:f eqn="prod @6 1 2"/>
+                  <v:f eqn="prod @7 21600 pixelWidth"/>
+                  <v:f eqn="sum @8 21600 0"/>
+                  <v:f eqn="prod @7 21600 pixelHeight"/>
+                  <v:f eqn="sum @10 21600 0"/>
+                </v:formulas>
+                <v:path o:extrusionok="f" gradientshapeok="t" o:connecttype="rect"/>
+                <o:lock v:ext="edit" aspectratio="t"/>
+              </v:shapetype>
+              <v:shape id="Picture 43307" o:spid="_x0000_s1207" type="#_x0000_t75" style="position:absolute;left:727;top:840;width:3490;height:1162;visibility:visible;mso-wrap-style:square" o:gfxdata="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">
+                <v:imagedata r:id="rId2" o:title=""/>
               </v:shape>
-              <w10:wrap type="square"/>
+              <w10:wrap type="square" anchorx="page" anchory="page"/>
             </v:group>
           </w:pict>
         </mc:Fallback>
@@ -21354,7 +21371,7 @@
 </file>
 
 <file path=word/footer5.xml><?xml version="1.0" encoding="utf-8"?>
-<w:ftr xmlns:wpc="http://schemas.microsoft.com/office/word/2010/wordprocessingCanvas" xmlns:cx="http://schemas.microsoft.com/office/drawing/2014/chartex" xmlns:mc="http://schemas.openxmlformats.org/markup-compatibility/2006" xmlns:o="urn:schemas-microsoft-com:office:office" xmlns:r="http://schemas.openxmlformats.org/officeDocument/2006/relationships" xmlns:m="http://schemas.openxmlformats.org/officeDocument/2006/math" xmlns:v="urn:schemas-microsoft-com:vml" xmlns:wp14="http://schemas.microsoft.com/office/word/2010/wordprocessingDrawing" xmlns:wp="http://schemas.openxmlformats.org/drawingml/2006/wordprocessingDrawing" xmlns:w10="urn:schemas-microsoft-com:office:word" xmlns:w="http://schemas.openxmlformats.org/wordprocessingml/2006/main" xmlns:w14="http://schemas.microsoft.com/office/word/2010/wordml" xmlns:w15="http://schemas.microsoft.com/office/word/2012/wordml" xmlns:w16se="http://schemas.microsoft.com/office/word/2015/wordml/symex" xmlns:wpg="http://schemas.microsoft.com/office/word/2010/wordprocessingGroup" xmlns:wpi="http://schemas.microsoft.com/office/word/2010/wordprocessingInk" xmlns:wne="http://schemas.microsoft.com/office/word/2006/wordml" xmlns:wps="http://schemas.microsoft.com/office/word/2010/wordprocessingShape" mc:Ignorable="w14 w15 w16se wp14">
+<w:ftr xmlns:wpc="http://schemas.microsoft.com/office/word/2010/wordprocessingCanvas" xmlns:cx="http://schemas.microsoft.com/office/drawing/2014/chartex" xmlns:cx1="http://schemas.microsoft.com/office/drawing/2015/9/8/chartex" xmlns:cx2="http://schemas.microsoft.com/office/drawing/2015/10/21/chartex" xmlns:cx3="http://schemas.microsoft.com/office/drawing/2016/5/9/chartex" xmlns:cx4="http://schemas.microsoft.com/office/drawing/2016/5/10/chartex" xmlns:cx5="http://schemas.microsoft.com/office/drawing/2016/5/11/chartex" xmlns:cx6="http://schemas.microsoft.com/office/drawing/2016/5/12/chartex" xmlns:cx7="http://schemas.microsoft.com/office/drawing/2016/5/13/chartex" xmlns:cx8="http://schemas.microsoft.com/office/drawing/2016/5/14/chartex" xmlns:mc="http://schemas.openxmlformats.org/markup-compatibility/2006" xmlns:aink="http://schemas.microsoft.com/office/drawing/2016/ink" xmlns:am3d="http://schemas.microsoft.com/office/drawing/2017/model3d" xmlns:o="urn:schemas-microsoft-com:office:office" xmlns:oel="http://schemas.microsoft.com/office/2019/extlst" xmlns:r="http://schemas.openxmlformats.org/officeDocument/2006/relationships" xmlns:m="http://schemas.openxmlformats.org/officeDocument/2006/math" xmlns:v="urn:schemas-microsoft-com:vml" xmlns:wp14="http://schemas.microsoft.com/office/word/2010/wordprocessingDrawing" xmlns:wp="http://schemas.openxmlformats.org/drawingml/2006/wordprocessingDrawing" xmlns:w10="urn:schemas-microsoft-com:office:word" xmlns:w="http://schemas.openxmlformats.org/wordprocessingml/2006/main" xmlns:w14="http://schemas.microsoft.com/office/word/2010/wordml" xmlns:w15="http://schemas.microsoft.com/office/word/2012/wordml" xmlns:w16cex="http://schemas.microsoft.com/office/word/2018/wordml/cex" xmlns:w16cid="http://schemas.microsoft.com/office/word/2016/wordml/cid" xmlns:w16="http://schemas.microsoft.com/office/word/2018/wordml" xmlns:w16du="http://schemas.microsoft.com/office/word/2023/wordml/word16du" xmlns:w16sdtdh="http://schemas.microsoft.com/office/word/2020/wordml/sdtdatahash" xmlns:w16sdtfl="http://schemas.microsoft.com/office/word/2024/wordml/sdtformatlock" xmlns:w16se="http://schemas.microsoft.com/office/word/2015/wordml/symex" xmlns:wpg="http://schemas.microsoft.com/office/word/2010/wordprocessingGroup" xmlns:wpi="http://schemas.microsoft.com/office/word/2010/wordprocessingInk" xmlns:wne="http://schemas.microsoft.com/office/word/2006/wordml" xmlns:wps="http://schemas.microsoft.com/office/word/2010/wordprocessingShape" mc:Ignorable="w14 w15 w16se w16cid w16 w16cex w16sdtdh w16sdtfl w16du wp14">
   <w:p>
     <w:pPr>
       <w:spacing w:after="75"/>
@@ -21366,7 +21383,7 @@
       <mc:AlternateContent>
         <mc:Choice Requires="wpg">
           <w:drawing>
-            <wp:anchor distT="0" distB="0" distL="114300" distR="114300" simplePos="0" relativeHeight="251668480" behindDoc="0" locked="0" layoutInCell="1" allowOverlap="1">
+            <wp:anchor distT="0" distB="0" distL="114300" distR="114300" simplePos="0" relativeHeight="251668480" behindDoc="0" locked="0" layoutInCell="1" allowOverlap="1" wp14:anchorId="1BA242AA" wp14:editId="3AE42822">
               <wp:simplePos x="0" y="0"/>
               <wp:positionH relativeFrom="page">
                 <wp:posOffset>686118</wp:posOffset>
@@ -22134,7 +22151,7 @@
         </mc:Choice>
         <mc:Fallback>
           <w:pict>
-            <v:group id="Group 43236" o:spid="_x0000_s1208" style="position:absolute;margin-left:54.05pt;margin-top:686.75pt;width:504.2pt;height:22.25pt;z-index:251668480;mso-position-horizontal-relative:page;mso-position-vertical-relative:page" coordsize="64033,2825" o:gfxdata="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">
+            <v:group w14:anchorId="1BA242AA" id="Group 43236" o:spid="_x0000_s1208" style="position:absolute;margin-left:54.05pt;margin-top:686.75pt;width:504.2pt;height:22.25pt;z-index:251668480;mso-position-horizontal-relative:page;mso-position-vertical-relative:page" coordsize="64033,2825" o:gfxdata="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">
               <v:rect id="Rectangle 43246" o:spid="_x0000_s1209" style="position:absolute;left:4222;top:1062;width:929;height:1690;visibility:visible;mso-wrap-style:square;v-text-anchor:top" o:gfxdata="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" filled="f" stroked="f">
                 <v:textbox inset="0,0,0,0">
                   <w:txbxContent>
@@ -22365,7 +22382,7 @@
 </file>
 
 <file path=word/footer6.xml><?xml version="1.0" encoding="utf-8"?>
-<w:ftr xmlns:wpc="http://schemas.microsoft.com/office/word/2010/wordprocessingCanvas" xmlns:cx="http://schemas.microsoft.com/office/drawing/2014/chartex" xmlns:mc="http://schemas.openxmlformats.org/markup-compatibility/2006" xmlns:o="urn:schemas-microsoft-com:office:office" xmlns:r="http://schemas.openxmlformats.org/officeDocument/2006/relationships" xmlns:m="http://schemas.openxmlformats.org/officeDocument/2006/math" xmlns:v="urn:schemas-microsoft-com:vml" xmlns:wp14="http://schemas.microsoft.com/office/word/2010/wordprocessingDrawing" xmlns:wp="http://schemas.openxmlformats.org/drawingml/2006/wordprocessingDrawing" xmlns:w10="urn:schemas-microsoft-com:office:word" xmlns:w="http://schemas.openxmlformats.org/wordprocessingml/2006/main" xmlns:w14="http://schemas.microsoft.com/office/word/2010/wordml" xmlns:w15="http://schemas.microsoft.com/office/word/2012/wordml" xmlns:w16se="http://schemas.microsoft.com/office/word/2015/wordml/symex" xmlns:wpg="http://schemas.microsoft.com/office/word/2010/wordprocessingGroup" xmlns:wpi="http://schemas.microsoft.com/office/word/2010/wordprocessingInk" xmlns:wne="http://schemas.microsoft.com/office/word/2006/wordml" xmlns:wps="http://schemas.microsoft.com/office/word/2010/wordprocessingShape" mc:Ignorable="w14 w15 w16se wp14">
+<w:ftr xmlns:wpc="http://schemas.microsoft.com/office/word/2010/wordprocessingCanvas" xmlns:cx="http://schemas.microsoft.com/office/drawing/2014/chartex" xmlns:cx1="http://schemas.microsoft.com/office/drawing/2015/9/8/chartex" xmlns:cx2="http://schemas.microsoft.com/office/drawing/2015/10/21/chartex" xmlns:cx3="http://schemas.microsoft.com/office/drawing/2016/5/9/chartex" xmlns:cx4="http://schemas.microsoft.com/office/drawing/2016/5/10/chartex" xmlns:cx5="http://schemas.microsoft.com/office/drawing/2016/5/11/chartex" xmlns:cx6="http://schemas.microsoft.com/office/drawing/2016/5/12/chartex" xmlns:cx7="http://schemas.microsoft.com/office/drawing/2016/5/13/chartex" xmlns:cx8="http://schemas.microsoft.com/office/drawing/2016/5/14/chartex" xmlns:mc="http://schemas.openxmlformats.org/markup-compatibility/2006" xmlns:aink="http://schemas.microsoft.com/office/drawing/2016/ink" xmlns:am3d="http://schemas.microsoft.com/office/drawing/2017/model3d" xmlns:o="urn:schemas-microsoft-com:office:office" xmlns:oel="http://schemas.microsoft.com/office/2019/extlst" xmlns:r="http://schemas.openxmlformats.org/officeDocument/2006/relationships" xmlns:m="http://schemas.openxmlformats.org/officeDocument/2006/math" xmlns:v="urn:schemas-microsoft-com:vml" xmlns:wp14="http://schemas.microsoft.com/office/word/2010/wordprocessingDrawing" xmlns:wp="http://schemas.openxmlformats.org/drawingml/2006/wordprocessingDrawing" xmlns:w10="urn:schemas-microsoft-com:office:word" xmlns:w="http://schemas.openxmlformats.org/wordprocessingml/2006/main" xmlns:w14="http://schemas.microsoft.com/office/word/2010/wordml" xmlns:w15="http://schemas.microsoft.com/office/word/2012/wordml" xmlns:w16cex="http://schemas.microsoft.com/office/word/2018/wordml/cex" xmlns:w16cid="http://schemas.microsoft.com/office/word/2016/wordml/cid" xmlns:w16="http://schemas.microsoft.com/office/word/2018/wordml" xmlns:w16du="http://schemas.microsoft.com/office/word/2023/wordml/word16du" xmlns:w16sdtdh="http://schemas.microsoft.com/office/word/2020/wordml/sdtdatahash" xmlns:w16sdtfl="http://schemas.microsoft.com/office/word/2024/wordml/sdtformatlock" xmlns:w16se="http://schemas.microsoft.com/office/word/2015/wordml/symex" xmlns:wpg="http://schemas.microsoft.com/office/word/2010/wordprocessingGroup" xmlns:wpi="http://schemas.microsoft.com/office/word/2010/wordprocessingInk" xmlns:wne="http://schemas.microsoft.com/office/word/2006/wordml" xmlns:wps="http://schemas.microsoft.com/office/word/2010/wordprocessingShape" mc:Ignorable="w14 w15 w16se w16cid w16 w16cex w16sdtdh w16sdtfl w16du wp14">
   <w:p>
     <w:pPr>
       <w:spacing w:after="75"/>
@@ -22377,7 +22394,7 @@
       <mc:AlternateContent>
         <mc:Choice Requires="wpg">
           <w:drawing>
-            <wp:anchor distT="0" distB="0" distL="114300" distR="114300" simplePos="0" relativeHeight="251669504" behindDoc="0" locked="0" layoutInCell="1" allowOverlap="1">
+            <wp:anchor distT="0" distB="0" distL="114300" distR="114300" simplePos="0" relativeHeight="251669504" behindDoc="0" locked="0" layoutInCell="1" allowOverlap="1" wp14:anchorId="3AF77A6E" wp14:editId="43209F1C">
               <wp:simplePos x="0" y="0"/>
               <wp:positionH relativeFrom="page">
                 <wp:posOffset>686118</wp:posOffset>
@@ -23142,19 +23159,16 @@
             </wp:anchor>
           </w:drawing>
         </mc:Choice>
-        <mc:Fallback xmlns:a="http://schemas.openxmlformats.org/drawingml/2006/main">
+        <mc:Fallback>
           <w:pict>
-            <v:group id="Group 43174" style="width:504.2pt;height:22.245pt;position:absolute;mso-position-horizontal-relative:page;mso-position-horizontal:absolute;margin-left:54.025pt;mso-position-vertical-relative:page;margin-top:686.73pt;" coordsize="64033,2825">
-              <v:rect id="Rectangle 43184" style="position:absolute;width:929;height:1690;left:4222;top:1062;" filled="f" stroked="f">
+            <v:group w14:anchorId="3AF77A6E" id="Group 43174" o:spid="_x0000_s1254" style="position:absolute;margin-left:54.05pt;margin-top:686.75pt;width:504.2pt;height:22.25pt;z-index:251669504;mso-position-horizontal-relative:page;mso-position-vertical-relative:page" coordsize="64033,2825" o:gfxdata="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">
+              <v:rect id="Rectangle 43184" o:spid="_x0000_s1255" style="position:absolute;left:4222;top:1062;width:929;height:1690;visibility:visible;mso-wrap-style:square;v-text-anchor:top" o:gfxdata="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" filled="f" stroked="f">
                 <v:textbox inset="0,0,0,0">
                   <w:txbxContent>
                     <w:p>
-                      <w:pPr>
-                        <w:spacing w:before="0" w:after="160" w:line="259" w:lineRule="auto"/>
-                      </w:pPr>
                       <w:r>
                         <w:rPr>
-                          <w:rFonts w:cs="Times New Roman" w:hAnsi="Times New Roman" w:eastAsia="Times New Roman" w:ascii="Times New Roman"/>
+                          <w:rFonts w:ascii="Times New Roman" w:eastAsia="Times New Roman" w:hAnsi="Times New Roman" w:cs="Times New Roman"/>
                         </w:rPr>
                         <w:t xml:space="preserve">  </w:t>
                       </w:r>
@@ -23162,56 +23176,47 @@
                   </w:txbxContent>
                 </v:textbox>
               </v:rect>
-              <v:rect id="Rectangle 43185" style="position:absolute;width:13821;height:1819;left:4924;top:1014;" filled="f" stroked="f">
+              <v:rect id="Rectangle 43185" o:spid="_x0000_s1256" style="position:absolute;left:4924;top:1014;width:13822;height:1819;visibility:visible;mso-wrap-style:square;v-text-anchor:top" o:gfxdata="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" filled="f" stroked="f">
                 <v:textbox inset="0,0,0,0">
                   <w:txbxContent>
                     <w:p>
-                      <w:pPr>
-                        <w:spacing w:before="0" w:after="160" w:line="259" w:lineRule="auto"/>
-                      </w:pPr>
                       <w:r>
                         <w:rPr>
-                          <w:rFonts w:cs="Segoe UI" w:hAnsi="Segoe UI" w:eastAsia="Segoe UI" w:ascii="Segoe UI"/>
-                          <w:b w:val="1"/>
-                          <w:color w:val="0070c0"/>
+                          <w:rFonts w:ascii="Segoe UI" w:eastAsia="Segoe UI" w:hAnsi="Segoe UI" w:cs="Segoe UI"/>
+                          <w:b/>
+                          <w:color w:val="0070C0"/>
                         </w:rPr>
-                        <w:t xml:space="preserve">Khoa Công Ngh</w:t>
+                        <w:t>Khoa Công Ngh</w:t>
                       </w:r>
                     </w:p>
                   </w:txbxContent>
                 </v:textbox>
               </v:rect>
-              <v:rect id="Rectangle 43186" style="position:absolute;width:1005;height:1819;left:15310;top:1014;" filled="f" stroked="f">
+              <v:rect id="Rectangle 43186" o:spid="_x0000_s1257" style="position:absolute;left:15310;top:1014;width:1005;height:1819;visibility:visible;mso-wrap-style:square;v-text-anchor:top" o:gfxdata="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" filled="f" stroked="f">
                 <v:textbox inset="0,0,0,0">
                   <w:txbxContent>
                     <w:p>
-                      <w:pPr>
-                        <w:spacing w:before="0" w:after="160" w:line="259" w:lineRule="auto"/>
-                      </w:pPr>
                       <w:r>
                         <w:rPr>
-                          <w:rFonts w:cs="Segoe UI" w:hAnsi="Segoe UI" w:eastAsia="Segoe UI" w:ascii="Segoe UI"/>
-                          <w:b w:val="1"/>
-                          <w:color w:val="0070c0"/>
+                          <w:rFonts w:ascii="Segoe UI" w:eastAsia="Segoe UI" w:hAnsi="Segoe UI" w:cs="Segoe UI"/>
+                          <w:b/>
+                          <w:color w:val="0070C0"/>
                         </w:rPr>
-                        <w:t xml:space="preserve">ệ</w:t>
+                        <w:t>ệ</w:t>
                       </w:r>
                     </w:p>
                   </w:txbxContent>
                 </v:textbox>
               </v:rect>
-              <v:rect id="Rectangle 43187" style="position:absolute;width:512;height:1819;left:16072;top:1014;" filled="f" stroked="f">
+              <v:rect id="Rectangle 43187" o:spid="_x0000_s1258" style="position:absolute;left:16072;top:1014;width:513;height:1819;visibility:visible;mso-wrap-style:square;v-text-anchor:top" o:gfxdata="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" filled="f" stroked="f">
                 <v:textbox inset="0,0,0,0">
                   <w:txbxContent>
                     <w:p>
-                      <w:pPr>
-                        <w:spacing w:before="0" w:after="160" w:line="259" w:lineRule="auto"/>
-                      </w:pPr>
                       <w:r>
                         <w:rPr>
-                          <w:rFonts w:cs="Segoe UI" w:hAnsi="Segoe UI" w:eastAsia="Segoe UI" w:ascii="Segoe UI"/>
-                          <w:b w:val="1"/>
-                          <w:color w:val="0070c0"/>
+                          <w:rFonts w:ascii="Segoe UI" w:eastAsia="Segoe UI" w:hAnsi="Segoe UI" w:cs="Segoe UI"/>
+                          <w:b/>
+                          <w:color w:val="0070C0"/>
                         </w:rPr>
                         <w:t xml:space="preserve"> </w:t>
                       </w:r>
@@ -23219,35 +23224,29 @@
                   </w:txbxContent>
                 </v:textbox>
               </v:rect>
-              <v:rect id="Rectangle 43188" style="position:absolute;width:8886;height:1819;left:16453;top:1014;" filled="f" stroked="f">
+              <v:rect id="Rectangle 43188" o:spid="_x0000_s1259" style="position:absolute;left:16453;top:1014;width:8887;height:1819;visibility:visible;mso-wrap-style:square;v-text-anchor:top" o:gfxdata="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" filled="f" stroked="f">
                 <v:textbox inset="0,0,0,0">
                   <w:txbxContent>
                     <w:p>
-                      <w:pPr>
-                        <w:spacing w:before="0" w:after="160" w:line="259" w:lineRule="auto"/>
-                      </w:pPr>
                       <w:r>
                         <w:rPr>
-                          <w:rFonts w:cs="Segoe UI" w:hAnsi="Segoe UI" w:eastAsia="Segoe UI" w:ascii="Segoe UI"/>
-                          <w:b w:val="1"/>
-                          <w:color w:val="0070c0"/>
+                          <w:rFonts w:ascii="Segoe UI" w:eastAsia="Segoe UI" w:hAnsi="Segoe UI" w:cs="Segoe UI"/>
+                          <w:b/>
+                          <w:color w:val="0070C0"/>
                         </w:rPr>
-                        <w:t xml:space="preserve">Thông Tin</w:t>
+                        <w:t>Thông Tin</w:t>
                       </w:r>
                     </w:p>
                   </w:txbxContent>
                 </v:textbox>
               </v:rect>
-              <v:rect id="Rectangle 43189" style="position:absolute;width:548;height:1997;left:23123;top:886;" filled="f" stroked="f">
+              <v:rect id="Rectangle 43189" o:spid="_x0000_s1260" style="position:absolute;left:23123;top:886;width:549;height:1998;visibility:visible;mso-wrap-style:square;v-text-anchor:top" o:gfxdata="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" filled="f" stroked="f">
                 <v:textbox inset="0,0,0,0">
                   <w:txbxContent>
                     <w:p>
-                      <w:pPr>
-                        <w:spacing w:before="0" w:after="160" w:line="259" w:lineRule="auto"/>
-                      </w:pPr>
                       <w:r>
                         <w:rPr>
-                          <w:rFonts w:cs="Times New Roman" w:hAnsi="Times New Roman" w:eastAsia="Times New Roman" w:ascii="Times New Roman"/>
+                          <w:rFonts w:ascii="Times New Roman" w:eastAsia="Times New Roman" w:hAnsi="Times New Roman" w:cs="Times New Roman"/>
                           <w:sz w:val="26"/>
                         </w:rPr>
                         <w:t xml:space="preserve"> </w:t>
@@ -23256,48 +23255,58 @@
                   </w:txbxContent>
                 </v:textbox>
               </v:rect>
-              <v:shape id="Shape 44487" style="position:absolute;width:6416;height:2730;left:57616;top:94;" coordsize="641668,273050" path="m0,0l641668,0l641668,273050l0,273050l0,0">
-                <v:stroke weight="0pt" endcap="flat" joinstyle="miter" miterlimit="10" on="false" color="#000000" opacity="0"/>
-                <v:fill on="true" color="#0070c0"/>
+              <v:shape id="Shape 44479" o:spid="_x0000_s1261" style="position:absolute;left:57616;top:94;width:6417;height:2731;visibility:visible;mso-wrap-style:square;v-text-anchor:top" coordsize="641668,273050" o:gfxdata="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" path="m,l641668,r,273050l,273050,,e" fillcolor="#0070c0" stroked="f" strokeweight="0">
+                <v:stroke miterlimit="83231f" joinstyle="miter"/>
+                <v:path arrowok="t" textboxrect="0,0,641668,273050"/>
               </v:shape>
-              <v:shape id="Shape 44488" style="position:absolute;width:4953;height:1746;left:58350;top:539;" coordsize="495300,174625" path="m0,0l495300,0l495300,174625l0,174625l0,0">
-                <v:stroke weight="0pt" endcap="flat" joinstyle="miter" miterlimit="10" on="false" color="#000000" opacity="0"/>
-                <v:fill on="true" color="#0070c0"/>
+              <v:shape id="Shape 44480" o:spid="_x0000_s1262" style="position:absolute;left:58350;top:539;width:4953;height:1746;visibility:visible;mso-wrap-style:square;v-text-anchor:top" coordsize="495300,174625" o:gfxdata="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" path="m,l495300,r,174625l,174625,,e" fillcolor="#0070c0" stroked="f" strokeweight="0">
+                <v:stroke miterlimit="83231f" joinstyle="miter"/>
+                <v:path arrowok="t" textboxrect="0,0,495300,174625"/>
               </v:shape>
-              <v:rect id="Rectangle 43190" style="position:absolute;width:1013;height:1811;left:60446;top:935;" filled="f" stroked="f">
+              <v:rect id="Rectangle 43190" o:spid="_x0000_s1263" style="position:absolute;left:60446;top:935;width:1013;height:1811;visibility:visible;mso-wrap-style:square;v-text-anchor:top" o:gfxdata="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" filled="f" stroked="f">
                 <v:textbox inset="0,0,0,0">
                   <w:txbxContent>
                     <w:p>
-                      <w:pPr>
-                        <w:spacing w:before="0" w:after="160" w:line="259" w:lineRule="auto"/>
-                      </w:pPr>
-                      <w:fldSimple w:instr=" PAGE   \* MERGEFORMAT ">
-                        <w:r>
-                          <w:rPr>
-                            <w:rFonts w:cs="Times New Roman" w:hAnsi="Times New Roman" w:eastAsia="Times New Roman" w:ascii="Times New Roman"/>
-                            <w:b w:val="1"/>
-                            <w:color w:val="ffffff"/>
-                            <w:sz w:val="24"/>
-                          </w:rPr>
-                          <w:t xml:space="preserve">3</w:t>
-                        </w:r>
-                      </w:fldSimple>
+                      <w:r>
+                        <w:fldChar w:fldCharType="begin"/>
+                      </w:r>
+                      <w:r>
+                        <w:instrText xml:space="preserve"> PAGE   \* MERGEFORMAT </w:instrText>
+                      </w:r>
+                      <w:r>
+                        <w:fldChar w:fldCharType="separate"/>
+                      </w:r>
+                      <w:r>
+                        <w:rPr>
+                          <w:rFonts w:ascii="Times New Roman" w:eastAsia="Times New Roman" w:hAnsi="Times New Roman" w:cs="Times New Roman"/>
+                          <w:b/>
+                          <w:color w:val="FFFFFF"/>
+                          <w:sz w:val="24"/>
+                        </w:rPr>
+                        <w:t>3</w:t>
+                      </w:r>
+                      <w:r>
+                        <w:rPr>
+                          <w:rFonts w:ascii="Times New Roman" w:eastAsia="Times New Roman" w:hAnsi="Times New Roman" w:cs="Times New Roman"/>
+                          <w:b/>
+                          <w:color w:val="FFFFFF"/>
+                          <w:sz w:val="24"/>
+                        </w:rPr>
+                        <w:fldChar w:fldCharType="end"/>
+                      </w:r>
                     </w:p>
                   </w:txbxContent>
                 </v:textbox>
               </v:rect>
-              <v:rect id="Rectangle 43191" style="position:absolute;width:548;height:1962;left:61207;top:849;" filled="f" stroked="f">
+              <v:rect id="Rectangle 43191" o:spid="_x0000_s1264" style="position:absolute;left:61207;top:849;width:548;height:1962;visibility:visible;mso-wrap-style:square;v-text-anchor:top" o:gfxdata="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" filled="f" stroked="f">
                 <v:textbox inset="0,0,0,0">
                   <w:txbxContent>
                     <w:p>
-                      <w:pPr>
-                        <w:spacing w:before="0" w:after="160" w:line="259" w:lineRule="auto"/>
-                      </w:pPr>
                       <w:r>
                         <w:rPr>
-                          <w:rFonts w:cs="Times New Roman" w:hAnsi="Times New Roman" w:eastAsia="Times New Roman" w:ascii="Times New Roman"/>
-                          <w:b w:val="1"/>
-                          <w:color w:val="ffffff"/>
+                          <w:rFonts w:ascii="Times New Roman" w:eastAsia="Times New Roman" w:hAnsi="Times New Roman" w:cs="Times New Roman"/>
+                          <w:b/>
+                          <w:color w:val="FFFFFF"/>
                           <w:sz w:val="26"/>
                         </w:rPr>
                         <w:t xml:space="preserve"> </w:t>
@@ -23306,34 +23315,53 @@
                   </w:txbxContent>
                 </v:textbox>
               </v:rect>
-              <v:shape id="Shape 44489" style="position:absolute;width:57617;height:91;left:0;top:0;" coordsize="5761736,9144" path="m0,0l5761736,0l5761736,9144l0,9144l0,0">
-                <v:stroke weight="0pt" endcap="flat" joinstyle="miter" miterlimit="10" on="false" color="#000000" opacity="0"/>
-                <v:fill on="true" color="#0070c0"/>
+              <v:shape id="Shape 44481" o:spid="_x0000_s1265" style="position:absolute;width:57617;height:91;visibility:visible;mso-wrap-style:square;v-text-anchor:top" coordsize="5761736,9144" o:gfxdata="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" path="m,l5761736,r,9144l,9144,,e" fillcolor="#0070c0" stroked="f" strokeweight="0">
+                <v:stroke miterlimit="83231f" joinstyle="miter"/>
+                <v:path arrowok="t" textboxrect="0,0,5761736,9144"/>
               </v:shape>
-              <v:shape id="Shape 44490" style="position:absolute;width:91;height:444;left:57616;top:63;" coordsize="9144,44450" path="m0,0l9144,0l9144,44450l0,44450l0,0">
-                <v:stroke weight="0pt" endcap="flat" joinstyle="miter" miterlimit="10" on="false" color="#000000" opacity="0"/>
-                <v:fill on="true" color="#0070c0"/>
+              <v:shape id="Shape 44482" o:spid="_x0000_s1266" style="position:absolute;left:57616;top:63;width:92;height:445;visibility:visible;mso-wrap-style:square;v-text-anchor:top" coordsize="9144,44450" o:gfxdata="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" path="m,l9144,r,44450l,44450,,e" fillcolor="#0070c0" stroked="f" strokeweight="0">
+                <v:stroke miterlimit="83231f" joinstyle="miter"/>
+                <v:path arrowok="t" textboxrect="0,0,9144,44450"/>
               </v:shape>
-              <v:shape id="Shape 44491" style="position:absolute;width:91;height:91;left:57616;top:0;" coordsize="9144,9144" path="m0,0l9144,0l9144,9144l0,9144l0,0">
-                <v:stroke weight="0pt" endcap="flat" joinstyle="miter" miterlimit="10" on="false" color="#000000" opacity="0"/>
-                <v:fill on="true" color="#0070c0"/>
+              <v:shape id="Shape 44483" o:spid="_x0000_s1267" style="position:absolute;left:57616;width:92;height:91;visibility:visible;mso-wrap-style:square;v-text-anchor:top" coordsize="9144,9144" o:gfxdata="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" path="m,l9144,r,9144l,9144,,e" fillcolor="#0070c0" stroked="f" strokeweight="0">
+                <v:stroke miterlimit="83231f" joinstyle="miter"/>
+                <v:path arrowok="t" textboxrect="0,0,9144,9144"/>
               </v:shape>
-              <v:shape id="Shape 44492" style="position:absolute;width:6353;height:91;left:57680;top:0;" coordsize="635318,9144" path="m0,0l635318,0l635318,9144l0,9144l0,0">
-                <v:stroke weight="0pt" endcap="flat" joinstyle="miter" miterlimit="10" on="false" color="#000000" opacity="0"/>
-                <v:fill on="true" color="#0070c0"/>
+              <v:shape id="Shape 44484" o:spid="_x0000_s1268" style="position:absolute;left:57680;width:6353;height:91;visibility:visible;mso-wrap-style:square;v-text-anchor:top" coordsize="635318,9144" o:gfxdata="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" path="m,l635318,r,9144l,9144,,e" fillcolor="#0070c0" stroked="f" strokeweight="0">
+                <v:stroke miterlimit="83231f" joinstyle="miter"/>
+                <v:path arrowok="t" textboxrect="0,0,635318,9144"/>
               </v:shape>
-              <v:shape id="Shape 44493" style="position:absolute;width:6353;height:444;left:57680;top:63;" coordsize="635318,44450" path="m0,0l635318,0l635318,44450l0,44450l0,0">
-                <v:stroke weight="0pt" endcap="flat" joinstyle="miter" miterlimit="10" on="false" color="#000000" opacity="0"/>
-                <v:fill on="true" color="#0070c0"/>
+              <v:shape id="Shape 44485" o:spid="_x0000_s1269" style="position:absolute;left:57680;top:63;width:6353;height:445;visibility:visible;mso-wrap-style:square;v-text-anchor:top" coordsize="635318,44450" o:gfxdata="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" path="m,l635318,r,44450l,44450,,e" fillcolor="#0070c0" stroked="f" strokeweight="0">
+                <v:stroke miterlimit="83231f" joinstyle="miter"/>
+                <v:path arrowok="t" textboxrect="0,0,635318,44450"/>
               </v:shape>
-              <v:shape id="Shape 44494" style="position:absolute;width:6416;height:444;left:57616;top:2380;" coordsize="641668,44450" path="m0,0l641668,0l641668,44450l0,44450l0,0">
-                <v:stroke weight="0pt" endcap="flat" joinstyle="miter" miterlimit="10" on="false" color="#000000" opacity="0"/>
-                <v:fill on="true" color="#0070c0"/>
+              <v:shape id="Shape 44486" o:spid="_x0000_s1270" style="position:absolute;left:57616;top:2380;width:6417;height:445;visibility:visible;mso-wrap-style:square;v-text-anchor:top" coordsize="641668,44450" o:gfxdata="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" path="m,l641668,r,44450l,44450,,e" fillcolor="#0070c0" stroked="f" strokeweight="0">
+                <v:stroke miterlimit="83231f" joinstyle="miter"/>
+                <v:path arrowok="t" textboxrect="0,0,641668,44450"/>
               </v:shape>
-              <v:shape id="Picture 43183" style="position:absolute;width:3490;height:1162;left:727;top:840;" filled="f">
-                <v:imagedata r:id="rId16"/>
+              <v:shapetype id="_x0000_t75" coordsize="21600,21600" o:spt="75" o:preferrelative="t" path="m@4@5l@4@11@9@11@9@5xe" filled="f" stroked="f">
+                <v:stroke joinstyle="miter"/>
+                <v:formulas>
+                  <v:f eqn="if lineDrawn pixelLineWidth 0"/>
+                  <v:f eqn="sum @0 1 0"/>
+                  <v:f eqn="sum 0 0 @1"/>
+                  <v:f eqn="prod @2 1 2"/>
+                  <v:f eqn="prod @3 21600 pixelWidth"/>
+                  <v:f eqn="prod @3 21600 pixelHeight"/>
+                  <v:f eqn="sum @0 0 1"/>
+                  <v:f eqn="prod @6 1 2"/>
+                  <v:f eqn="prod @7 21600 pixelWidth"/>
+                  <v:f eqn="sum @8 21600 0"/>
+                  <v:f eqn="prod @7 21600 pixelHeight"/>
+                  <v:f eqn="sum @10 21600 0"/>
+                </v:formulas>
+                <v:path o:extrusionok="f" gradientshapeok="t" o:connecttype="rect"/>
+                <o:lock v:ext="edit" aspectratio="t"/>
+              </v:shapetype>
+              <v:shape id="Picture 43183" o:spid="_x0000_s1271" type="#_x0000_t75" style="position:absolute;left:727;top:840;width:3490;height:1162;visibility:visible;mso-wrap-style:square" o:gfxdata="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">
+                <v:imagedata r:id="rId2" o:title=""/>
               </v:shape>
-              <w10:wrap type="square"/>
+              <w10:wrap type="square" anchorx="page" anchory="page"/>
             </v:group>
           </w:pict>
         </mc:Fallback>
@@ -23363,7 +23391,7 @@
 </file>
 
 <file path=word/footnotes.xml><?xml version="1.0" encoding="utf-8"?>
-<w:footnotes xmlns:wpc="http://schemas.microsoft.com/office/word/2010/wordprocessingCanvas" xmlns:cx="http://schemas.microsoft.com/office/drawing/2014/chartex" xmlns:mc="http://schemas.openxmlformats.org/markup-compatibility/2006" xmlns:o="urn:schemas-microsoft-com:office:office" xmlns:r="http://schemas.openxmlformats.org/officeDocument/2006/relationships" xmlns:m="http://schemas.openxmlformats.org/officeDocument/2006/math" xmlns:v="urn:schemas-microsoft-com:vml" xmlns:wp14="http://schemas.microsoft.com/office/word/2010/wordprocessingDrawing" xmlns:wp="http://schemas.openxmlformats.org/drawingml/2006/wordprocessingDrawing" xmlns:w10="urn:schemas-microsoft-com:office:word" xmlns:w="http://schemas.openxmlformats.org/wordprocessingml/2006/main" xmlns:w14="http://schemas.microsoft.com/office/word/2010/wordml" xmlns:w15="http://schemas.microsoft.com/office/word/2012/wordml" xmlns:w16se="http://schemas.microsoft.com/office/word/2015/wordml/symex" xmlns:wpg="http://schemas.microsoft.com/office/word/2010/wordprocessingGroup" xmlns:wpi="http://schemas.microsoft.com/office/word/2010/wordprocessingInk" xmlns:wne="http://schemas.microsoft.com/office/word/2006/wordml" xmlns:wps="http://schemas.microsoft.com/office/word/2010/wordprocessingShape" mc:Ignorable="w14 w15 w16se wp14">
+<w:footnotes xmlns:wpc="http://schemas.microsoft.com/office/word/2010/wordprocessingCanvas" xmlns:cx="http://schemas.microsoft.com/office/drawing/2014/chartex" xmlns:cx1="http://schemas.microsoft.com/office/drawing/2015/9/8/chartex" xmlns:cx2="http://schemas.microsoft.com/office/drawing/2015/10/21/chartex" xmlns:cx3="http://schemas.microsoft.com/office/drawing/2016/5/9/chartex" xmlns:cx4="http://schemas.microsoft.com/office/drawing/2016/5/10/chartex" xmlns:cx5="http://schemas.microsoft.com/office/drawing/2016/5/11/chartex" xmlns:cx6="http://schemas.microsoft.com/office/drawing/2016/5/12/chartex" xmlns:cx7="http://schemas.microsoft.com/office/drawing/2016/5/13/chartex" xmlns:cx8="http://schemas.microsoft.com/office/drawing/2016/5/14/chartex" xmlns:mc="http://schemas.openxmlformats.org/markup-compatibility/2006" xmlns:aink="http://schemas.microsoft.com/office/drawing/2016/ink" xmlns:am3d="http://schemas.microsoft.com/office/drawing/2017/model3d" xmlns:o="urn:schemas-microsoft-com:office:office" xmlns:oel="http://schemas.microsoft.com/office/2019/extlst" xmlns:r="http://schemas.openxmlformats.org/officeDocument/2006/relationships" xmlns:m="http://schemas.openxmlformats.org/officeDocument/2006/math" xmlns:v="urn:schemas-microsoft-com:vml" xmlns:wp14="http://schemas.microsoft.com/office/word/2010/wordprocessingDrawing" xmlns:wp="http://schemas.openxmlformats.org/drawingml/2006/wordprocessingDrawing" xmlns:w10="urn:schemas-microsoft-com:office:word" xmlns:w="http://schemas.openxmlformats.org/wordprocessingml/2006/main" xmlns:w14="http://schemas.microsoft.com/office/word/2010/wordml" xmlns:w15="http://schemas.microsoft.com/office/word/2012/wordml" xmlns:w16cex="http://schemas.microsoft.com/office/word/2018/wordml/cex" xmlns:w16cid="http://schemas.microsoft.com/office/word/2016/wordml/cid" xmlns:w16="http://schemas.microsoft.com/office/word/2018/wordml" xmlns:w16du="http://schemas.microsoft.com/office/word/2023/wordml/word16du" xmlns:w16sdtdh="http://schemas.microsoft.com/office/word/2020/wordml/sdtdatahash" xmlns:w16sdtfl="http://schemas.microsoft.com/office/word/2024/wordml/sdtformatlock" xmlns:w16se="http://schemas.microsoft.com/office/word/2015/wordml/symex" xmlns:wpg="http://schemas.microsoft.com/office/word/2010/wordprocessingGroup" xmlns:wpi="http://schemas.microsoft.com/office/word/2010/wordprocessingInk" xmlns:wne="http://schemas.microsoft.com/office/word/2006/wordml" xmlns:wps="http://schemas.microsoft.com/office/word/2010/wordprocessingShape" mc:Ignorable="w14 w15 w16se w16cid w16 w16cex w16sdtdh w16sdtfl w16du wp14">
   <w:footnote w:type="separator" w:id="-1">
     <w:p>
       <w:pPr>
@@ -23388,7 +23416,7 @@
 </file>
 
 <file path=word/header1.xml><?xml version="1.0" encoding="utf-8"?>
-<w:hdr xmlns:wpc="http://schemas.microsoft.com/office/word/2010/wordprocessingCanvas" xmlns:cx="http://schemas.microsoft.com/office/drawing/2014/chartex" xmlns:mc="http://schemas.openxmlformats.org/markup-compatibility/2006" xmlns:o="urn:schemas-microsoft-com:office:office" xmlns:r="http://schemas.openxmlformats.org/officeDocument/2006/relationships" xmlns:m="http://schemas.openxmlformats.org/officeDocument/2006/math" xmlns:v="urn:schemas-microsoft-com:vml" xmlns:wp14="http://schemas.microsoft.com/office/word/2010/wordprocessingDrawing" xmlns:wp="http://schemas.openxmlformats.org/drawingml/2006/wordprocessingDrawing" xmlns:w10="urn:schemas-microsoft-com:office:word" xmlns:w="http://schemas.openxmlformats.org/wordprocessingml/2006/main" xmlns:w14="http://schemas.microsoft.com/office/word/2010/wordml" xmlns:w15="http://schemas.microsoft.com/office/word/2012/wordml" xmlns:w16se="http://schemas.microsoft.com/office/word/2015/wordml/symex" xmlns:wpg="http://schemas.microsoft.com/office/word/2010/wordprocessingGroup" xmlns:wpi="http://schemas.microsoft.com/office/word/2010/wordprocessingInk" xmlns:wne="http://schemas.microsoft.com/office/word/2006/wordml" xmlns:wps="http://schemas.microsoft.com/office/word/2010/wordprocessingShape" mc:Ignorable="w14 w15 w16se wp14">
+<w:hdr xmlns:wpc="http://schemas.microsoft.com/office/word/2010/wordprocessingCanvas" xmlns:cx="http://schemas.microsoft.com/office/drawing/2014/chartex" xmlns:cx1="http://schemas.microsoft.com/office/drawing/2015/9/8/chartex" xmlns:cx2="http://schemas.microsoft.com/office/drawing/2015/10/21/chartex" xmlns:cx3="http://schemas.microsoft.com/office/drawing/2016/5/9/chartex" xmlns:cx4="http://schemas.microsoft.com/office/drawing/2016/5/10/chartex" xmlns:cx5="http://schemas.microsoft.com/office/drawing/2016/5/11/chartex" xmlns:cx6="http://schemas.microsoft.com/office/drawing/2016/5/12/chartex" xmlns:cx7="http://schemas.microsoft.com/office/drawing/2016/5/13/chartex" xmlns:cx8="http://schemas.microsoft.com/office/drawing/2016/5/14/chartex" xmlns:mc="http://schemas.openxmlformats.org/markup-compatibility/2006" xmlns:aink="http://schemas.microsoft.com/office/drawing/2016/ink" xmlns:am3d="http://schemas.microsoft.com/office/drawing/2017/model3d" xmlns:o="urn:schemas-microsoft-com:office:office" xmlns:oel="http://schemas.microsoft.com/office/2019/extlst" xmlns:r="http://schemas.openxmlformats.org/officeDocument/2006/relationships" xmlns:m="http://schemas.openxmlformats.org/officeDocument/2006/math" xmlns:v="urn:schemas-microsoft-com:vml" xmlns:wp14="http://schemas.microsoft.com/office/word/2010/wordprocessingDrawing" xmlns:wp="http://schemas.openxmlformats.org/drawingml/2006/wordprocessingDrawing" xmlns:w10="urn:schemas-microsoft-com:office:word" xmlns:w="http://schemas.openxmlformats.org/wordprocessingml/2006/main" xmlns:w14="http://schemas.microsoft.com/office/word/2010/wordml" xmlns:w15="http://schemas.microsoft.com/office/word/2012/wordml" xmlns:w16cex="http://schemas.microsoft.com/office/word/2018/wordml/cex" xmlns:w16cid="http://schemas.microsoft.com/office/word/2016/wordml/cid" xmlns:w16="http://schemas.microsoft.com/office/word/2018/wordml" xmlns:w16du="http://schemas.microsoft.com/office/word/2023/wordml/word16du" xmlns:w16sdtdh="http://schemas.microsoft.com/office/word/2020/wordml/sdtdatahash" xmlns:w16sdtfl="http://schemas.microsoft.com/office/word/2024/wordml/sdtformatlock" xmlns:w16se="http://schemas.microsoft.com/office/word/2015/wordml/symex" xmlns:wpg="http://schemas.microsoft.com/office/word/2010/wordprocessingGroup" xmlns:wpi="http://schemas.microsoft.com/office/word/2010/wordprocessingInk" xmlns:wne="http://schemas.microsoft.com/office/word/2006/wordml" xmlns:wps="http://schemas.microsoft.com/office/word/2010/wordprocessingShape" mc:Ignorable="w14 w15 w16se w16cid w16 w16cex w16sdtdh w16sdtfl w16du wp14">
   <w:p>
     <w:r>
       <w:rPr>
@@ -23397,7 +23425,7 @@
       <mc:AlternateContent>
         <mc:Choice Requires="wpg">
           <w:drawing>
-            <wp:anchor distT="0" distB="0" distL="114300" distR="114300" simplePos="0" relativeHeight="251658240" behindDoc="1" locked="0" layoutInCell="1" allowOverlap="1">
+            <wp:anchor distT="0" distB="0" distL="114300" distR="114300" simplePos="0" relativeHeight="251658240" behindDoc="1" locked="0" layoutInCell="1" allowOverlap="1" wp14:anchorId="71BC1729" wp14:editId="57D179F4">
               <wp:simplePos x="0" y="0"/>
               <wp:positionH relativeFrom="page">
                 <wp:posOffset>4294505</wp:posOffset>
@@ -23499,7 +23527,7 @@
 </file>
 
 <file path=word/header2.xml><?xml version="1.0" encoding="utf-8"?>
-<w:hdr xmlns:wpc="http://schemas.microsoft.com/office/word/2010/wordprocessingCanvas" xmlns:cx="http://schemas.microsoft.com/office/drawing/2014/chartex" xmlns:mc="http://schemas.openxmlformats.org/markup-compatibility/2006" xmlns:o="urn:schemas-microsoft-com:office:office" xmlns:r="http://schemas.openxmlformats.org/officeDocument/2006/relationships" xmlns:m="http://schemas.openxmlformats.org/officeDocument/2006/math" xmlns:v="urn:schemas-microsoft-com:vml" xmlns:wp14="http://schemas.microsoft.com/office/word/2010/wordprocessingDrawing" xmlns:wp="http://schemas.openxmlformats.org/drawingml/2006/wordprocessingDrawing" xmlns:w10="urn:schemas-microsoft-com:office:word" xmlns:w="http://schemas.openxmlformats.org/wordprocessingml/2006/main" xmlns:w14="http://schemas.microsoft.com/office/word/2010/wordml" xmlns:w15="http://schemas.microsoft.com/office/word/2012/wordml" xmlns:w16se="http://schemas.microsoft.com/office/word/2015/wordml/symex" xmlns:wpg="http://schemas.microsoft.com/office/word/2010/wordprocessingGroup" xmlns:wpi="http://schemas.microsoft.com/office/word/2010/wordprocessingInk" xmlns:wne="http://schemas.microsoft.com/office/word/2006/wordml" xmlns:wps="http://schemas.microsoft.com/office/word/2010/wordprocessingShape" mc:Ignorable="w14 w15 w16se wp14">
+<w:hdr xmlns:wpc="http://schemas.microsoft.com/office/word/2010/wordprocessingCanvas" xmlns:cx="http://schemas.microsoft.com/office/drawing/2014/chartex" xmlns:cx1="http://schemas.microsoft.com/office/drawing/2015/9/8/chartex" xmlns:cx2="http://schemas.microsoft.com/office/drawing/2015/10/21/chartex" xmlns:cx3="http://schemas.microsoft.com/office/drawing/2016/5/9/chartex" xmlns:cx4="http://schemas.microsoft.com/office/drawing/2016/5/10/chartex" xmlns:cx5="http://schemas.microsoft.com/office/drawing/2016/5/11/chartex" xmlns:cx6="http://schemas.microsoft.com/office/drawing/2016/5/12/chartex" xmlns:cx7="http://schemas.microsoft.com/office/drawing/2016/5/13/chartex" xmlns:cx8="http://schemas.microsoft.com/office/drawing/2016/5/14/chartex" xmlns:mc="http://schemas.openxmlformats.org/markup-compatibility/2006" xmlns:aink="http://schemas.microsoft.com/office/drawing/2016/ink" xmlns:am3d="http://schemas.microsoft.com/office/drawing/2017/model3d" xmlns:o="urn:schemas-microsoft-com:office:office" xmlns:oel="http://schemas.microsoft.com/office/2019/extlst" xmlns:r="http://schemas.openxmlformats.org/officeDocument/2006/relationships" xmlns:m="http://schemas.openxmlformats.org/officeDocument/2006/math" xmlns:v="urn:schemas-microsoft-com:vml" xmlns:wp14="http://schemas.microsoft.com/office/word/2010/wordprocessingDrawing" xmlns:wp="http://schemas.openxmlformats.org/drawingml/2006/wordprocessingDrawing" xmlns:w10="urn:schemas-microsoft-com:office:word" xmlns:w="http://schemas.openxmlformats.org/wordprocessingml/2006/main" xmlns:w14="http://schemas.microsoft.com/office/word/2010/wordml" xmlns:w15="http://schemas.microsoft.com/office/word/2012/wordml" xmlns:w16cex="http://schemas.microsoft.com/office/word/2018/wordml/cex" xmlns:w16cid="http://schemas.microsoft.com/office/word/2016/wordml/cid" xmlns:w16="http://schemas.microsoft.com/office/word/2018/wordml" xmlns:w16du="http://schemas.microsoft.com/office/word/2023/wordml/word16du" xmlns:w16sdtdh="http://schemas.microsoft.com/office/word/2020/wordml/sdtdatahash" xmlns:w16sdtfl="http://schemas.microsoft.com/office/word/2024/wordml/sdtformatlock" xmlns:w16se="http://schemas.microsoft.com/office/word/2015/wordml/symex" xmlns:wpg="http://schemas.microsoft.com/office/word/2010/wordprocessingGroup" xmlns:wpi="http://schemas.microsoft.com/office/word/2010/wordprocessingInk" xmlns:wne="http://schemas.microsoft.com/office/word/2006/wordml" xmlns:wps="http://schemas.microsoft.com/office/word/2010/wordprocessingShape" mc:Ignorable="w14 w15 w16se w16cid w16 w16cex w16sdtdh w16sdtfl w16du wp14">
   <w:p>
     <w:r>
       <w:rPr>
@@ -23508,7 +23536,7 @@
       <mc:AlternateContent>
         <mc:Choice Requires="wpg">
           <w:drawing>
-            <wp:anchor distT="0" distB="0" distL="114300" distR="114300" simplePos="0" relativeHeight="251659264" behindDoc="1" locked="0" layoutInCell="1" allowOverlap="1">
+            <wp:anchor distT="0" distB="0" distL="114300" distR="114300" simplePos="0" relativeHeight="251659264" behindDoc="1" locked="0" layoutInCell="1" allowOverlap="1" wp14:anchorId="1A405B70" wp14:editId="32008A57">
               <wp:simplePos x="0" y="0"/>
               <wp:positionH relativeFrom="page">
                 <wp:posOffset>4294505</wp:posOffset>
@@ -23610,7 +23638,7 @@
 </file>
 
 <file path=word/header3.xml><?xml version="1.0" encoding="utf-8"?>
-<w:hdr xmlns:wpc="http://schemas.microsoft.com/office/word/2010/wordprocessingCanvas" xmlns:cx="http://schemas.microsoft.com/office/drawing/2014/chartex" xmlns:mc="http://schemas.openxmlformats.org/markup-compatibility/2006" xmlns:o="urn:schemas-microsoft-com:office:office" xmlns:r="http://schemas.openxmlformats.org/officeDocument/2006/relationships" xmlns:m="http://schemas.openxmlformats.org/officeDocument/2006/math" xmlns:v="urn:schemas-microsoft-com:vml" xmlns:wp14="http://schemas.microsoft.com/office/word/2010/wordprocessingDrawing" xmlns:wp="http://schemas.openxmlformats.org/drawingml/2006/wordprocessingDrawing" xmlns:w10="urn:schemas-microsoft-com:office:word" xmlns:w="http://schemas.openxmlformats.org/wordprocessingml/2006/main" xmlns:w14="http://schemas.microsoft.com/office/word/2010/wordml" xmlns:w15="http://schemas.microsoft.com/office/word/2012/wordml" xmlns:w16se="http://schemas.microsoft.com/office/word/2015/wordml/symex" xmlns:wpg="http://schemas.microsoft.com/office/word/2010/wordprocessingGroup" xmlns:wpi="http://schemas.microsoft.com/office/word/2010/wordprocessingInk" xmlns:wne="http://schemas.microsoft.com/office/word/2006/wordml" xmlns:wps="http://schemas.microsoft.com/office/word/2010/wordprocessingShape" mc:Ignorable="w14 w15 w16se wp14">
+<w:hdr xmlns:wpc="http://schemas.microsoft.com/office/word/2010/wordprocessingCanvas" xmlns:cx="http://schemas.microsoft.com/office/drawing/2014/chartex" xmlns:cx1="http://schemas.microsoft.com/office/drawing/2015/9/8/chartex" xmlns:cx2="http://schemas.microsoft.com/office/drawing/2015/10/21/chartex" xmlns:cx3="http://schemas.microsoft.com/office/drawing/2016/5/9/chartex" xmlns:cx4="http://schemas.microsoft.com/office/drawing/2016/5/10/chartex" xmlns:cx5="http://schemas.microsoft.com/office/drawing/2016/5/11/chartex" xmlns:cx6="http://schemas.microsoft.com/office/drawing/2016/5/12/chartex" xmlns:cx7="http://schemas.microsoft.com/office/drawing/2016/5/13/chartex" xmlns:cx8="http://schemas.microsoft.com/office/drawing/2016/5/14/chartex" xmlns:mc="http://schemas.openxmlformats.org/markup-compatibility/2006" xmlns:aink="http://schemas.microsoft.com/office/drawing/2016/ink" xmlns:am3d="http://schemas.microsoft.com/office/drawing/2017/model3d" xmlns:o="urn:schemas-microsoft-com:office:office" xmlns:oel="http://schemas.microsoft.com/office/2019/extlst" xmlns:r="http://schemas.openxmlformats.org/officeDocument/2006/relationships" xmlns:m="http://schemas.openxmlformats.org/officeDocument/2006/math" xmlns:v="urn:schemas-microsoft-com:vml" xmlns:wp14="http://schemas.microsoft.com/office/word/2010/wordprocessingDrawing" xmlns:wp="http://schemas.openxmlformats.org/drawingml/2006/wordprocessingDrawing" xmlns:w10="urn:schemas-microsoft-com:office:word" xmlns:w="http://schemas.openxmlformats.org/wordprocessingml/2006/main" xmlns:w14="http://schemas.microsoft.com/office/word/2010/wordml" xmlns:w15="http://schemas.microsoft.com/office/word/2012/wordml" xmlns:w16cex="http://schemas.microsoft.com/office/word/2018/wordml/cex" xmlns:w16cid="http://schemas.microsoft.com/office/word/2016/wordml/cid" xmlns:w16="http://schemas.microsoft.com/office/word/2018/wordml" xmlns:w16du="http://schemas.microsoft.com/office/word/2023/wordml/word16du" xmlns:w16sdtdh="http://schemas.microsoft.com/office/word/2020/wordml/sdtdatahash" xmlns:w16sdtfl="http://schemas.microsoft.com/office/word/2024/wordml/sdtformatlock" xmlns:w16se="http://schemas.microsoft.com/office/word/2015/wordml/symex" xmlns:wpg="http://schemas.microsoft.com/office/word/2010/wordprocessingGroup" xmlns:wpi="http://schemas.microsoft.com/office/word/2010/wordprocessingInk" xmlns:wne="http://schemas.microsoft.com/office/word/2006/wordml" xmlns:wps="http://schemas.microsoft.com/office/word/2010/wordprocessingShape" mc:Ignorable="w14 w15 w16se w16cid w16 w16cex w16sdtdh w16sdtfl w16du wp14">
   <w:p>
     <w:r>
       <w:rPr>
@@ -23619,7 +23647,7 @@
       <mc:AlternateContent>
         <mc:Choice Requires="wpg">
           <w:drawing>
-            <wp:anchor distT="0" distB="0" distL="114300" distR="114300" simplePos="0" relativeHeight="251660288" behindDoc="1" locked="0" layoutInCell="1" allowOverlap="1">
+            <wp:anchor distT="0" distB="0" distL="114300" distR="114300" simplePos="0" relativeHeight="251660288" behindDoc="1" locked="0" layoutInCell="1" allowOverlap="1" wp14:anchorId="59C7FD5A" wp14:editId="684F460D">
               <wp:simplePos x="0" y="0"/>
               <wp:positionH relativeFrom="page">
                 <wp:posOffset>0</wp:posOffset>
@@ -23662,7 +23690,7 @@
 </file>
 
 <file path=word/header4.xml><?xml version="1.0" encoding="utf-8"?>
-<w:hdr xmlns:wpc="http://schemas.microsoft.com/office/word/2010/wordprocessingCanvas" xmlns:cx="http://schemas.microsoft.com/office/drawing/2014/chartex" xmlns:mc="http://schemas.openxmlformats.org/markup-compatibility/2006" xmlns:o="urn:schemas-microsoft-com:office:office" xmlns:r="http://schemas.openxmlformats.org/officeDocument/2006/relationships" xmlns:m="http://schemas.openxmlformats.org/officeDocument/2006/math" xmlns:v="urn:schemas-microsoft-com:vml" xmlns:wp14="http://schemas.microsoft.com/office/word/2010/wordprocessingDrawing" xmlns:wp="http://schemas.openxmlformats.org/drawingml/2006/wordprocessingDrawing" xmlns:w10="urn:schemas-microsoft-com:office:word" xmlns:w="http://schemas.openxmlformats.org/wordprocessingml/2006/main" xmlns:w14="http://schemas.microsoft.com/office/word/2010/wordml" xmlns:w15="http://schemas.microsoft.com/office/word/2012/wordml" xmlns:w16se="http://schemas.microsoft.com/office/word/2015/wordml/symex" xmlns:wpg="http://schemas.microsoft.com/office/word/2010/wordprocessingGroup" xmlns:wpi="http://schemas.microsoft.com/office/word/2010/wordprocessingInk" xmlns:wne="http://schemas.microsoft.com/office/word/2006/wordml" xmlns:wps="http://schemas.microsoft.com/office/word/2010/wordprocessingShape" mc:Ignorable="w14 w15 w16se wp14">
+<w:hdr xmlns:wpc="http://schemas.microsoft.com/office/word/2010/wordprocessingCanvas" xmlns:cx="http://schemas.microsoft.com/office/drawing/2014/chartex" xmlns:cx1="http://schemas.microsoft.com/office/drawing/2015/9/8/chartex" xmlns:cx2="http://schemas.microsoft.com/office/drawing/2015/10/21/chartex" xmlns:cx3="http://schemas.microsoft.com/office/drawing/2016/5/9/chartex" xmlns:cx4="http://schemas.microsoft.com/office/drawing/2016/5/10/chartex" xmlns:cx5="http://schemas.microsoft.com/office/drawing/2016/5/11/chartex" xmlns:cx6="http://schemas.microsoft.com/office/drawing/2016/5/12/chartex" xmlns:cx7="http://schemas.microsoft.com/office/drawing/2016/5/13/chartex" xmlns:cx8="http://schemas.microsoft.com/office/drawing/2016/5/14/chartex" xmlns:mc="http://schemas.openxmlformats.org/markup-compatibility/2006" xmlns:aink="http://schemas.microsoft.com/office/drawing/2016/ink" xmlns:am3d="http://schemas.microsoft.com/office/drawing/2017/model3d" xmlns:o="urn:schemas-microsoft-com:office:office" xmlns:oel="http://schemas.microsoft.com/office/2019/extlst" xmlns:r="http://schemas.openxmlformats.org/officeDocument/2006/relationships" xmlns:m="http://schemas.openxmlformats.org/officeDocument/2006/math" xmlns:v="urn:schemas-microsoft-com:vml" xmlns:wp14="http://schemas.microsoft.com/office/word/2010/wordprocessingDrawing" xmlns:wp="http://schemas.openxmlformats.org/drawingml/2006/wordprocessingDrawing" xmlns:w10="urn:schemas-microsoft-com:office:word" xmlns:w="http://schemas.openxmlformats.org/wordprocessingml/2006/main" xmlns:w14="http://schemas.microsoft.com/office/word/2010/wordml" xmlns:w15="http://schemas.microsoft.com/office/word/2012/wordml" xmlns:w16cex="http://schemas.microsoft.com/office/word/2018/wordml/cex" xmlns:w16cid="http://schemas.microsoft.com/office/word/2016/wordml/cid" xmlns:w16="http://schemas.microsoft.com/office/word/2018/wordml" xmlns:w16du="http://schemas.microsoft.com/office/word/2023/wordml/word16du" xmlns:w16sdtdh="http://schemas.microsoft.com/office/word/2020/wordml/sdtdatahash" xmlns:w16sdtfl="http://schemas.microsoft.com/office/word/2024/wordml/sdtformatlock" xmlns:w16se="http://schemas.microsoft.com/office/word/2015/wordml/symex" xmlns:wpg="http://schemas.microsoft.com/office/word/2010/wordprocessingGroup" xmlns:wpi="http://schemas.microsoft.com/office/word/2010/wordprocessingInk" xmlns:wne="http://schemas.microsoft.com/office/word/2006/wordml" xmlns:wps="http://schemas.microsoft.com/office/word/2010/wordprocessingShape" mc:Ignorable="w14 w15 w16se w16cid w16 w16cex w16sdtdh w16sdtfl w16du wp14">
   <w:p>
     <w:pPr>
       <w:spacing w:after="0"/>
@@ -23674,7 +23702,7 @@
       <mc:AlternateContent>
         <mc:Choice Requires="wpg">
           <w:drawing>
-            <wp:anchor distT="0" distB="0" distL="114300" distR="114300" simplePos="0" relativeHeight="251661312" behindDoc="0" locked="0" layoutInCell="1" allowOverlap="1">
+            <wp:anchor distT="0" distB="0" distL="114300" distR="114300" simplePos="0" relativeHeight="251661312" behindDoc="0" locked="0" layoutInCell="1" allowOverlap="1" wp14:anchorId="443F5131" wp14:editId="4C1A90ED">
               <wp:simplePos x="0" y="0"/>
               <wp:positionH relativeFrom="page">
                 <wp:posOffset>676593</wp:posOffset>
@@ -24737,149 +24765,128 @@
             </wp:anchor>
           </w:drawing>
         </mc:Choice>
-        <mc:Fallback xmlns:a="http://schemas.openxmlformats.org/drawingml/2006/main">
+        <mc:Fallback>
           <w:pict>
-            <v:group id="Group 43263" style="width:504.955pt;height:23.775pt;position:absolute;mso-position-horizontal-relative:page;mso-position-horizontal:absolute;margin-left:53.275pt;mso-position-vertical-relative:page;margin-top:36.005pt;" coordsize="64129,3019">
-              <v:shape id="Shape 44472" style="position:absolute;width:36497;height:2924;left:95;top:0;" coordsize="3649726,292418" path="m0,0l3649726,0l3649726,292418l0,292418l0,0">
-                <v:stroke weight="0pt" endcap="flat" joinstyle="miter" miterlimit="10" on="false" color="#000000" opacity="0"/>
-                <v:fill on="true" color="#0070c0"/>
+            <v:group w14:anchorId="443F5131" id="Group 43263" o:spid="_x0000_s1134" style="position:absolute;margin-left:53.3pt;margin-top:36pt;width:504.95pt;height:23.8pt;z-index:251661312;mso-position-horizontal-relative:page;mso-position-vertical-relative:page" coordsize="64129,3019" o:gfxdata="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">
+              <v:shape id="Shape 44465" o:spid="_x0000_s1135" style="position:absolute;left:95;width:36497;height:2924;visibility:visible;mso-wrap-style:square;v-text-anchor:top" coordsize="3649726,292418" o:gfxdata="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" path="m,l3649726,r,292418l,292418,,e" fillcolor="#0070c0" stroked="f" strokeweight="0">
+                <v:stroke miterlimit="83231f" joinstyle="miter"/>
+                <v:path arrowok="t" textboxrect="0,0,3649726,292418"/>
               </v:shape>
-              <v:shape id="Shape 44473" style="position:absolute;width:35036;height:2032;left:825;top:447;" coordsize="3503676,203200" path="m0,0l3503676,0l3503676,203200l0,203200l0,0">
-                <v:stroke weight="0pt" endcap="flat" joinstyle="miter" miterlimit="10" on="false" color="#000000" opacity="0"/>
-                <v:fill on="true" color="#0070c0"/>
+              <v:shape id="Shape 44466" o:spid="_x0000_s1136" style="position:absolute;left:825;top:447;width:35037;height:2032;visibility:visible;mso-wrap-style:square;v-text-anchor:top" coordsize="3503676,203200" o:gfxdata="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" path="m,l3503676,r,203200l,203200,,e" fillcolor="#0070c0" stroked="f" strokeweight="0">
+                <v:stroke miterlimit="83231f" joinstyle="miter"/>
+                <v:path arrowok="t" textboxrect="0,0,3503676,203200"/>
               </v:shape>
-              <v:rect id="Rectangle 43284" style="position:absolute;width:9919;height:1984;left:825;top:989;" filled="f" stroked="f">
+              <v:rect id="Rectangle 43284" o:spid="_x0000_s1137" style="position:absolute;left:825;top:989;width:9920;height:1984;visibility:visible;mso-wrap-style:square;v-text-anchor:top" o:gfxdata="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" filled="f" stroked="f">
                 <v:textbox inset="0,0,0,0">
                   <w:txbxContent>
                     <w:p>
-                      <w:pPr>
-                        <w:spacing w:before="0" w:after="160" w:line="259" w:lineRule="auto"/>
-                      </w:pPr>
                       <w:r>
                         <w:rPr>
-                          <w:rFonts w:cs="Segoe UI" w:hAnsi="Segoe UI" w:eastAsia="Segoe UI" w:ascii="Segoe UI"/>
-                          <w:b w:val="1"/>
-                          <w:color w:val="ffffff"/>
+                          <w:rFonts w:ascii="Segoe UI" w:eastAsia="Segoe UI" w:hAnsi="Segoe UI" w:cs="Segoe UI"/>
+                          <w:b/>
+                          <w:color w:val="FFFFFF"/>
                           <w:sz w:val="24"/>
                         </w:rPr>
-                        <w:t xml:space="preserve">Thương m</w:t>
+                        <w:t>Thương m</w:t>
                       </w:r>
                     </w:p>
                   </w:txbxContent>
                 </v:textbox>
               </v:rect>
-              <v:rect id="Rectangle 43285" style="position:absolute;width:1090;height:1984;left:8289;top:989;" filled="f" stroked="f">
+              <v:rect id="Rectangle 43285" o:spid="_x0000_s1138" style="position:absolute;left:8289;top:989;width:1091;height:1984;visibility:visible;mso-wrap-style:square;v-text-anchor:top" o:gfxdata="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" filled="f" stroked="f">
                 <v:textbox inset="0,0,0,0">
                   <w:txbxContent>
                     <w:p>
-                      <w:pPr>
-                        <w:spacing w:before="0" w:after="160" w:line="259" w:lineRule="auto"/>
-                      </w:pPr>
                       <w:r>
                         <w:rPr>
-                          <w:rFonts w:cs="Segoe UI" w:hAnsi="Segoe UI" w:eastAsia="Segoe UI" w:ascii="Segoe UI"/>
-                          <w:b w:val="1"/>
-                          <w:color w:val="ffffff"/>
+                          <w:rFonts w:ascii="Segoe UI" w:eastAsia="Segoe UI" w:hAnsi="Segoe UI" w:cs="Segoe UI"/>
+                          <w:b/>
+                          <w:color w:val="FFFFFF"/>
                           <w:sz w:val="24"/>
                         </w:rPr>
-                        <w:t xml:space="preserve">ạ</w:t>
+                        <w:t>ạ</w:t>
                       </w:r>
                     </w:p>
                   </w:txbxContent>
                 </v:textbox>
               </v:rect>
-              <v:rect id="Rectangle 43286" style="position:absolute;width:3192;height:1984;left:9115;top:989;" filled="f" stroked="f">
+              <v:rect id="Rectangle 43286" o:spid="_x0000_s1139" style="position:absolute;left:9115;top:989;width:3192;height:1984;visibility:visible;mso-wrap-style:square;v-text-anchor:top" o:gfxdata="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" filled="f" stroked="f">
                 <v:textbox inset="0,0,0,0">
                   <w:txbxContent>
                     <w:p>
-                      <w:pPr>
-                        <w:spacing w:before="0" w:after="160" w:line="259" w:lineRule="auto"/>
-                      </w:pPr>
                       <w:r>
                         <w:rPr>
-                          <w:rFonts w:cs="Segoe UI" w:hAnsi="Segoe UI" w:eastAsia="Segoe UI" w:ascii="Segoe UI"/>
-                          <w:b w:val="1"/>
-                          <w:color w:val="ffffff"/>
+                          <w:rFonts w:ascii="Segoe UI" w:eastAsia="Segoe UI" w:hAnsi="Segoe UI" w:cs="Segoe UI"/>
+                          <w:b/>
+                          <w:color w:val="FFFFFF"/>
                           <w:sz w:val="24"/>
                         </w:rPr>
-                        <w:t xml:space="preserve">i Đi</w:t>
+                        <w:t>i Đi</w:t>
                       </w:r>
                     </w:p>
                   </w:txbxContent>
                 </v:textbox>
               </v:rect>
-              <v:rect id="Rectangle 43287" style="position:absolute;width:1096;height:1984;left:11528;top:989;" filled="f" stroked="f">
+              <v:rect id="Rectangle 43287" o:spid="_x0000_s1140" style="position:absolute;left:11528;top:989;width:1096;height:1984;visibility:visible;mso-wrap-style:square;v-text-anchor:top" o:gfxdata="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" filled="f" stroked="f">
                 <v:textbox inset="0,0,0,0">
                   <w:txbxContent>
                     <w:p>
-                      <w:pPr>
-                        <w:spacing w:before="0" w:after="160" w:line="259" w:lineRule="auto"/>
-                      </w:pPr>
                       <w:r>
                         <w:rPr>
-                          <w:rFonts w:cs="Segoe UI" w:hAnsi="Segoe UI" w:eastAsia="Segoe UI" w:ascii="Segoe UI"/>
-                          <w:b w:val="1"/>
-                          <w:color w:val="ffffff"/>
+                          <w:rFonts w:ascii="Segoe UI" w:eastAsia="Segoe UI" w:hAnsi="Segoe UI" w:cs="Segoe UI"/>
+                          <w:b/>
+                          <w:color w:val="FFFFFF"/>
                           <w:sz w:val="24"/>
                         </w:rPr>
-                        <w:t xml:space="preserve">ệ</w:t>
+                        <w:t>ệ</w:t>
                       </w:r>
                     </w:p>
                   </w:txbxContent>
                 </v:textbox>
               </v:rect>
-              <v:rect id="Rectangle 43288" style="position:absolute;width:2562;height:1984;left:12357;top:989;" filled="f" stroked="f">
+              <v:rect id="Rectangle 43288" o:spid="_x0000_s1141" style="position:absolute;left:12357;top:989;width:2562;height:1984;visibility:visible;mso-wrap-style:square;v-text-anchor:top" o:gfxdata="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" filled="f" stroked="f">
                 <v:textbox inset="0,0,0,0">
                   <w:txbxContent>
                     <w:p>
-                      <w:pPr>
-                        <w:spacing w:before="0" w:after="160" w:line="259" w:lineRule="auto"/>
-                      </w:pPr>
                       <w:r>
                         <w:rPr>
-                          <w:rFonts w:cs="Segoe UI" w:hAnsi="Segoe UI" w:eastAsia="Segoe UI" w:ascii="Segoe UI"/>
-                          <w:b w:val="1"/>
-                          <w:color w:val="ffffff"/>
+                          <w:rFonts w:ascii="Segoe UI" w:eastAsia="Segoe UI" w:hAnsi="Segoe UI" w:cs="Segoe UI"/>
+                          <w:b/>
+                          <w:color w:val="FFFFFF"/>
                           <w:sz w:val="24"/>
                         </w:rPr>
-                        <w:t xml:space="preserve">n t</w:t>
+                        <w:t>n t</w:t>
                       </w:r>
                     </w:p>
                   </w:txbxContent>
                 </v:textbox>
               </v:rect>
-              <v:rect id="Rectangle 43289" style="position:absolute;width:1353;height:1984;left:14294;top:989;" filled="f" stroked="f">
+              <v:rect id="Rectangle 43289" o:spid="_x0000_s1142" style="position:absolute;left:14294;top:989;width:1354;height:1984;visibility:visible;mso-wrap-style:square;v-text-anchor:top" o:gfxdata="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" filled="f" stroked="f">
                 <v:textbox inset="0,0,0,0">
                   <w:txbxContent>
                     <w:p>
-                      <w:pPr>
-                        <w:spacing w:before="0" w:after="160" w:line="259" w:lineRule="auto"/>
-                      </w:pPr>
                       <w:r>
                         <w:rPr>
-                          <w:rFonts w:cs="Segoe UI" w:hAnsi="Segoe UI" w:eastAsia="Segoe UI" w:ascii="Segoe UI"/>
-                          <w:b w:val="1"/>
-                          <w:color w:val="ffffff"/>
+                          <w:rFonts w:ascii="Segoe UI" w:eastAsia="Segoe UI" w:hAnsi="Segoe UI" w:cs="Segoe UI"/>
+                          <w:b/>
+                          <w:color w:val="FFFFFF"/>
                           <w:sz w:val="24"/>
                         </w:rPr>
-                        <w:t xml:space="preserve">ử</w:t>
+                        <w:t>ử</w:t>
                       </w:r>
                     </w:p>
                   </w:txbxContent>
                 </v:textbox>
               </v:rect>
-              <v:rect id="Rectangle 43290" style="position:absolute;width:559;height:1984;left:15310;top:989;" filled="f" stroked="f">
+              <v:rect id="Rectangle 43290" o:spid="_x0000_s1143" style="position:absolute;left:15310;top:989;width:559;height:1984;visibility:visible;mso-wrap-style:square;v-text-anchor:top" o:gfxdata="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" filled="f" stroked="f">
                 <v:textbox inset="0,0,0,0">
                   <w:txbxContent>
                     <w:p>
-                      <w:pPr>
-                        <w:spacing w:before="0" w:after="160" w:line="259" w:lineRule="auto"/>
-                      </w:pPr>
                       <w:r>
                         <w:rPr>
-                          <w:rFonts w:cs="Segoe UI" w:hAnsi="Segoe UI" w:eastAsia="Segoe UI" w:ascii="Segoe UI"/>
-                          <w:b w:val="1"/>
-                          <w:color w:val="ffffff"/>
+                          <w:rFonts w:ascii="Segoe UI" w:eastAsia="Segoe UI" w:hAnsi="Segoe UI" w:cs="Segoe UI"/>
+                          <w:b/>
+                          <w:color w:val="FFFFFF"/>
                           <w:sz w:val="24"/>
                         </w:rPr>
                         <w:t xml:space="preserve"> </w:t>
@@ -24888,88 +24895,73 @@
                   </w:txbxContent>
                 </v:textbox>
               </v:rect>
-              <v:rect id="Rectangle 43271" style="position:absolute;width:1463;height:1843;left:50822;top:819;" filled="f" stroked="f">
+              <v:rect id="Rectangle 43271" o:spid="_x0000_s1144" style="position:absolute;left:50822;top:819;width:1463;height:1844;visibility:visible;mso-wrap-style:square;v-text-anchor:top" o:gfxdata="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" filled="f" stroked="f">
                 <v:textbox inset="0,0,0,0">
                   <w:txbxContent>
                     <w:p>
-                      <w:pPr>
-                        <w:spacing w:before="0" w:after="160" w:line="259" w:lineRule="auto"/>
-                      </w:pPr>
                       <w:r>
                         <w:rPr>
-                          <w:rFonts w:cs="Times New Roman" w:hAnsi="Times New Roman" w:eastAsia="Times New Roman" w:ascii="Times New Roman"/>
+                          <w:rFonts w:ascii="Times New Roman" w:eastAsia="Times New Roman" w:hAnsi="Times New Roman" w:cs="Times New Roman"/>
                           <w:sz w:val="24"/>
                         </w:rPr>
-                        <w:t xml:space="preserve">Đ</w:t>
+                        <w:t>Đ</w:t>
                       </w:r>
                     </w:p>
                   </w:txbxContent>
                 </v:textbox>
               </v:rect>
-              <v:rect id="Rectangle 43272" style="position:absolute;width:899;height:1843;left:51933;top:819;" filled="f" stroked="f">
+              <v:rect id="Rectangle 43272" o:spid="_x0000_s1145" style="position:absolute;left:51933;top:819;width:900;height:1844;visibility:visible;mso-wrap-style:square;v-text-anchor:top" o:gfxdata="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" filled="f" stroked="f">
                 <v:textbox inset="0,0,0,0">
                   <w:txbxContent>
                     <w:p>
-                      <w:pPr>
-                        <w:spacing w:before="0" w:after="160" w:line="259" w:lineRule="auto"/>
-                      </w:pPr>
                       <w:r>
                         <w:rPr>
-                          <w:rFonts w:cs="Times New Roman" w:hAnsi="Times New Roman" w:eastAsia="Times New Roman" w:ascii="Times New Roman"/>
+                          <w:rFonts w:ascii="Times New Roman" w:eastAsia="Times New Roman" w:hAnsi="Times New Roman" w:cs="Times New Roman"/>
                           <w:sz w:val="24"/>
                         </w:rPr>
-                        <w:t xml:space="preserve">ặ</w:t>
+                        <w:t>ặ</w:t>
                       </w:r>
                     </w:p>
                   </w:txbxContent>
                 </v:textbox>
               </v:rect>
-              <v:rect id="Rectangle 43273" style="position:absolute;width:1955;height:1843;left:52600;top:819;" filled="f" stroked="f">
+              <v:rect id="Rectangle 43273" o:spid="_x0000_s1146" style="position:absolute;left:52600;top:819;width:1956;height:1844;visibility:visible;mso-wrap-style:square;v-text-anchor:top" o:gfxdata="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" filled="f" stroked="f">
                 <v:textbox inset="0,0,0,0">
                   <w:txbxContent>
                     <w:p>
-                      <w:pPr>
-                        <w:spacing w:before="0" w:after="160" w:line="259" w:lineRule="auto"/>
-                      </w:pPr>
                       <w:r>
                         <w:rPr>
-                          <w:rFonts w:cs="Times New Roman" w:hAnsi="Times New Roman" w:eastAsia="Times New Roman" w:ascii="Times New Roman"/>
+                          <w:rFonts w:ascii="Times New Roman" w:eastAsia="Times New Roman" w:hAnsi="Times New Roman" w:cs="Times New Roman"/>
                           <w:sz w:val="24"/>
                         </w:rPr>
-                        <w:t xml:space="preserve">c t</w:t>
+                        <w:t>c t</w:t>
                       </w:r>
                     </w:p>
                   </w:txbxContent>
                 </v:textbox>
               </v:rect>
-              <v:rect id="Rectangle 43274" style="position:absolute;width:899;height:1843;left:54060;top:819;" filled="f" stroked="f">
+              <v:rect id="Rectangle 43274" o:spid="_x0000_s1147" style="position:absolute;left:54060;top:819;width:900;height:1844;visibility:visible;mso-wrap-style:square;v-text-anchor:top" o:gfxdata="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" filled="f" stroked="f">
                 <v:textbox inset="0,0,0,0">
                   <w:txbxContent>
                     <w:p>
-                      <w:pPr>
-                        <w:spacing w:before="0" w:after="160" w:line="259" w:lineRule="auto"/>
-                      </w:pPr>
                       <w:r>
                         <w:rPr>
-                          <w:rFonts w:cs="Times New Roman" w:hAnsi="Times New Roman" w:eastAsia="Times New Roman" w:ascii="Times New Roman"/>
+                          <w:rFonts w:ascii="Times New Roman" w:eastAsia="Times New Roman" w:hAnsi="Times New Roman" w:cs="Times New Roman"/>
                           <w:sz w:val="24"/>
                         </w:rPr>
-                        <w:t xml:space="preserve">ả</w:t>
+                        <w:t>ả</w:t>
                       </w:r>
                     </w:p>
                   </w:txbxContent>
                 </v:textbox>
               </v:rect>
-              <v:rect id="Rectangle 43275" style="position:absolute;width:506;height:1843;left:54727;top:819;" filled="f" stroked="f">
+              <v:rect id="Rectangle 43275" o:spid="_x0000_s1148" style="position:absolute;left:54727;top:819;width:507;height:1844;visibility:visible;mso-wrap-style:square;v-text-anchor:top" o:gfxdata="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" filled="f" stroked="f">
                 <v:textbox inset="0,0,0,0">
                   <w:txbxContent>
                     <w:p>
-                      <w:pPr>
-                        <w:spacing w:before="0" w:after="160" w:line="259" w:lineRule="auto"/>
-                      </w:pPr>
                       <w:r>
                         <w:rPr>
-                          <w:rFonts w:cs="Times New Roman" w:hAnsi="Times New Roman" w:eastAsia="Times New Roman" w:ascii="Times New Roman"/>
+                          <w:rFonts w:ascii="Times New Roman" w:eastAsia="Times New Roman" w:hAnsi="Times New Roman" w:cs="Times New Roman"/>
                           <w:sz w:val="24"/>
                         </w:rPr>
                         <w:t xml:space="preserve"> </w:t>
@@ -24978,52 +24970,43 @@
                   </w:txbxContent>
                 </v:textbox>
               </v:rect>
-              <v:rect id="Rectangle 43276" style="position:absolute;width:1013;height:1843;left:55108;top:819;" filled="f" stroked="f">
+              <v:rect id="Rectangle 43276" o:spid="_x0000_s1149" style="position:absolute;left:55108;top:819;width:1013;height:1844;visibility:visible;mso-wrap-style:square;v-text-anchor:top" o:gfxdata="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" filled="f" stroked="f">
                 <v:textbox inset="0,0,0,0">
                   <w:txbxContent>
                     <w:p>
-                      <w:pPr>
-                        <w:spacing w:before="0" w:after="160" w:line="259" w:lineRule="auto"/>
-                      </w:pPr>
                       <w:r>
                         <w:rPr>
-                          <w:rFonts w:cs="Times New Roman" w:hAnsi="Times New Roman" w:eastAsia="Times New Roman" w:ascii="Times New Roman"/>
+                          <w:rFonts w:ascii="Times New Roman" w:eastAsia="Times New Roman" w:hAnsi="Times New Roman" w:cs="Times New Roman"/>
                           <w:sz w:val="24"/>
                         </w:rPr>
-                        <w:t xml:space="preserve">đ</w:t>
+                        <w:t>đ</w:t>
                       </w:r>
                     </w:p>
                   </w:txbxContent>
                 </v:textbox>
               </v:rect>
-              <v:rect id="Rectangle 43277" style="position:absolute;width:1013;height:1843;left:55870;top:819;" filled="f" stroked="f">
+              <v:rect id="Rectangle 43277" o:spid="_x0000_s1150" style="position:absolute;left:55870;top:819;width:1013;height:1844;visibility:visible;mso-wrap-style:square;v-text-anchor:top" o:gfxdata="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" filled="f" stroked="f">
                 <v:textbox inset="0,0,0,0">
                   <w:txbxContent>
                     <w:p>
-                      <w:pPr>
-                        <w:spacing w:before="0" w:after="160" w:line="259" w:lineRule="auto"/>
-                      </w:pPr>
                       <w:r>
                         <w:rPr>
-                          <w:rFonts w:cs="Times New Roman" w:hAnsi="Times New Roman" w:eastAsia="Times New Roman" w:ascii="Times New Roman"/>
+                          <w:rFonts w:ascii="Times New Roman" w:eastAsia="Times New Roman" w:hAnsi="Times New Roman" w:cs="Times New Roman"/>
                           <w:sz w:val="24"/>
                         </w:rPr>
-                        <w:t xml:space="preserve">ồ</w:t>
+                        <w:t>ồ</w:t>
                       </w:r>
                     </w:p>
                   </w:txbxContent>
                 </v:textbox>
               </v:rect>
-              <v:rect id="Rectangle 43278" style="position:absolute;width:506;height:1843;left:56632;top:819;" filled="f" stroked="f">
+              <v:rect id="Rectangle 43278" o:spid="_x0000_s1151" style="position:absolute;left:56632;top:819;width:507;height:1844;visibility:visible;mso-wrap-style:square;v-text-anchor:top" o:gfxdata="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" filled="f" stroked="f">
                 <v:textbox inset="0,0,0,0">
                   <w:txbxContent>
                     <w:p>
-                      <w:pPr>
-                        <w:spacing w:before="0" w:after="160" w:line="259" w:lineRule="auto"/>
-                      </w:pPr>
                       <w:r>
                         <w:rPr>
-                          <w:rFonts w:cs="Times New Roman" w:hAnsi="Times New Roman" w:eastAsia="Times New Roman" w:ascii="Times New Roman"/>
+                          <w:rFonts w:ascii="Times New Roman" w:eastAsia="Times New Roman" w:hAnsi="Times New Roman" w:cs="Times New Roman"/>
                           <w:sz w:val="24"/>
                         </w:rPr>
                         <w:t xml:space="preserve"> </w:t>
@@ -25032,88 +25015,73 @@
                   </w:txbxContent>
                 </v:textbox>
               </v:rect>
-              <v:rect id="Rectangle 43279" style="position:absolute;width:4345;height:1843;left:57013;top:819;" filled="f" stroked="f">
+              <v:rect id="Rectangle 43279" o:spid="_x0000_s1152" style="position:absolute;left:57013;top:819;width:4346;height:1844;visibility:visible;mso-wrap-style:square;v-text-anchor:top" o:gfxdata="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" filled="f" stroked="f">
                 <v:textbox inset="0,0,0,0">
                   <w:txbxContent>
                     <w:p>
-                      <w:pPr>
-                        <w:spacing w:before="0" w:after="160" w:line="259" w:lineRule="auto"/>
-                      </w:pPr>
                       <w:r>
                         <w:rPr>
-                          <w:rFonts w:cs="Times New Roman" w:hAnsi="Times New Roman" w:eastAsia="Times New Roman" w:ascii="Times New Roman"/>
+                          <w:rFonts w:ascii="Times New Roman" w:eastAsia="Times New Roman" w:hAnsi="Times New Roman" w:cs="Times New Roman"/>
                           <w:sz w:val="24"/>
                         </w:rPr>
-                        <w:t xml:space="preserve">án cu</w:t>
+                        <w:t>án cu</w:t>
                       </w:r>
                     </w:p>
                   </w:txbxContent>
                 </v:textbox>
               </v:rect>
-              <v:rect id="Rectangle 43280" style="position:absolute;width:1013;height:1843;left:60286;top:819;" filled="f" stroked="f">
+              <v:rect id="Rectangle 43280" o:spid="_x0000_s1153" style="position:absolute;left:60286;top:819;width:1013;height:1844;visibility:visible;mso-wrap-style:square;v-text-anchor:top" o:gfxdata="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" filled="f" stroked="f">
                 <v:textbox inset="0,0,0,0">
                   <w:txbxContent>
                     <w:p>
-                      <w:pPr>
-                        <w:spacing w:before="0" w:after="160" w:line="259" w:lineRule="auto"/>
-                      </w:pPr>
                       <w:r>
                         <w:rPr>
-                          <w:rFonts w:cs="Times New Roman" w:hAnsi="Times New Roman" w:eastAsia="Times New Roman" w:ascii="Times New Roman"/>
+                          <w:rFonts w:ascii="Times New Roman" w:eastAsia="Times New Roman" w:hAnsi="Times New Roman" w:cs="Times New Roman"/>
                           <w:sz w:val="24"/>
                         </w:rPr>
-                        <w:t xml:space="preserve">ố</w:t>
+                        <w:t>ố</w:t>
                       </w:r>
                     </w:p>
                   </w:txbxContent>
                 </v:textbox>
               </v:rect>
-              <v:rect id="Rectangle 43281" style="position:absolute;width:2069;height:1843;left:61048;top:819;" filled="f" stroked="f">
+              <v:rect id="Rectangle 43281" o:spid="_x0000_s1154" style="position:absolute;left:61048;top:819;width:2069;height:1844;visibility:visible;mso-wrap-style:square;v-text-anchor:top" o:gfxdata="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" filled="f" stroked="f">
                 <v:textbox inset="0,0,0,0">
                   <w:txbxContent>
                     <w:p>
-                      <w:pPr>
-                        <w:spacing w:before="0" w:after="160" w:line="259" w:lineRule="auto"/>
-                      </w:pPr>
                       <w:r>
                         <w:rPr>
-                          <w:rFonts w:cs="Times New Roman" w:hAnsi="Times New Roman" w:eastAsia="Times New Roman" w:ascii="Times New Roman"/>
+                          <w:rFonts w:ascii="Times New Roman" w:eastAsia="Times New Roman" w:hAnsi="Times New Roman" w:cs="Times New Roman"/>
                           <w:sz w:val="24"/>
                         </w:rPr>
-                        <w:t xml:space="preserve">i k</w:t>
+                        <w:t>i k</w:t>
                       </w:r>
                     </w:p>
                   </w:txbxContent>
                 </v:textbox>
               </v:rect>
-              <v:rect id="Rectangle 43282" style="position:absolute;width:1013;height:1843;left:62604;top:819;" filled="f" stroked="f">
+              <v:rect id="Rectangle 43282" o:spid="_x0000_s1155" style="position:absolute;left:62604;top:819;width:1013;height:1844;visibility:visible;mso-wrap-style:square;v-text-anchor:top" o:gfxdata="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" filled="f" stroked="f">
                 <v:textbox inset="0,0,0,0">
                   <w:txbxContent>
                     <w:p>
-                      <w:pPr>
-                        <w:spacing w:before="0" w:after="160" w:line="259" w:lineRule="auto"/>
-                      </w:pPr>
                       <w:r>
                         <w:rPr>
-                          <w:rFonts w:cs="Times New Roman" w:hAnsi="Times New Roman" w:eastAsia="Times New Roman" w:ascii="Times New Roman"/>
+                          <w:rFonts w:ascii="Times New Roman" w:eastAsia="Times New Roman" w:hAnsi="Times New Roman" w:cs="Times New Roman"/>
                           <w:sz w:val="24"/>
                         </w:rPr>
-                        <w:t xml:space="preserve">ỳ</w:t>
+                        <w:t>ỳ</w:t>
                       </w:r>
                     </w:p>
                   </w:txbxContent>
                 </v:textbox>
               </v:rect>
-              <v:rect id="Rectangle 43283" style="position:absolute;width:506;height:1843;left:63399;top:819;" filled="f" stroked="f">
+              <v:rect id="Rectangle 43283" o:spid="_x0000_s1156" style="position:absolute;left:63399;top:819;width:506;height:1844;visibility:visible;mso-wrap-style:square;v-text-anchor:top" o:gfxdata="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" filled="f" stroked="f">
                 <v:textbox inset="0,0,0,0">
                   <w:txbxContent>
                     <w:p>
-                      <w:pPr>
-                        <w:spacing w:before="0" w:after="160" w:line="259" w:lineRule="auto"/>
-                      </w:pPr>
                       <w:r>
                         <w:rPr>
-                          <w:rFonts w:cs="Times New Roman" w:hAnsi="Times New Roman" w:eastAsia="Times New Roman" w:ascii="Times New Roman"/>
+                          <w:rFonts w:ascii="Times New Roman" w:eastAsia="Times New Roman" w:hAnsi="Times New Roman" w:cs="Times New Roman"/>
                           <w:sz w:val="24"/>
                         </w:rPr>
                         <w:t xml:space="preserve"> </w:t>
@@ -25122,27 +25090,27 @@
                   </w:txbxContent>
                 </v:textbox>
               </v:rect>
-              <v:shape id="Shape 44474" style="position:absolute;width:36497;height:447;left:95;top:0;" coordsize="3649726,44768" path="m0,0l3649726,0l3649726,44768l0,44768l0,0">
-                <v:stroke weight="0pt" endcap="flat" joinstyle="miter" miterlimit="10" on="false" color="#000000" opacity="0"/>
-                <v:fill on="true" color="#0070c0"/>
+              <v:shape id="Shape 44467" o:spid="_x0000_s1157" style="position:absolute;left:95;width:36497;height:447;visibility:visible;mso-wrap-style:square;v-text-anchor:top" coordsize="3649726,44768" o:gfxdata="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" path="m,l3649726,r,44768l,44768,,e" fillcolor="#0070c0" stroked="f" strokeweight="0">
+                <v:stroke miterlimit="83231f" joinstyle="miter"/>
+                <v:path arrowok="t" textboxrect="0,0,3649726,44768"/>
               </v:shape>
-              <v:shape id="Shape 44475" style="position:absolute;width:36497;height:444;left:95;top:2511;" coordsize="3649726,44450" path="m0,0l3649726,0l3649726,44450l0,44450l0,0">
-                <v:stroke weight="0pt" endcap="flat" joinstyle="miter" miterlimit="10" on="false" color="#000000" opacity="0"/>
-                <v:fill on="true" color="#0070c0"/>
+              <v:shape id="Shape 44468" o:spid="_x0000_s1158" style="position:absolute;left:95;top:2511;width:36497;height:444;visibility:visible;mso-wrap-style:square;v-text-anchor:top" coordsize="3649726,44450" o:gfxdata="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" path="m,l3649726,r,44450l,44450,,e" fillcolor="#0070c0" stroked="f" strokeweight="0">
+                <v:stroke miterlimit="83231f" joinstyle="miter"/>
+                <v:path arrowok="t" textboxrect="0,0,3649726,44450"/>
               </v:shape>
-              <v:shape id="Shape 44476" style="position:absolute;width:36592;height:91;left:0;top:2955;" coordsize="3659251,9144" path="m0,0l3659251,0l3659251,9144l0,9144l0,0">
-                <v:stroke weight="0pt" endcap="flat" joinstyle="miter" miterlimit="10" on="false" color="#000000" opacity="0"/>
-                <v:fill on="true" color="#0070c0"/>
+              <v:shape id="Shape 44469" o:spid="_x0000_s1159" style="position:absolute;top:2955;width:36592;height:92;visibility:visible;mso-wrap-style:square;v-text-anchor:top" coordsize="3659251,9144" o:gfxdata="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" path="m,l3659251,r,9144l,9144,,e" fillcolor="#0070c0" stroked="f" strokeweight="0">
+                <v:stroke miterlimit="83231f" joinstyle="miter"/>
+                <v:path arrowok="t" textboxrect="0,0,3659251,9144"/>
               </v:shape>
-              <v:shape id="Shape 44477" style="position:absolute;width:91;height:91;left:36496;top:2955;" coordsize="9144,9144" path="m0,0l9144,0l9144,9144l0,9144l0,0">
-                <v:stroke weight="0pt" endcap="flat" joinstyle="miter" miterlimit="10" on="false" color="#000000" opacity="0"/>
-                <v:fill on="true" color="#0070c0"/>
+              <v:shape id="Shape 44470" o:spid="_x0000_s1160" style="position:absolute;left:36496;top:2955;width:92;height:92;visibility:visible;mso-wrap-style:square;v-text-anchor:top" coordsize="9144,9144" o:gfxdata="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" path="m,l9144,r,9144l,9144,,e" fillcolor="#0070c0" stroked="f" strokeweight="0">
+                <v:stroke miterlimit="83231f" joinstyle="miter"/>
+                <v:path arrowok="t" textboxrect="0,0,9144,9144"/>
               </v:shape>
-              <v:shape id="Shape 44478" style="position:absolute;width:27569;height:91;left:36560;top:2955;" coordsize="2756916,9144" path="m0,0l2756916,0l2756916,9144l0,9144l0,0">
-                <v:stroke weight="0pt" endcap="flat" joinstyle="miter" miterlimit="10" on="false" color="#000000" opacity="0"/>
-                <v:fill on="true" color="#0070c0"/>
+              <v:shape id="Shape 44471" o:spid="_x0000_s1161" style="position:absolute;left:36560;top:2955;width:27569;height:92;visibility:visible;mso-wrap-style:square;v-text-anchor:top" coordsize="2756916,9144" o:gfxdata="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" path="m,l2756916,r,9144l,9144,,e" fillcolor="#0070c0" stroked="f" strokeweight="0">
+                <v:stroke miterlimit="83231f" joinstyle="miter"/>
+                <v:path arrowok="t" textboxrect="0,0,2756916,9144"/>
               </v:shape>
-              <w10:wrap type="square"/>
+              <w10:wrap type="square" anchorx="page" anchory="page"/>
             </v:group>
           </w:pict>
         </mc:Fallback>
@@ -25164,7 +25132,7 @@
       <mc:AlternateContent>
         <mc:Choice Requires="wpg">
           <w:drawing>
-            <wp:anchor distT="0" distB="0" distL="114300" distR="114300" simplePos="0" relativeHeight="251662336" behindDoc="1" locked="0" layoutInCell="1" allowOverlap="1">
+            <wp:anchor distT="0" distB="0" distL="114300" distR="114300" simplePos="0" relativeHeight="251662336" behindDoc="1" locked="0" layoutInCell="1" allowOverlap="1" wp14:anchorId="3236C2EB" wp14:editId="79E07DA5">
               <wp:simplePos x="0" y="0"/>
               <wp:positionH relativeFrom="page">
                 <wp:posOffset>0</wp:posOffset>
@@ -25207,7 +25175,7 @@
 </file>
 
 <file path=word/header5.xml><?xml version="1.0" encoding="utf-8"?>
-<w:hdr xmlns:wpc="http://schemas.microsoft.com/office/word/2010/wordprocessingCanvas" xmlns:cx="http://schemas.microsoft.com/office/drawing/2014/chartex" xmlns:mc="http://schemas.openxmlformats.org/markup-compatibility/2006" xmlns:o="urn:schemas-microsoft-com:office:office" xmlns:r="http://schemas.openxmlformats.org/officeDocument/2006/relationships" xmlns:m="http://schemas.openxmlformats.org/officeDocument/2006/math" xmlns:v="urn:schemas-microsoft-com:vml" xmlns:wp14="http://schemas.microsoft.com/office/word/2010/wordprocessingDrawing" xmlns:wp="http://schemas.openxmlformats.org/drawingml/2006/wordprocessingDrawing" xmlns:w10="urn:schemas-microsoft-com:office:word" xmlns:w="http://schemas.openxmlformats.org/wordprocessingml/2006/main" xmlns:w14="http://schemas.microsoft.com/office/word/2010/wordml" xmlns:w15="http://schemas.microsoft.com/office/word/2012/wordml" xmlns:w16se="http://schemas.microsoft.com/office/word/2015/wordml/symex" xmlns:wpg="http://schemas.microsoft.com/office/word/2010/wordprocessingGroup" xmlns:wpi="http://schemas.microsoft.com/office/word/2010/wordprocessingInk" xmlns:wne="http://schemas.microsoft.com/office/word/2006/wordml" xmlns:wps="http://schemas.microsoft.com/office/word/2010/wordprocessingShape" mc:Ignorable="w14 w15 w16se wp14">
+<w:hdr xmlns:wpc="http://schemas.microsoft.com/office/word/2010/wordprocessingCanvas" xmlns:cx="http://schemas.microsoft.com/office/drawing/2014/chartex" xmlns:cx1="http://schemas.microsoft.com/office/drawing/2015/9/8/chartex" xmlns:cx2="http://schemas.microsoft.com/office/drawing/2015/10/21/chartex" xmlns:cx3="http://schemas.microsoft.com/office/drawing/2016/5/9/chartex" xmlns:cx4="http://schemas.microsoft.com/office/drawing/2016/5/10/chartex" xmlns:cx5="http://schemas.microsoft.com/office/drawing/2016/5/11/chartex" xmlns:cx6="http://schemas.microsoft.com/office/drawing/2016/5/12/chartex" xmlns:cx7="http://schemas.microsoft.com/office/drawing/2016/5/13/chartex" xmlns:cx8="http://schemas.microsoft.com/office/drawing/2016/5/14/chartex" xmlns:mc="http://schemas.openxmlformats.org/markup-compatibility/2006" xmlns:aink="http://schemas.microsoft.com/office/drawing/2016/ink" xmlns:am3d="http://schemas.microsoft.com/office/drawing/2017/model3d" xmlns:o="urn:schemas-microsoft-com:office:office" xmlns:oel="http://schemas.microsoft.com/office/2019/extlst" xmlns:r="http://schemas.openxmlformats.org/officeDocument/2006/relationships" xmlns:m="http://schemas.openxmlformats.org/officeDocument/2006/math" xmlns:v="urn:schemas-microsoft-com:vml" xmlns:wp14="http://schemas.microsoft.com/office/word/2010/wordprocessingDrawing" xmlns:wp="http://schemas.openxmlformats.org/drawingml/2006/wordprocessingDrawing" xmlns:w10="urn:schemas-microsoft-com:office:word" xmlns:w="http://schemas.openxmlformats.org/wordprocessingml/2006/main" xmlns:w14="http://schemas.microsoft.com/office/word/2010/wordml" xmlns:w15="http://schemas.microsoft.com/office/word/2012/wordml" xmlns:w16cex="http://schemas.microsoft.com/office/word/2018/wordml/cex" xmlns:w16cid="http://schemas.microsoft.com/office/word/2016/wordml/cid" xmlns:w16="http://schemas.microsoft.com/office/word/2018/wordml" xmlns:w16du="http://schemas.microsoft.com/office/word/2023/wordml/word16du" xmlns:w16sdtdh="http://schemas.microsoft.com/office/word/2020/wordml/sdtdatahash" xmlns:w16sdtfl="http://schemas.microsoft.com/office/word/2024/wordml/sdtformatlock" xmlns:w16se="http://schemas.microsoft.com/office/word/2015/wordml/symex" xmlns:wpg="http://schemas.microsoft.com/office/word/2010/wordprocessingGroup" xmlns:wpi="http://schemas.microsoft.com/office/word/2010/wordprocessingInk" xmlns:wne="http://schemas.microsoft.com/office/word/2006/wordml" xmlns:wps="http://schemas.microsoft.com/office/word/2010/wordprocessingShape" mc:Ignorable="w14 w15 w16se w16cid w16 w16cex w16sdtdh w16sdtfl w16du wp14">
   <w:p>
     <w:pPr>
       <w:spacing w:after="0"/>
@@ -25219,7 +25187,7 @@
       <mc:AlternateContent>
         <mc:Choice Requires="wpg">
           <w:drawing>
-            <wp:anchor distT="0" distB="0" distL="114300" distR="114300" simplePos="0" relativeHeight="251663360" behindDoc="0" locked="0" layoutInCell="1" allowOverlap="1">
+            <wp:anchor distT="0" distB="0" distL="114300" distR="114300" simplePos="0" relativeHeight="251663360" behindDoc="0" locked="0" layoutInCell="1" allowOverlap="1" wp14:anchorId="34411FB3" wp14:editId="4169DA23">
               <wp:simplePos x="0" y="0"/>
               <wp:positionH relativeFrom="page">
                 <wp:posOffset>676593</wp:posOffset>
@@ -26282,149 +26250,128 @@
             </wp:anchor>
           </w:drawing>
         </mc:Choice>
-        <mc:Fallback xmlns:a="http://schemas.openxmlformats.org/drawingml/2006/main">
+        <mc:Fallback>
           <w:pict>
-            <v:group id="Group 43201" style="width:504.955pt;height:23.775pt;position:absolute;mso-position-horizontal-relative:page;mso-position-horizontal:absolute;margin-left:53.275pt;mso-position-vertical-relative:page;margin-top:36.005pt;" coordsize="64129,3019">
-              <v:shape id="Shape 44458" style="position:absolute;width:36497;height:2924;left:95;top:0;" coordsize="3649726,292418" path="m0,0l3649726,0l3649726,292418l0,292418l0,0">
-                <v:stroke weight="0pt" endcap="flat" joinstyle="miter" miterlimit="10" on="false" color="#000000" opacity="0"/>
-                <v:fill on="true" color="#0070c0"/>
+            <v:group w14:anchorId="34411FB3" id="Group 43201" o:spid="_x0000_s1162" style="position:absolute;margin-left:53.3pt;margin-top:36pt;width:504.95pt;height:23.8pt;z-index:251663360;mso-position-horizontal-relative:page;mso-position-vertical-relative:page" coordsize="64129,3019" o:gfxdata="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">
+              <v:shape id="Shape 44451" o:spid="_x0000_s1163" style="position:absolute;left:95;width:36497;height:2924;visibility:visible;mso-wrap-style:square;v-text-anchor:top" coordsize="3649726,292418" o:gfxdata="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" path="m,l3649726,r,292418l,292418,,e" fillcolor="#0070c0" stroked="f" strokeweight="0">
+                <v:stroke miterlimit="83231f" joinstyle="miter"/>
+                <v:path arrowok="t" textboxrect="0,0,3649726,292418"/>
               </v:shape>
-              <v:shape id="Shape 44459" style="position:absolute;width:35036;height:2032;left:825;top:447;" coordsize="3503676,203200" path="m0,0l3503676,0l3503676,203200l0,203200l0,0">
-                <v:stroke weight="0pt" endcap="flat" joinstyle="miter" miterlimit="10" on="false" color="#000000" opacity="0"/>
-                <v:fill on="true" color="#0070c0"/>
+              <v:shape id="Shape 44452" o:spid="_x0000_s1164" style="position:absolute;left:825;top:447;width:35037;height:2032;visibility:visible;mso-wrap-style:square;v-text-anchor:top" coordsize="3503676,203200" o:gfxdata="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" path="m,l3503676,r,203200l,203200,,e" fillcolor="#0070c0" stroked="f" strokeweight="0">
+                <v:stroke miterlimit="83231f" joinstyle="miter"/>
+                <v:path arrowok="t" textboxrect="0,0,3503676,203200"/>
               </v:shape>
-              <v:rect id="Rectangle 43222" style="position:absolute;width:9919;height:1984;left:825;top:989;" filled="f" stroked="f">
+              <v:rect id="Rectangle 43222" o:spid="_x0000_s1165" style="position:absolute;left:825;top:989;width:9920;height:1984;visibility:visible;mso-wrap-style:square;v-text-anchor:top" o:gfxdata="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" filled="f" stroked="f">
                 <v:textbox inset="0,0,0,0">
                   <w:txbxContent>
                     <w:p>
-                      <w:pPr>
-                        <w:spacing w:before="0" w:after="160" w:line="259" w:lineRule="auto"/>
-                      </w:pPr>
                       <w:r>
                         <w:rPr>
-                          <w:rFonts w:cs="Segoe UI" w:hAnsi="Segoe UI" w:eastAsia="Segoe UI" w:ascii="Segoe UI"/>
-                          <w:b w:val="1"/>
-                          <w:color w:val="ffffff"/>
+                          <w:rFonts w:ascii="Segoe UI" w:eastAsia="Segoe UI" w:hAnsi="Segoe UI" w:cs="Segoe UI"/>
+                          <w:b/>
+                          <w:color w:val="FFFFFF"/>
                           <w:sz w:val="24"/>
                         </w:rPr>
-                        <w:t xml:space="preserve">Thương m</w:t>
+                        <w:t>Thương m</w:t>
                       </w:r>
                     </w:p>
                   </w:txbxContent>
                 </v:textbox>
               </v:rect>
-              <v:rect id="Rectangle 43223" style="position:absolute;width:1090;height:1984;left:8289;top:989;" filled="f" stroked="f">
+              <v:rect id="Rectangle 43223" o:spid="_x0000_s1166" style="position:absolute;left:8289;top:989;width:1091;height:1984;visibility:visible;mso-wrap-style:square;v-text-anchor:top" o:gfxdata="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" filled="f" stroked="f">
                 <v:textbox inset="0,0,0,0">
                   <w:txbxContent>
                     <w:p>
-                      <w:pPr>
-                        <w:spacing w:before="0" w:after="160" w:line="259" w:lineRule="auto"/>
-                      </w:pPr>
                       <w:r>
                         <w:rPr>
-                          <w:rFonts w:cs="Segoe UI" w:hAnsi="Segoe UI" w:eastAsia="Segoe UI" w:ascii="Segoe UI"/>
-                          <w:b w:val="1"/>
-                          <w:color w:val="ffffff"/>
+                          <w:rFonts w:ascii="Segoe UI" w:eastAsia="Segoe UI" w:hAnsi="Segoe UI" w:cs="Segoe UI"/>
+                          <w:b/>
+                          <w:color w:val="FFFFFF"/>
                           <w:sz w:val="24"/>
                         </w:rPr>
-                        <w:t xml:space="preserve">ạ</w:t>
+                        <w:t>ạ</w:t>
                       </w:r>
                     </w:p>
                   </w:txbxContent>
                 </v:textbox>
               </v:rect>
-              <v:rect id="Rectangle 43224" style="position:absolute;width:3192;height:1984;left:9115;top:989;" filled="f" stroked="f">
+              <v:rect id="Rectangle 43224" o:spid="_x0000_s1167" style="position:absolute;left:9115;top:989;width:3192;height:1984;visibility:visible;mso-wrap-style:square;v-text-anchor:top" o:gfxdata="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" filled="f" stroked="f">
                 <v:textbox inset="0,0,0,0">
                   <w:txbxContent>
                     <w:p>
-                      <w:pPr>
-                        <w:spacing w:before="0" w:after="160" w:line="259" w:lineRule="auto"/>
-                      </w:pPr>
                       <w:r>
                         <w:rPr>
-                          <w:rFonts w:cs="Segoe UI" w:hAnsi="Segoe UI" w:eastAsia="Segoe UI" w:ascii="Segoe UI"/>
-                          <w:b w:val="1"/>
-                          <w:color w:val="ffffff"/>
+                          <w:rFonts w:ascii="Segoe UI" w:eastAsia="Segoe UI" w:hAnsi="Segoe UI" w:cs="Segoe UI"/>
+                          <w:b/>
+                          <w:color w:val="FFFFFF"/>
                           <w:sz w:val="24"/>
                         </w:rPr>
-                        <w:t xml:space="preserve">i Đi</w:t>
+                        <w:t>i Đi</w:t>
                       </w:r>
                     </w:p>
                   </w:txbxContent>
                 </v:textbox>
               </v:rect>
-              <v:rect id="Rectangle 43225" style="position:absolute;width:1096;height:1984;left:11528;top:989;" filled="f" stroked="f">
+              <v:rect id="Rectangle 43225" o:spid="_x0000_s1168" style="position:absolute;left:11528;top:989;width:1096;height:1984;visibility:visible;mso-wrap-style:square;v-text-anchor:top" o:gfxdata="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" filled="f" stroked="f">
                 <v:textbox inset="0,0,0,0">
                   <w:txbxContent>
                     <w:p>
-                      <w:pPr>
-                        <w:spacing w:before="0" w:after="160" w:line="259" w:lineRule="auto"/>
-                      </w:pPr>
                       <w:r>
                         <w:rPr>
-                          <w:rFonts w:cs="Segoe UI" w:hAnsi="Segoe UI" w:eastAsia="Segoe UI" w:ascii="Segoe UI"/>
-                          <w:b w:val="1"/>
-                          <w:color w:val="ffffff"/>
+                          <w:rFonts w:ascii="Segoe UI" w:eastAsia="Segoe UI" w:hAnsi="Segoe UI" w:cs="Segoe UI"/>
+                          <w:b/>
+                          <w:color w:val="FFFFFF"/>
                           <w:sz w:val="24"/>
                         </w:rPr>
-                        <w:t xml:space="preserve">ệ</w:t>
+                        <w:t>ệ</w:t>
                       </w:r>
                     </w:p>
                   </w:txbxContent>
                 </v:textbox>
               </v:rect>
-              <v:rect id="Rectangle 43226" style="position:absolute;width:2562;height:1984;left:12357;top:989;" filled="f" stroked="f">
+              <v:rect id="Rectangle 43226" o:spid="_x0000_s1169" style="position:absolute;left:12357;top:989;width:2562;height:1984;visibility:visible;mso-wrap-style:square;v-text-anchor:top" o:gfxdata="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" filled="f" stroked="f">
                 <v:textbox inset="0,0,0,0">
                   <w:txbxContent>
                     <w:p>
-                      <w:pPr>
-                        <w:spacing w:before="0" w:after="160" w:line="259" w:lineRule="auto"/>
-                      </w:pPr>
                       <w:r>
                         <w:rPr>
-                          <w:rFonts w:cs="Segoe UI" w:hAnsi="Segoe UI" w:eastAsia="Segoe UI" w:ascii="Segoe UI"/>
-                          <w:b w:val="1"/>
-                          <w:color w:val="ffffff"/>
+                          <w:rFonts w:ascii="Segoe UI" w:eastAsia="Segoe UI" w:hAnsi="Segoe UI" w:cs="Segoe UI"/>
+                          <w:b/>
+                          <w:color w:val="FFFFFF"/>
                           <w:sz w:val="24"/>
                         </w:rPr>
-                        <w:t xml:space="preserve">n t</w:t>
+                        <w:t>n t</w:t>
                       </w:r>
                     </w:p>
                   </w:txbxContent>
                 </v:textbox>
               </v:rect>
-              <v:rect id="Rectangle 43227" style="position:absolute;width:1353;height:1984;left:14294;top:989;" filled="f" stroked="f">
+              <v:rect id="Rectangle 43227" o:spid="_x0000_s1170" style="position:absolute;left:14294;top:989;width:1354;height:1984;visibility:visible;mso-wrap-style:square;v-text-anchor:top" o:gfxdata="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" filled="f" stroked="f">
                 <v:textbox inset="0,0,0,0">
                   <w:txbxContent>
                     <w:p>
-                      <w:pPr>
-                        <w:spacing w:before="0" w:after="160" w:line="259" w:lineRule="auto"/>
-                      </w:pPr>
                       <w:r>
                         <w:rPr>
-                          <w:rFonts w:cs="Segoe UI" w:hAnsi="Segoe UI" w:eastAsia="Segoe UI" w:ascii="Segoe UI"/>
-                          <w:b w:val="1"/>
-                          <w:color w:val="ffffff"/>
+                          <w:rFonts w:ascii="Segoe UI" w:eastAsia="Segoe UI" w:hAnsi="Segoe UI" w:cs="Segoe UI"/>
+                          <w:b/>
+                          <w:color w:val="FFFFFF"/>
                           <w:sz w:val="24"/>
                         </w:rPr>
-                        <w:t xml:space="preserve">ử</w:t>
+                        <w:t>ử</w:t>
                       </w:r>
                     </w:p>
                   </w:txbxContent>
                 </v:textbox>
               </v:rect>
-              <v:rect id="Rectangle 43228" style="position:absolute;width:559;height:1984;left:15310;top:989;" filled="f" stroked="f">
+              <v:rect id="Rectangle 43228" o:spid="_x0000_s1171" style="position:absolute;left:15310;top:989;width:559;height:1984;visibility:visible;mso-wrap-style:square;v-text-anchor:top" o:gfxdata="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" filled="f" stroked="f">
                 <v:textbox inset="0,0,0,0">
                   <w:txbxContent>
                     <w:p>
-                      <w:pPr>
-                        <w:spacing w:before="0" w:after="160" w:line="259" w:lineRule="auto"/>
-                      </w:pPr>
                       <w:r>
                         <w:rPr>
-                          <w:rFonts w:cs="Segoe UI" w:hAnsi="Segoe UI" w:eastAsia="Segoe UI" w:ascii="Segoe UI"/>
-                          <w:b w:val="1"/>
-                          <w:color w:val="ffffff"/>
+                          <w:rFonts w:ascii="Segoe UI" w:eastAsia="Segoe UI" w:hAnsi="Segoe UI" w:cs="Segoe UI"/>
+                          <w:b/>
+                          <w:color w:val="FFFFFF"/>
                           <w:sz w:val="24"/>
                         </w:rPr>
                         <w:t xml:space="preserve"> </w:t>
@@ -26433,88 +26380,73 @@
                   </w:txbxContent>
                 </v:textbox>
               </v:rect>
-              <v:rect id="Rectangle 43209" style="position:absolute;width:1463;height:1843;left:50822;top:819;" filled="f" stroked="f">
+              <v:rect id="Rectangle 43209" o:spid="_x0000_s1172" style="position:absolute;left:50822;top:819;width:1463;height:1844;visibility:visible;mso-wrap-style:square;v-text-anchor:top" o:gfxdata="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" filled="f" stroked="f">
                 <v:textbox inset="0,0,0,0">
                   <w:txbxContent>
                     <w:p>
-                      <w:pPr>
-                        <w:spacing w:before="0" w:after="160" w:line="259" w:lineRule="auto"/>
-                      </w:pPr>
                       <w:r>
                         <w:rPr>
-                          <w:rFonts w:cs="Times New Roman" w:hAnsi="Times New Roman" w:eastAsia="Times New Roman" w:ascii="Times New Roman"/>
+                          <w:rFonts w:ascii="Times New Roman" w:eastAsia="Times New Roman" w:hAnsi="Times New Roman" w:cs="Times New Roman"/>
                           <w:sz w:val="24"/>
                         </w:rPr>
-                        <w:t xml:space="preserve">Đ</w:t>
+                        <w:t>Đ</w:t>
                       </w:r>
                     </w:p>
                   </w:txbxContent>
                 </v:textbox>
               </v:rect>
-              <v:rect id="Rectangle 43210" style="position:absolute;width:899;height:1843;left:51933;top:819;" filled="f" stroked="f">
+              <v:rect id="Rectangle 43210" o:spid="_x0000_s1173" style="position:absolute;left:51933;top:819;width:900;height:1844;visibility:visible;mso-wrap-style:square;v-text-anchor:top" o:gfxdata="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" filled="f" stroked="f">
                 <v:textbox inset="0,0,0,0">
                   <w:txbxContent>
                     <w:p>
-                      <w:pPr>
-                        <w:spacing w:before="0" w:after="160" w:line="259" w:lineRule="auto"/>
-                      </w:pPr>
                       <w:r>
                         <w:rPr>
-                          <w:rFonts w:cs="Times New Roman" w:hAnsi="Times New Roman" w:eastAsia="Times New Roman" w:ascii="Times New Roman"/>
+                          <w:rFonts w:ascii="Times New Roman" w:eastAsia="Times New Roman" w:hAnsi="Times New Roman" w:cs="Times New Roman"/>
                           <w:sz w:val="24"/>
                         </w:rPr>
-                        <w:t xml:space="preserve">ặ</w:t>
+                        <w:t>ặ</w:t>
                       </w:r>
                     </w:p>
                   </w:txbxContent>
                 </v:textbox>
               </v:rect>
-              <v:rect id="Rectangle 43211" style="position:absolute;width:1955;height:1843;left:52600;top:819;" filled="f" stroked="f">
+              <v:rect id="Rectangle 43211" o:spid="_x0000_s1174" style="position:absolute;left:52600;top:819;width:1956;height:1844;visibility:visible;mso-wrap-style:square;v-text-anchor:top" o:gfxdata="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" filled="f" stroked="f">
                 <v:textbox inset="0,0,0,0">
                   <w:txbxContent>
                     <w:p>
-                      <w:pPr>
-                        <w:spacing w:before="0" w:after="160" w:line="259" w:lineRule="auto"/>
-                      </w:pPr>
                       <w:r>
                         <w:rPr>
-                          <w:rFonts w:cs="Times New Roman" w:hAnsi="Times New Roman" w:eastAsia="Times New Roman" w:ascii="Times New Roman"/>
+                          <w:rFonts w:ascii="Times New Roman" w:eastAsia="Times New Roman" w:hAnsi="Times New Roman" w:cs="Times New Roman"/>
                           <w:sz w:val="24"/>
                         </w:rPr>
-                        <w:t xml:space="preserve">c t</w:t>
+                        <w:t>c t</w:t>
                       </w:r>
                     </w:p>
                   </w:txbxContent>
                 </v:textbox>
               </v:rect>
-              <v:rect id="Rectangle 43212" style="position:absolute;width:899;height:1843;left:54060;top:819;" filled="f" stroked="f">
+              <v:rect id="Rectangle 43212" o:spid="_x0000_s1175" style="position:absolute;left:54060;top:819;width:900;height:1844;visibility:visible;mso-wrap-style:square;v-text-anchor:top" o:gfxdata="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" filled="f" stroked="f">
                 <v:textbox inset="0,0,0,0">
                   <w:txbxContent>
                     <w:p>
-                      <w:pPr>
-                        <w:spacing w:before="0" w:after="160" w:line="259" w:lineRule="auto"/>
-                      </w:pPr>
                       <w:r>
                         <w:rPr>
-                          <w:rFonts w:cs="Times New Roman" w:hAnsi="Times New Roman" w:eastAsia="Times New Roman" w:ascii="Times New Roman"/>
+                          <w:rFonts w:ascii="Times New Roman" w:eastAsia="Times New Roman" w:hAnsi="Times New Roman" w:cs="Times New Roman"/>
                           <w:sz w:val="24"/>
                         </w:rPr>
-                        <w:t xml:space="preserve">ả</w:t>
+                        <w:t>ả</w:t>
                       </w:r>
                     </w:p>
                   </w:txbxContent>
                 </v:textbox>
               </v:rect>
-              <v:rect id="Rectangle 43213" style="position:absolute;width:506;height:1843;left:54727;top:819;" filled="f" stroked="f">
+              <v:rect id="Rectangle 43213" o:spid="_x0000_s1176" style="position:absolute;left:54727;top:819;width:507;height:1844;visibility:visible;mso-wrap-style:square;v-text-anchor:top" o:gfxdata="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" filled="f" stroked="f">
                 <v:textbox inset="0,0,0,0">
                   <w:txbxContent>
                     <w:p>
-                      <w:pPr>
-                        <w:spacing w:before="0" w:after="160" w:line="259" w:lineRule="auto"/>
-                      </w:pPr>
                       <w:r>
                         <w:rPr>
-                          <w:rFonts w:cs="Times New Roman" w:hAnsi="Times New Roman" w:eastAsia="Times New Roman" w:ascii="Times New Roman"/>
+                          <w:rFonts w:ascii="Times New Roman" w:eastAsia="Times New Roman" w:hAnsi="Times New Roman" w:cs="Times New Roman"/>
                           <w:sz w:val="24"/>
                         </w:rPr>
                         <w:t xml:space="preserve"> </w:t>
@@ -26523,52 +26455,43 @@
                   </w:txbxContent>
                 </v:textbox>
               </v:rect>
-              <v:rect id="Rectangle 43214" style="position:absolute;width:1013;height:1843;left:55108;top:819;" filled="f" stroked="f">
+              <v:rect id="Rectangle 43214" o:spid="_x0000_s1177" style="position:absolute;left:55108;top:819;width:1013;height:1844;visibility:visible;mso-wrap-style:square;v-text-anchor:top" o:gfxdata="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" filled="f" stroked="f">
                 <v:textbox inset="0,0,0,0">
                   <w:txbxContent>
                     <w:p>
-                      <w:pPr>
-                        <w:spacing w:before="0" w:after="160" w:line="259" w:lineRule="auto"/>
-                      </w:pPr>
                       <w:r>
                         <w:rPr>
-                          <w:rFonts w:cs="Times New Roman" w:hAnsi="Times New Roman" w:eastAsia="Times New Roman" w:ascii="Times New Roman"/>
+                          <w:rFonts w:ascii="Times New Roman" w:eastAsia="Times New Roman" w:hAnsi="Times New Roman" w:cs="Times New Roman"/>
                           <w:sz w:val="24"/>
                         </w:rPr>
-                        <w:t xml:space="preserve">đ</w:t>
+                        <w:t>đ</w:t>
                       </w:r>
                     </w:p>
                   </w:txbxContent>
                 </v:textbox>
               </v:rect>
-              <v:rect id="Rectangle 43215" style="position:absolute;width:1013;height:1843;left:55870;top:819;" filled="f" stroked="f">
+              <v:rect id="Rectangle 43215" o:spid="_x0000_s1178" style="position:absolute;left:55870;top:819;width:1013;height:1844;visibility:visible;mso-wrap-style:square;v-text-anchor:top" o:gfxdata="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" filled="f" stroked="f">
                 <v:textbox inset="0,0,0,0">
                   <w:txbxContent>
                     <w:p>
-                      <w:pPr>
-                        <w:spacing w:before="0" w:after="160" w:line="259" w:lineRule="auto"/>
-                      </w:pPr>
                       <w:r>
                         <w:rPr>
-                          <w:rFonts w:cs="Times New Roman" w:hAnsi="Times New Roman" w:eastAsia="Times New Roman" w:ascii="Times New Roman"/>
+                          <w:rFonts w:ascii="Times New Roman" w:eastAsia="Times New Roman" w:hAnsi="Times New Roman" w:cs="Times New Roman"/>
                           <w:sz w:val="24"/>
                         </w:rPr>
-                        <w:t xml:space="preserve">ồ</w:t>
+                        <w:t>ồ</w:t>
                       </w:r>
                     </w:p>
                   </w:txbxContent>
                 </v:textbox>
               </v:rect>
-              <v:rect id="Rectangle 43216" style="position:absolute;width:506;height:1843;left:56632;top:819;" filled="f" stroked="f">
+              <v:rect id="Rectangle 43216" o:spid="_x0000_s1179" style="position:absolute;left:56632;top:819;width:507;height:1844;visibility:visible;mso-wrap-style:square;v-text-anchor:top" o:gfxdata="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" filled="f" stroked="f">
                 <v:textbox inset="0,0,0,0">
                   <w:txbxContent>
                     <w:p>
-                      <w:pPr>
-                        <w:spacing w:before="0" w:after="160" w:line="259" w:lineRule="auto"/>
-                      </w:pPr>
                       <w:r>
                         <w:rPr>
-                          <w:rFonts w:cs="Times New Roman" w:hAnsi="Times New Roman" w:eastAsia="Times New Roman" w:ascii="Times New Roman"/>
+                          <w:rFonts w:ascii="Times New Roman" w:eastAsia="Times New Roman" w:hAnsi="Times New Roman" w:cs="Times New Roman"/>
                           <w:sz w:val="24"/>
                         </w:rPr>
                         <w:t xml:space="preserve"> </w:t>
@@ -26577,88 +26500,73 @@
                   </w:txbxContent>
                 </v:textbox>
               </v:rect>
-              <v:rect id="Rectangle 43217" style="position:absolute;width:4345;height:1843;left:57013;top:819;" filled="f" stroked="f">
+              <v:rect id="Rectangle 43217" o:spid="_x0000_s1180" style="position:absolute;left:57013;top:819;width:4346;height:1844;visibility:visible;mso-wrap-style:square;v-text-anchor:top" o:gfxdata="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" filled="f" stroked="f">
                 <v:textbox inset="0,0,0,0">
                   <w:txbxContent>
                     <w:p>
-                      <w:pPr>
-                        <w:spacing w:before="0" w:after="160" w:line="259" w:lineRule="auto"/>
-                      </w:pPr>
                       <w:r>
                         <w:rPr>
-                          <w:rFonts w:cs="Times New Roman" w:hAnsi="Times New Roman" w:eastAsia="Times New Roman" w:ascii="Times New Roman"/>
+                          <w:rFonts w:ascii="Times New Roman" w:eastAsia="Times New Roman" w:hAnsi="Times New Roman" w:cs="Times New Roman"/>
                           <w:sz w:val="24"/>
                         </w:rPr>
-                        <w:t xml:space="preserve">án cu</w:t>
+                        <w:t>án cu</w:t>
                       </w:r>
                     </w:p>
                   </w:txbxContent>
                 </v:textbox>
               </v:rect>
-              <v:rect id="Rectangle 43218" style="position:absolute;width:1013;height:1843;left:60286;top:819;" filled="f" stroked="f">
+              <v:rect id="Rectangle 43218" o:spid="_x0000_s1181" style="position:absolute;left:60286;top:819;width:1013;height:1844;visibility:visible;mso-wrap-style:square;v-text-anchor:top" o:gfxdata="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" filled="f" stroked="f">
                 <v:textbox inset="0,0,0,0">
                   <w:txbxContent>
                     <w:p>
-                      <w:pPr>
-                        <w:spacing w:before="0" w:after="160" w:line="259" w:lineRule="auto"/>
-                      </w:pPr>
                       <w:r>
                         <w:rPr>
-                          <w:rFonts w:cs="Times New Roman" w:hAnsi="Times New Roman" w:eastAsia="Times New Roman" w:ascii="Times New Roman"/>
+                          <w:rFonts w:ascii="Times New Roman" w:eastAsia="Times New Roman" w:hAnsi="Times New Roman" w:cs="Times New Roman"/>
                           <w:sz w:val="24"/>
                         </w:rPr>
-                        <w:t xml:space="preserve">ố</w:t>
+                        <w:t>ố</w:t>
                       </w:r>
                     </w:p>
                   </w:txbxContent>
                 </v:textbox>
               </v:rect>
-              <v:rect id="Rectangle 43219" style="position:absolute;width:2069;height:1843;left:61048;top:819;" filled="f" stroked="f">
+              <v:rect id="Rectangle 43219" o:spid="_x0000_s1182" style="position:absolute;left:61048;top:819;width:2069;height:1844;visibility:visible;mso-wrap-style:square;v-text-anchor:top" o:gfxdata="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" filled="f" stroked="f">
                 <v:textbox inset="0,0,0,0">
                   <w:txbxContent>
                     <w:p>
-                      <w:pPr>
-                        <w:spacing w:before="0" w:after="160" w:line="259" w:lineRule="auto"/>
-                      </w:pPr>
                       <w:r>
                         <w:rPr>
-                          <w:rFonts w:cs="Times New Roman" w:hAnsi="Times New Roman" w:eastAsia="Times New Roman" w:ascii="Times New Roman"/>
+                          <w:rFonts w:ascii="Times New Roman" w:eastAsia="Times New Roman" w:hAnsi="Times New Roman" w:cs="Times New Roman"/>
                           <w:sz w:val="24"/>
                         </w:rPr>
-                        <w:t xml:space="preserve">i k</w:t>
+                        <w:t>i k</w:t>
                       </w:r>
                     </w:p>
                   </w:txbxContent>
                 </v:textbox>
               </v:rect>
-              <v:rect id="Rectangle 43220" style="position:absolute;width:1013;height:1843;left:62604;top:819;" filled="f" stroked="f">
+              <v:rect id="Rectangle 43220" o:spid="_x0000_s1183" style="position:absolute;left:62604;top:819;width:1013;height:1844;visibility:visible;mso-wrap-style:square;v-text-anchor:top" o:gfxdata="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" filled="f" stroked="f">
                 <v:textbox inset="0,0,0,0">
                   <w:txbxContent>
                     <w:p>
-                      <w:pPr>
-                        <w:spacing w:before="0" w:after="160" w:line="259" w:lineRule="auto"/>
-                      </w:pPr>
                       <w:r>
                         <w:rPr>
-                          <w:rFonts w:cs="Times New Roman" w:hAnsi="Times New Roman" w:eastAsia="Times New Roman" w:ascii="Times New Roman"/>
+                          <w:rFonts w:ascii="Times New Roman" w:eastAsia="Times New Roman" w:hAnsi="Times New Roman" w:cs="Times New Roman"/>
                           <w:sz w:val="24"/>
                         </w:rPr>
-                        <w:t xml:space="preserve">ỳ</w:t>
+                        <w:t>ỳ</w:t>
                       </w:r>
                     </w:p>
                   </w:txbxContent>
                 </v:textbox>
               </v:rect>
-              <v:rect id="Rectangle 43221" style="position:absolute;width:506;height:1843;left:63399;top:819;" filled="f" stroked="f">
+              <v:rect id="Rectangle 43221" o:spid="_x0000_s1184" style="position:absolute;left:63399;top:819;width:506;height:1844;visibility:visible;mso-wrap-style:square;v-text-anchor:top" o:gfxdata="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" filled="f" stroked="f">
                 <v:textbox inset="0,0,0,0">
                   <w:txbxContent>
                     <w:p>
-                      <w:pPr>
-                        <w:spacing w:before="0" w:after="160" w:line="259" w:lineRule="auto"/>
-                      </w:pPr>
                       <w:r>
                         <w:rPr>
-                          <w:rFonts w:cs="Times New Roman" w:hAnsi="Times New Roman" w:eastAsia="Times New Roman" w:ascii="Times New Roman"/>
+                          <w:rFonts w:ascii="Times New Roman" w:eastAsia="Times New Roman" w:hAnsi="Times New Roman" w:cs="Times New Roman"/>
                           <w:sz w:val="24"/>
                         </w:rPr>
                         <w:t xml:space="preserve"> </w:t>
@@ -26667,27 +26575,27 @@
                   </w:txbxContent>
                 </v:textbox>
               </v:rect>
-              <v:shape id="Shape 44460" style="position:absolute;width:36497;height:447;left:95;top:0;" coordsize="3649726,44768" path="m0,0l3649726,0l3649726,44768l0,44768l0,0">
-                <v:stroke weight="0pt" endcap="flat" joinstyle="miter" miterlimit="10" on="false" color="#000000" opacity="0"/>
-                <v:fill on="true" color="#0070c0"/>
+              <v:shape id="Shape 44453" o:spid="_x0000_s1185" style="position:absolute;left:95;width:36497;height:447;visibility:visible;mso-wrap-style:square;v-text-anchor:top" coordsize="3649726,44768" o:gfxdata="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" path="m,l3649726,r,44768l,44768,,e" fillcolor="#0070c0" stroked="f" strokeweight="0">
+                <v:stroke miterlimit="83231f" joinstyle="miter"/>
+                <v:path arrowok="t" textboxrect="0,0,3649726,44768"/>
               </v:shape>
-              <v:shape id="Shape 44461" style="position:absolute;width:36497;height:444;left:95;top:2511;" coordsize="3649726,44450" path="m0,0l3649726,0l3649726,44450l0,44450l0,0">
-                <v:stroke weight="0pt" endcap="flat" joinstyle="miter" miterlimit="10" on="false" color="#000000" opacity="0"/>
-                <v:fill on="true" color="#0070c0"/>
+              <v:shape id="Shape 44454" o:spid="_x0000_s1186" style="position:absolute;left:95;top:2511;width:36497;height:444;visibility:visible;mso-wrap-style:square;v-text-anchor:top" coordsize="3649726,44450" o:gfxdata="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" path="m,l3649726,r,44450l,44450,,e" fillcolor="#0070c0" stroked="f" strokeweight="0">
+                <v:stroke miterlimit="83231f" joinstyle="miter"/>
+                <v:path arrowok="t" textboxrect="0,0,3649726,44450"/>
               </v:shape>
-              <v:shape id="Shape 44462" style="position:absolute;width:36592;height:91;left:0;top:2955;" coordsize="3659251,9144" path="m0,0l3659251,0l3659251,9144l0,9144l0,0">
-                <v:stroke weight="0pt" endcap="flat" joinstyle="miter" miterlimit="10" on="false" color="#000000" opacity="0"/>
-                <v:fill on="true" color="#0070c0"/>
+              <v:shape id="Shape 44455" o:spid="_x0000_s1187" style="position:absolute;top:2955;width:36592;height:92;visibility:visible;mso-wrap-style:square;v-text-anchor:top" coordsize="3659251,9144" o:gfxdata="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" path="m,l3659251,r,9144l,9144,,e" fillcolor="#0070c0" stroked="f" strokeweight="0">
+                <v:stroke miterlimit="83231f" joinstyle="miter"/>
+                <v:path arrowok="t" textboxrect="0,0,3659251,9144"/>
               </v:shape>
-              <v:shape id="Shape 44463" style="position:absolute;width:91;height:91;left:36496;top:2955;" coordsize="9144,9144" path="m0,0l9144,0l9144,9144l0,9144l0,0">
-                <v:stroke weight="0pt" endcap="flat" joinstyle="miter" miterlimit="10" on="false" color="#000000" opacity="0"/>
-                <v:fill on="true" color="#0070c0"/>
+              <v:shape id="Shape 44456" o:spid="_x0000_s1188" style="position:absolute;left:36496;top:2955;width:92;height:92;visibility:visible;mso-wrap-style:square;v-text-anchor:top" coordsize="9144,9144" o:gfxdata="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" path="m,l9144,r,9144l,9144,,e" fillcolor="#0070c0" stroked="f" strokeweight="0">
+                <v:stroke miterlimit="83231f" joinstyle="miter"/>
+                <v:path arrowok="t" textboxrect="0,0,9144,9144"/>
               </v:shape>
-              <v:shape id="Shape 44464" style="position:absolute;width:27569;height:91;left:36560;top:2955;" coordsize="2756916,9144" path="m0,0l2756916,0l2756916,9144l0,9144l0,0">
-                <v:stroke weight="0pt" endcap="flat" joinstyle="miter" miterlimit="10" on="false" color="#000000" opacity="0"/>
-                <v:fill on="true" color="#0070c0"/>
+              <v:shape id="Shape 44457" o:spid="_x0000_s1189" style="position:absolute;left:36560;top:2955;width:27569;height:92;visibility:visible;mso-wrap-style:square;v-text-anchor:top" coordsize="2756916,9144" o:gfxdata="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" path="m,l2756916,r,9144l,9144,,e" fillcolor="#0070c0" stroked="f" strokeweight="0">
+                <v:stroke miterlimit="83231f" joinstyle="miter"/>
+                <v:path arrowok="t" textboxrect="0,0,2756916,9144"/>
               </v:shape>
-              <w10:wrap type="square"/>
+              <w10:wrap type="square" anchorx="page" anchory="page"/>
             </v:group>
           </w:pict>
         </mc:Fallback>
@@ -26709,7 +26617,7 @@
       <mc:AlternateContent>
         <mc:Choice Requires="wpg">
           <w:drawing>
-            <wp:anchor distT="0" distB="0" distL="114300" distR="114300" simplePos="0" relativeHeight="251664384" behindDoc="1" locked="0" layoutInCell="1" allowOverlap="1">
+            <wp:anchor distT="0" distB="0" distL="114300" distR="114300" simplePos="0" relativeHeight="251664384" behindDoc="1" locked="0" layoutInCell="1" allowOverlap="1" wp14:anchorId="14E24ED4" wp14:editId="48F6D3E3">
               <wp:simplePos x="0" y="0"/>
               <wp:positionH relativeFrom="page">
                 <wp:posOffset>0</wp:posOffset>
@@ -26752,7 +26660,7 @@
 </file>
 
 <file path=word/header6.xml><?xml version="1.0" encoding="utf-8"?>
-<w:hdr xmlns:wpc="http://schemas.microsoft.com/office/word/2010/wordprocessingCanvas" xmlns:cx="http://schemas.microsoft.com/office/drawing/2014/chartex" xmlns:mc="http://schemas.openxmlformats.org/markup-compatibility/2006" xmlns:o="urn:schemas-microsoft-com:office:office" xmlns:r="http://schemas.openxmlformats.org/officeDocument/2006/relationships" xmlns:m="http://schemas.openxmlformats.org/officeDocument/2006/math" xmlns:v="urn:schemas-microsoft-com:vml" xmlns:wp14="http://schemas.microsoft.com/office/word/2010/wordprocessingDrawing" xmlns:wp="http://schemas.openxmlformats.org/drawingml/2006/wordprocessingDrawing" xmlns:w10="urn:schemas-microsoft-com:office:word" xmlns:w="http://schemas.openxmlformats.org/wordprocessingml/2006/main" xmlns:w14="http://schemas.microsoft.com/office/word/2010/wordml" xmlns:w15="http://schemas.microsoft.com/office/word/2012/wordml" xmlns:w16se="http://schemas.microsoft.com/office/word/2015/wordml/symex" xmlns:wpg="http://schemas.microsoft.com/office/word/2010/wordprocessingGroup" xmlns:wpi="http://schemas.microsoft.com/office/word/2010/wordprocessingInk" xmlns:wne="http://schemas.microsoft.com/office/word/2006/wordml" xmlns:wps="http://schemas.microsoft.com/office/word/2010/wordprocessingShape" mc:Ignorable="w14 w15 w16se wp14">
+<w:hdr xmlns:wpc="http://schemas.microsoft.com/office/word/2010/wordprocessingCanvas" xmlns:cx="http://schemas.microsoft.com/office/drawing/2014/chartex" xmlns:cx1="http://schemas.microsoft.com/office/drawing/2015/9/8/chartex" xmlns:cx2="http://schemas.microsoft.com/office/drawing/2015/10/21/chartex" xmlns:cx3="http://schemas.microsoft.com/office/drawing/2016/5/9/chartex" xmlns:cx4="http://schemas.microsoft.com/office/drawing/2016/5/10/chartex" xmlns:cx5="http://schemas.microsoft.com/office/drawing/2016/5/11/chartex" xmlns:cx6="http://schemas.microsoft.com/office/drawing/2016/5/12/chartex" xmlns:cx7="http://schemas.microsoft.com/office/drawing/2016/5/13/chartex" xmlns:cx8="http://schemas.microsoft.com/office/drawing/2016/5/14/chartex" xmlns:mc="http://schemas.openxmlformats.org/markup-compatibility/2006" xmlns:aink="http://schemas.microsoft.com/office/drawing/2016/ink" xmlns:am3d="http://schemas.microsoft.com/office/drawing/2017/model3d" xmlns:o="urn:schemas-microsoft-com:office:office" xmlns:oel="http://schemas.microsoft.com/office/2019/extlst" xmlns:r="http://schemas.openxmlformats.org/officeDocument/2006/relationships" xmlns:m="http://schemas.openxmlformats.org/officeDocument/2006/math" xmlns:v="urn:schemas-microsoft-com:vml" xmlns:wp14="http://schemas.microsoft.com/office/word/2010/wordprocessingDrawing" xmlns:wp="http://schemas.openxmlformats.org/drawingml/2006/wordprocessingDrawing" xmlns:w10="urn:schemas-microsoft-com:office:word" xmlns:w="http://schemas.openxmlformats.org/wordprocessingml/2006/main" xmlns:w14="http://schemas.microsoft.com/office/word/2010/wordml" xmlns:w15="http://schemas.microsoft.com/office/word/2012/wordml" xmlns:w16cex="http://schemas.microsoft.com/office/word/2018/wordml/cex" xmlns:w16cid="http://schemas.microsoft.com/office/word/2016/wordml/cid" xmlns:w16="http://schemas.microsoft.com/office/word/2018/wordml" xmlns:w16du="http://schemas.microsoft.com/office/word/2023/wordml/word16du" xmlns:w16sdtdh="http://schemas.microsoft.com/office/word/2020/wordml/sdtdatahash" xmlns:w16sdtfl="http://schemas.microsoft.com/office/word/2024/wordml/sdtformatlock" xmlns:w16se="http://schemas.microsoft.com/office/word/2015/wordml/symex" xmlns:wpg="http://schemas.microsoft.com/office/word/2010/wordprocessingGroup" xmlns:wpi="http://schemas.microsoft.com/office/word/2010/wordprocessingInk" xmlns:wne="http://schemas.microsoft.com/office/word/2006/wordml" xmlns:wps="http://schemas.microsoft.com/office/word/2010/wordprocessingShape" mc:Ignorable="w14 w15 w16se w16cid w16 w16cex w16sdtdh w16sdtfl w16du wp14">
   <w:p>
     <w:pPr>
       <w:spacing w:after="0"/>
@@ -26764,7 +26672,7 @@
       <mc:AlternateContent>
         <mc:Choice Requires="wpg">
           <w:drawing>
-            <wp:anchor distT="0" distB="0" distL="114300" distR="114300" simplePos="0" relativeHeight="251665408" behindDoc="0" locked="0" layoutInCell="1" allowOverlap="1">
+            <wp:anchor distT="0" distB="0" distL="114300" distR="114300" simplePos="0" relativeHeight="251665408" behindDoc="0" locked="0" layoutInCell="1" allowOverlap="1" wp14:anchorId="5DE478EA" wp14:editId="20FF9DAC">
               <wp:simplePos x="0" y="0"/>
               <wp:positionH relativeFrom="page">
                 <wp:posOffset>676593</wp:posOffset>
@@ -27827,149 +27735,128 @@
             </wp:anchor>
           </w:drawing>
         </mc:Choice>
-        <mc:Fallback xmlns:a="http://schemas.openxmlformats.org/drawingml/2006/main">
+        <mc:Fallback>
           <w:pict>
-            <v:group id="Group 43139" style="width:504.955pt;height:23.775pt;position:absolute;mso-position-horizontal-relative:page;mso-position-horizontal:absolute;margin-left:53.275pt;mso-position-vertical-relative:page;margin-top:36.005pt;" coordsize="64129,3019">
-              <v:shape id="Shape 44444" style="position:absolute;width:36497;height:2924;left:95;top:0;" coordsize="3649726,292418" path="m0,0l3649726,0l3649726,292418l0,292418l0,0">
-                <v:stroke weight="0pt" endcap="flat" joinstyle="miter" miterlimit="10" on="false" color="#000000" opacity="0"/>
-                <v:fill on="true" color="#0070c0"/>
+            <v:group w14:anchorId="5DE478EA" id="Group 43139" o:spid="_x0000_s1226" style="position:absolute;margin-left:53.3pt;margin-top:36pt;width:504.95pt;height:23.8pt;z-index:251665408;mso-position-horizontal-relative:page;mso-position-vertical-relative:page" coordsize="64129,3019" o:gfxdata="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">
+              <v:shape id="Shape 44437" o:spid="_x0000_s1227" style="position:absolute;left:95;width:36497;height:2924;visibility:visible;mso-wrap-style:square;v-text-anchor:top" coordsize="3649726,292418" o:gfxdata="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" path="m,l3649726,r,292418l,292418,,e" fillcolor="#0070c0" stroked="f" strokeweight="0">
+                <v:stroke miterlimit="83231f" joinstyle="miter"/>
+                <v:path arrowok="t" textboxrect="0,0,3649726,292418"/>
               </v:shape>
-              <v:shape id="Shape 44445" style="position:absolute;width:35036;height:2032;left:825;top:447;" coordsize="3503676,203200" path="m0,0l3503676,0l3503676,203200l0,203200l0,0">
-                <v:stroke weight="0pt" endcap="flat" joinstyle="miter" miterlimit="10" on="false" color="#000000" opacity="0"/>
-                <v:fill on="true" color="#0070c0"/>
+              <v:shape id="Shape 44438" o:spid="_x0000_s1228" style="position:absolute;left:825;top:447;width:35037;height:2032;visibility:visible;mso-wrap-style:square;v-text-anchor:top" coordsize="3503676,203200" o:gfxdata="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" path="m,l3503676,r,203200l,203200,,e" fillcolor="#0070c0" stroked="f" strokeweight="0">
+                <v:stroke miterlimit="83231f" joinstyle="miter"/>
+                <v:path arrowok="t" textboxrect="0,0,3503676,203200"/>
               </v:shape>
-              <v:rect id="Rectangle 43160" style="position:absolute;width:9919;height:1984;left:825;top:989;" filled="f" stroked="f">
+              <v:rect id="Rectangle 43160" o:spid="_x0000_s1229" style="position:absolute;left:825;top:989;width:9920;height:1984;visibility:visible;mso-wrap-style:square;v-text-anchor:top" o:gfxdata="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" filled="f" stroked="f">
                 <v:textbox inset="0,0,0,0">
                   <w:txbxContent>
                     <w:p>
-                      <w:pPr>
-                        <w:spacing w:before="0" w:after="160" w:line="259" w:lineRule="auto"/>
-                      </w:pPr>
                       <w:r>
                         <w:rPr>
-                          <w:rFonts w:cs="Segoe UI" w:hAnsi="Segoe UI" w:eastAsia="Segoe UI" w:ascii="Segoe UI"/>
-                          <w:b w:val="1"/>
-                          <w:color w:val="ffffff"/>
+                          <w:rFonts w:ascii="Segoe UI" w:eastAsia="Segoe UI" w:hAnsi="Segoe UI" w:cs="Segoe UI"/>
+                          <w:b/>
+                          <w:color w:val="FFFFFF"/>
                           <w:sz w:val="24"/>
                         </w:rPr>
-                        <w:t xml:space="preserve">Thương m</w:t>
+                        <w:t>Thương m</w:t>
                       </w:r>
                     </w:p>
                   </w:txbxContent>
                 </v:textbox>
               </v:rect>
-              <v:rect id="Rectangle 43161" style="position:absolute;width:1090;height:1984;left:8289;top:989;" filled="f" stroked="f">
+              <v:rect id="Rectangle 43161" o:spid="_x0000_s1230" style="position:absolute;left:8289;top:989;width:1091;height:1984;visibility:visible;mso-wrap-style:square;v-text-anchor:top" o:gfxdata="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" filled="f" stroked="f">
                 <v:textbox inset="0,0,0,0">
                   <w:txbxContent>
                     <w:p>
-                      <w:pPr>
-                        <w:spacing w:before="0" w:after="160" w:line="259" w:lineRule="auto"/>
-                      </w:pPr>
                       <w:r>
                         <w:rPr>
-                          <w:rFonts w:cs="Segoe UI" w:hAnsi="Segoe UI" w:eastAsia="Segoe UI" w:ascii="Segoe UI"/>
-                          <w:b w:val="1"/>
-                          <w:color w:val="ffffff"/>
+                          <w:rFonts w:ascii="Segoe UI" w:eastAsia="Segoe UI" w:hAnsi="Segoe UI" w:cs="Segoe UI"/>
+                          <w:b/>
+                          <w:color w:val="FFFFFF"/>
                           <w:sz w:val="24"/>
                         </w:rPr>
-                        <w:t xml:space="preserve">ạ</w:t>
+                        <w:t>ạ</w:t>
                       </w:r>
                     </w:p>
                   </w:txbxContent>
                 </v:textbox>
               </v:rect>
-              <v:rect id="Rectangle 43162" style="position:absolute;width:3192;height:1984;left:9115;top:989;" filled="f" stroked="f">
+              <v:rect id="Rectangle 43162" o:spid="_x0000_s1231" style="position:absolute;left:9115;top:989;width:3192;height:1984;visibility:visible;mso-wrap-style:square;v-text-anchor:top" o:gfxdata="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" filled="f" stroked="f">
                 <v:textbox inset="0,0,0,0">
                   <w:txbxContent>
                     <w:p>
-                      <w:pPr>
-                        <w:spacing w:before="0" w:after="160" w:line="259" w:lineRule="auto"/>
-                      </w:pPr>
                       <w:r>
                         <w:rPr>
-                          <w:rFonts w:cs="Segoe UI" w:hAnsi="Segoe UI" w:eastAsia="Segoe UI" w:ascii="Segoe UI"/>
-                          <w:b w:val="1"/>
-                          <w:color w:val="ffffff"/>
+                          <w:rFonts w:ascii="Segoe UI" w:eastAsia="Segoe UI" w:hAnsi="Segoe UI" w:cs="Segoe UI"/>
+                          <w:b/>
+                          <w:color w:val="FFFFFF"/>
                           <w:sz w:val="24"/>
                         </w:rPr>
-                        <w:t xml:space="preserve">i Đi</w:t>
+                        <w:t>i Đi</w:t>
                       </w:r>
                     </w:p>
                   </w:txbxContent>
                 </v:textbox>
               </v:rect>
-              <v:rect id="Rectangle 43163" style="position:absolute;width:1096;height:1984;left:11528;top:989;" filled="f" stroked="f">
+              <v:rect id="Rectangle 43163" o:spid="_x0000_s1232" style="position:absolute;left:11528;top:989;width:1096;height:1984;visibility:visible;mso-wrap-style:square;v-text-anchor:top" o:gfxdata="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" filled="f" stroked="f">
                 <v:textbox inset="0,0,0,0">
                   <w:txbxContent>
                     <w:p>
-                      <w:pPr>
-                        <w:spacing w:before="0" w:after="160" w:line="259" w:lineRule="auto"/>
-                      </w:pPr>
                       <w:r>
                         <w:rPr>
-                          <w:rFonts w:cs="Segoe UI" w:hAnsi="Segoe UI" w:eastAsia="Segoe UI" w:ascii="Segoe UI"/>
-                          <w:b w:val="1"/>
-                          <w:color w:val="ffffff"/>
+                          <w:rFonts w:ascii="Segoe UI" w:eastAsia="Segoe UI" w:hAnsi="Segoe UI" w:cs="Segoe UI"/>
+                          <w:b/>
+                          <w:color w:val="FFFFFF"/>
                           <w:sz w:val="24"/>
                         </w:rPr>
-                        <w:t xml:space="preserve">ệ</w:t>
+                        <w:t>ệ</w:t>
                       </w:r>
                     </w:p>
                   </w:txbxContent>
                 </v:textbox>
               </v:rect>
-              <v:rect id="Rectangle 43164" style="position:absolute;width:2562;height:1984;left:12357;top:989;" filled="f" stroked="f">
+              <v:rect id="Rectangle 43164" o:spid="_x0000_s1233" style="position:absolute;left:12357;top:989;width:2562;height:1984;visibility:visible;mso-wrap-style:square;v-text-anchor:top" o:gfxdata="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" filled="f" stroked="f">
                 <v:textbox inset="0,0,0,0">
                   <w:txbxContent>
                     <w:p>
-                      <w:pPr>
-                        <w:spacing w:before="0" w:after="160" w:line="259" w:lineRule="auto"/>
-                      </w:pPr>
                       <w:r>
                         <w:rPr>
-                          <w:rFonts w:cs="Segoe UI" w:hAnsi="Segoe UI" w:eastAsia="Segoe UI" w:ascii="Segoe UI"/>
-                          <w:b w:val="1"/>
-                          <w:color w:val="ffffff"/>
+                          <w:rFonts w:ascii="Segoe UI" w:eastAsia="Segoe UI" w:hAnsi="Segoe UI" w:cs="Segoe UI"/>
+                          <w:b/>
+                          <w:color w:val="FFFFFF"/>
                           <w:sz w:val="24"/>
                         </w:rPr>
-                        <w:t xml:space="preserve">n t</w:t>
+                        <w:t>n t</w:t>
                       </w:r>
                     </w:p>
                   </w:txbxContent>
                 </v:textbox>
               </v:rect>
-              <v:rect id="Rectangle 43165" style="position:absolute;width:1353;height:1984;left:14294;top:989;" filled="f" stroked="f">
+              <v:rect id="Rectangle 43165" o:spid="_x0000_s1234" style="position:absolute;left:14294;top:989;width:1354;height:1984;visibility:visible;mso-wrap-style:square;v-text-anchor:top" o:gfxdata="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" filled="f" stroked="f">
                 <v:textbox inset="0,0,0,0">
                   <w:txbxContent>
                     <w:p>
-                      <w:pPr>
-                        <w:spacing w:before="0" w:after="160" w:line="259" w:lineRule="auto"/>
-                      </w:pPr>
                       <w:r>
                         <w:rPr>
-                          <w:rFonts w:cs="Segoe UI" w:hAnsi="Segoe UI" w:eastAsia="Segoe UI" w:ascii="Segoe UI"/>
-                          <w:b w:val="1"/>
-                          <w:color w:val="ffffff"/>
+                          <w:rFonts w:ascii="Segoe UI" w:eastAsia="Segoe UI" w:hAnsi="Segoe UI" w:cs="Segoe UI"/>
+                          <w:b/>
+                          <w:color w:val="FFFFFF"/>
                           <w:sz w:val="24"/>
                         </w:rPr>
-                        <w:t xml:space="preserve">ử</w:t>
+                        <w:t>ử</w:t>
                       </w:r>
                     </w:p>
                   </w:txbxContent>
                 </v:textbox>
               </v:rect>
-              <v:rect id="Rectangle 43166" style="position:absolute;width:559;height:1984;left:15310;top:989;" filled="f" stroked="f">
+              <v:rect id="Rectangle 43166" o:spid="_x0000_s1235" style="position:absolute;left:15310;top:989;width:559;height:1984;visibility:visible;mso-wrap-style:square;v-text-anchor:top" o:gfxdata="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" filled="f" stroked="f">
                 <v:textbox inset="0,0,0,0">
                   <w:txbxContent>
                     <w:p>
-                      <w:pPr>
-                        <w:spacing w:before="0" w:after="160" w:line="259" w:lineRule="auto"/>
-                      </w:pPr>
                       <w:r>
                         <w:rPr>
-                          <w:rFonts w:cs="Segoe UI" w:hAnsi="Segoe UI" w:eastAsia="Segoe UI" w:ascii="Segoe UI"/>
-                          <w:b w:val="1"/>
-                          <w:color w:val="ffffff"/>
+                          <w:rFonts w:ascii="Segoe UI" w:eastAsia="Segoe UI" w:hAnsi="Segoe UI" w:cs="Segoe UI"/>
+                          <w:b/>
+                          <w:color w:val="FFFFFF"/>
                           <w:sz w:val="24"/>
                         </w:rPr>
                         <w:t xml:space="preserve"> </w:t>
@@ -27978,88 +27865,73 @@
                   </w:txbxContent>
                 </v:textbox>
               </v:rect>
-              <v:rect id="Rectangle 43147" style="position:absolute;width:1463;height:1843;left:50822;top:819;" filled="f" stroked="f">
+              <v:rect id="Rectangle 43147" o:spid="_x0000_s1236" style="position:absolute;left:50822;top:819;width:1463;height:1844;visibility:visible;mso-wrap-style:square;v-text-anchor:top" o:gfxdata="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" filled="f" stroked="f">
                 <v:textbox inset="0,0,0,0">
                   <w:txbxContent>
                     <w:p>
-                      <w:pPr>
-                        <w:spacing w:before="0" w:after="160" w:line="259" w:lineRule="auto"/>
-                      </w:pPr>
                       <w:r>
                         <w:rPr>
-                          <w:rFonts w:cs="Times New Roman" w:hAnsi="Times New Roman" w:eastAsia="Times New Roman" w:ascii="Times New Roman"/>
+                          <w:rFonts w:ascii="Times New Roman" w:eastAsia="Times New Roman" w:hAnsi="Times New Roman" w:cs="Times New Roman"/>
                           <w:sz w:val="24"/>
                         </w:rPr>
-                        <w:t xml:space="preserve">Đ</w:t>
+                        <w:t>Đ</w:t>
                       </w:r>
                     </w:p>
                   </w:txbxContent>
                 </v:textbox>
               </v:rect>
-              <v:rect id="Rectangle 43148" style="position:absolute;width:899;height:1843;left:51933;top:819;" filled="f" stroked="f">
+              <v:rect id="Rectangle 43148" o:spid="_x0000_s1237" style="position:absolute;left:51933;top:819;width:900;height:1844;visibility:visible;mso-wrap-style:square;v-text-anchor:top" o:gfxdata="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" filled="f" stroked="f">
                 <v:textbox inset="0,0,0,0">
                   <w:txbxContent>
                     <w:p>
-                      <w:pPr>
-                        <w:spacing w:before="0" w:after="160" w:line="259" w:lineRule="auto"/>
-                      </w:pPr>
                       <w:r>
                         <w:rPr>
-                          <w:rFonts w:cs="Times New Roman" w:hAnsi="Times New Roman" w:eastAsia="Times New Roman" w:ascii="Times New Roman"/>
+                          <w:rFonts w:ascii="Times New Roman" w:eastAsia="Times New Roman" w:hAnsi="Times New Roman" w:cs="Times New Roman"/>
                           <w:sz w:val="24"/>
                         </w:rPr>
-                        <w:t xml:space="preserve">ặ</w:t>
+                        <w:t>ặ</w:t>
                       </w:r>
                     </w:p>
                   </w:txbxContent>
                 </v:textbox>
               </v:rect>
-              <v:rect id="Rectangle 43149" style="position:absolute;width:1955;height:1843;left:52600;top:819;" filled="f" stroked="f">
+              <v:rect id="Rectangle 43149" o:spid="_x0000_s1238" style="position:absolute;left:52600;top:819;width:1956;height:1844;visibility:visible;mso-wrap-style:square;v-text-anchor:top" o:gfxdata="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" filled="f" stroked="f">
                 <v:textbox inset="0,0,0,0">
                   <w:txbxContent>
                     <w:p>
-                      <w:pPr>
-                        <w:spacing w:before="0" w:after="160" w:line="259" w:lineRule="auto"/>
-                      </w:pPr>
                       <w:r>
                         <w:rPr>
-                          <w:rFonts w:cs="Times New Roman" w:hAnsi="Times New Roman" w:eastAsia="Times New Roman" w:ascii="Times New Roman"/>
+                          <w:rFonts w:ascii="Times New Roman" w:eastAsia="Times New Roman" w:hAnsi="Times New Roman" w:cs="Times New Roman"/>
                           <w:sz w:val="24"/>
                         </w:rPr>
-                        <w:t xml:space="preserve">c t</w:t>
+                        <w:t>c t</w:t>
                       </w:r>
                     </w:p>
                   </w:txbxContent>
                 </v:textbox>
               </v:rect>
-              <v:rect id="Rectangle 43150" style="position:absolute;width:899;height:1843;left:54060;top:819;" filled="f" stroked="f">
+              <v:rect id="Rectangle 43150" o:spid="_x0000_s1239" style="position:absolute;left:54060;top:819;width:900;height:1844;visibility:visible;mso-wrap-style:square;v-text-anchor:top" o:gfxdata="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" filled="f" stroked="f">
                 <v:textbox inset="0,0,0,0">
                   <w:txbxContent>
                     <w:p>
-                      <w:pPr>
-                        <w:spacing w:before="0" w:after="160" w:line="259" w:lineRule="auto"/>
-                      </w:pPr>
                       <w:r>
                         <w:rPr>
-                          <w:rFonts w:cs="Times New Roman" w:hAnsi="Times New Roman" w:eastAsia="Times New Roman" w:ascii="Times New Roman"/>
+                          <w:rFonts w:ascii="Times New Roman" w:eastAsia="Times New Roman" w:hAnsi="Times New Roman" w:cs="Times New Roman"/>
                           <w:sz w:val="24"/>
                         </w:rPr>
-                        <w:t xml:space="preserve">ả</w:t>
+                        <w:t>ả</w:t>
                       </w:r>
                     </w:p>
                   </w:txbxContent>
                 </v:textbox>
               </v:rect>
-              <v:rect id="Rectangle 43151" style="position:absolute;width:506;height:1843;left:54727;top:819;" filled="f" stroked="f">
+              <v:rect id="Rectangle 43151" o:spid="_x0000_s1240" style="position:absolute;left:54727;top:819;width:507;height:1844;visibility:visible;mso-wrap-style:square;v-text-anchor:top" o:gfxdata="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" filled="f" stroked="f">
                 <v:textbox inset="0,0,0,0">
                   <w:txbxContent>
                     <w:p>
-                      <w:pPr>
-                        <w:spacing w:before="0" w:after="160" w:line="259" w:lineRule="auto"/>
-                      </w:pPr>
                       <w:r>
                         <w:rPr>
-                          <w:rFonts w:cs="Times New Roman" w:hAnsi="Times New Roman" w:eastAsia="Times New Roman" w:ascii="Times New Roman"/>
+                          <w:rFonts w:ascii="Times New Roman" w:eastAsia="Times New Roman" w:hAnsi="Times New Roman" w:cs="Times New Roman"/>
                           <w:sz w:val="24"/>
                         </w:rPr>
                         <w:t xml:space="preserve"> </w:t>
@@ -28068,52 +27940,43 @@
                   </w:txbxContent>
                 </v:textbox>
               </v:rect>
-              <v:rect id="Rectangle 43152" style="position:absolute;width:1013;height:1843;left:55108;top:819;" filled="f" stroked="f">
+              <v:rect id="Rectangle 43152" o:spid="_x0000_s1241" style="position:absolute;left:55108;top:819;width:1013;height:1844;visibility:visible;mso-wrap-style:square;v-text-anchor:top" o:gfxdata="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" filled="f" stroked="f">
                 <v:textbox inset="0,0,0,0">
                   <w:txbxContent>
                     <w:p>
-                      <w:pPr>
-                        <w:spacing w:before="0" w:after="160" w:line="259" w:lineRule="auto"/>
-                      </w:pPr>
                       <w:r>
                         <w:rPr>
-                          <w:rFonts w:cs="Times New Roman" w:hAnsi="Times New Roman" w:eastAsia="Times New Roman" w:ascii="Times New Roman"/>
+                          <w:rFonts w:ascii="Times New Roman" w:eastAsia="Times New Roman" w:hAnsi="Times New Roman" w:cs="Times New Roman"/>
                           <w:sz w:val="24"/>
                         </w:rPr>
-                        <w:t xml:space="preserve">đ</w:t>
+                        <w:t>đ</w:t>
                       </w:r>
                     </w:p>
                   </w:txbxContent>
                 </v:textbox>
               </v:rect>
-              <v:rect id="Rectangle 43153" style="position:absolute;width:1013;height:1843;left:55870;top:819;" filled="f" stroked="f">
+              <v:rect id="Rectangle 43153" o:spid="_x0000_s1242" style="position:absolute;left:55870;top:819;width:1013;height:1844;visibility:visible;mso-wrap-style:square;v-text-anchor:top" o:gfxdata="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" filled="f" stroked="f">
                 <v:textbox inset="0,0,0,0">
                   <w:txbxContent>
                     <w:p>
-                      <w:pPr>
-                        <w:spacing w:before="0" w:after="160" w:line="259" w:lineRule="auto"/>
-                      </w:pPr>
                       <w:r>
                         <w:rPr>
-                          <w:rFonts w:cs="Times New Roman" w:hAnsi="Times New Roman" w:eastAsia="Times New Roman" w:ascii="Times New Roman"/>
+                          <w:rFonts w:ascii="Times New Roman" w:eastAsia="Times New Roman" w:hAnsi="Times New Roman" w:cs="Times New Roman"/>
                           <w:sz w:val="24"/>
                         </w:rPr>
-                        <w:t xml:space="preserve">ồ</w:t>
+                        <w:t>ồ</w:t>
                       </w:r>
                     </w:p>
                   </w:txbxContent>
                 </v:textbox>
               </v:rect>
-              <v:rect id="Rectangle 43154" style="position:absolute;width:506;height:1843;left:56632;top:819;" filled="f" stroked="f">
+              <v:rect id="Rectangle 43154" o:spid="_x0000_s1243" style="position:absolute;left:56632;top:819;width:507;height:1844;visibility:visible;mso-wrap-style:square;v-text-anchor:top" o:gfxdata="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" filled="f" stroked="f">
                 <v:textbox inset="0,0,0,0">
                   <w:txbxContent>
                     <w:p>
-                      <w:pPr>
-                        <w:spacing w:before="0" w:after="160" w:line="259" w:lineRule="auto"/>
-                      </w:pPr>
                       <w:r>
                         <w:rPr>
-                          <w:rFonts w:cs="Times New Roman" w:hAnsi="Times New Roman" w:eastAsia="Times New Roman" w:ascii="Times New Roman"/>
+                          <w:rFonts w:ascii="Times New Roman" w:eastAsia="Times New Roman" w:hAnsi="Times New Roman" w:cs="Times New Roman"/>
                           <w:sz w:val="24"/>
                         </w:rPr>
                         <w:t xml:space="preserve"> </w:t>
@@ -28122,88 +27985,73 @@
                   </w:txbxContent>
                 </v:textbox>
               </v:rect>
-              <v:rect id="Rectangle 43155" style="position:absolute;width:4345;height:1843;left:57013;top:819;" filled="f" stroked="f">
+              <v:rect id="Rectangle 43155" o:spid="_x0000_s1244" style="position:absolute;left:57013;top:819;width:4346;height:1844;visibility:visible;mso-wrap-style:square;v-text-anchor:top" o:gfxdata="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" filled="f" stroked="f">
                 <v:textbox inset="0,0,0,0">
                   <w:txbxContent>
                     <w:p>
-                      <w:pPr>
-                        <w:spacing w:before="0" w:after="160" w:line="259" w:lineRule="auto"/>
-                      </w:pPr>
                       <w:r>
                         <w:rPr>
-                          <w:rFonts w:cs="Times New Roman" w:hAnsi="Times New Roman" w:eastAsia="Times New Roman" w:ascii="Times New Roman"/>
+                          <w:rFonts w:ascii="Times New Roman" w:eastAsia="Times New Roman" w:hAnsi="Times New Roman" w:cs="Times New Roman"/>
                           <w:sz w:val="24"/>
                         </w:rPr>
-                        <w:t xml:space="preserve">án cu</w:t>
+                        <w:t>án cu</w:t>
                       </w:r>
                     </w:p>
                   </w:txbxContent>
                 </v:textbox>
               </v:rect>
-              <v:rect id="Rectangle 43156" style="position:absolute;width:1013;height:1843;left:60286;top:819;" filled="f" stroked="f">
+              <v:rect id="Rectangle 43156" o:spid="_x0000_s1245" style="position:absolute;left:60286;top:819;width:1013;height:1844;visibility:visible;mso-wrap-style:square;v-text-anchor:top" o:gfxdata="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" filled="f" stroked="f">
                 <v:textbox inset="0,0,0,0">
                   <w:txbxContent>
                     <w:p>
-                      <w:pPr>
-                        <w:spacing w:before="0" w:after="160" w:line="259" w:lineRule="auto"/>
-                      </w:pPr>
                       <w:r>
                         <w:rPr>
-                          <w:rFonts w:cs="Times New Roman" w:hAnsi="Times New Roman" w:eastAsia="Times New Roman" w:ascii="Times New Roman"/>
+                          <w:rFonts w:ascii="Times New Roman" w:eastAsia="Times New Roman" w:hAnsi="Times New Roman" w:cs="Times New Roman"/>
                           <w:sz w:val="24"/>
                         </w:rPr>
-                        <w:t xml:space="preserve">ố</w:t>
+                        <w:t>ố</w:t>
                       </w:r>
                     </w:p>
                   </w:txbxContent>
                 </v:textbox>
               </v:rect>
-              <v:rect id="Rectangle 43157" style="position:absolute;width:2069;height:1843;left:61048;top:819;" filled="f" stroked="f">
+              <v:rect id="Rectangle 43157" o:spid="_x0000_s1246" style="position:absolute;left:61048;top:819;width:2069;height:1844;visibility:visible;mso-wrap-style:square;v-text-anchor:top" o:gfxdata="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" filled="f" stroked="f">
                 <v:textbox inset="0,0,0,0">
                   <w:txbxContent>
                     <w:p>
-                      <w:pPr>
-                        <w:spacing w:before="0" w:after="160" w:line="259" w:lineRule="auto"/>
-                      </w:pPr>
                       <w:r>
                         <w:rPr>
-                          <w:rFonts w:cs="Times New Roman" w:hAnsi="Times New Roman" w:eastAsia="Times New Roman" w:ascii="Times New Roman"/>
+                          <w:rFonts w:ascii="Times New Roman" w:eastAsia="Times New Roman" w:hAnsi="Times New Roman" w:cs="Times New Roman"/>
                           <w:sz w:val="24"/>
                         </w:rPr>
-                        <w:t xml:space="preserve">i k</w:t>
+                        <w:t>i k</w:t>
                       </w:r>
                     </w:p>
                   </w:txbxContent>
                 </v:textbox>
               </v:rect>
-              <v:rect id="Rectangle 43158" style="position:absolute;width:1013;height:1843;left:62604;top:819;" filled="f" stroked="f">
+              <v:rect id="Rectangle 43158" o:spid="_x0000_s1247" style="position:absolute;left:62604;top:819;width:1013;height:1844;visibility:visible;mso-wrap-style:square;v-text-anchor:top" o:gfxdata="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" filled="f" stroked="f">
                 <v:textbox inset="0,0,0,0">
                   <w:txbxContent>
                     <w:p>
-                      <w:pPr>
-                        <w:spacing w:before="0" w:after="160" w:line="259" w:lineRule="auto"/>
-                      </w:pPr>
                       <w:r>
                         <w:rPr>
-                          <w:rFonts w:cs="Times New Roman" w:hAnsi="Times New Roman" w:eastAsia="Times New Roman" w:ascii="Times New Roman"/>
+                          <w:rFonts w:ascii="Times New Roman" w:eastAsia="Times New Roman" w:hAnsi="Times New Roman" w:cs="Times New Roman"/>
                           <w:sz w:val="24"/>
                         </w:rPr>
-                        <w:t xml:space="preserve">ỳ</w:t>
+                        <w:t>ỳ</w:t>
                       </w:r>
                     </w:p>
                   </w:txbxContent>
                 </v:textbox>
               </v:rect>
-              <v:rect id="Rectangle 43159" style="position:absolute;width:506;height:1843;left:63399;top:819;" filled="f" stroked="f">
+              <v:rect id="Rectangle 43159" o:spid="_x0000_s1248" style="position:absolute;left:63399;top:819;width:506;height:1844;visibility:visible;mso-wrap-style:square;v-text-anchor:top" o:gfxdata="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" filled="f" stroked="f">
                 <v:textbox inset="0,0,0,0">
                   <w:txbxContent>
                     <w:p>
-                      <w:pPr>
-                        <w:spacing w:before="0" w:after="160" w:line="259" w:lineRule="auto"/>
-                      </w:pPr>
                       <w:r>
                         <w:rPr>
-                          <w:rFonts w:cs="Times New Roman" w:hAnsi="Times New Roman" w:eastAsia="Times New Roman" w:ascii="Times New Roman"/>
+                          <w:rFonts w:ascii="Times New Roman" w:eastAsia="Times New Roman" w:hAnsi="Times New Roman" w:cs="Times New Roman"/>
                           <w:sz w:val="24"/>
                         </w:rPr>
                         <w:t xml:space="preserve"> </w:t>
@@ -28212,27 +28060,27 @@
                   </w:txbxContent>
                 </v:textbox>
               </v:rect>
-              <v:shape id="Shape 44446" style="position:absolute;width:36497;height:447;left:95;top:0;" coordsize="3649726,44768" path="m0,0l3649726,0l3649726,44768l0,44768l0,0">
-                <v:stroke weight="0pt" endcap="flat" joinstyle="miter" miterlimit="10" on="false" color="#000000" opacity="0"/>
-                <v:fill on="true" color="#0070c0"/>
+              <v:shape id="Shape 44439" o:spid="_x0000_s1249" style="position:absolute;left:95;width:36497;height:447;visibility:visible;mso-wrap-style:square;v-text-anchor:top" coordsize="3649726,44768" o:gfxdata="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" path="m,l3649726,r,44768l,44768,,e" fillcolor="#0070c0" stroked="f" strokeweight="0">
+                <v:stroke miterlimit="83231f" joinstyle="miter"/>
+                <v:path arrowok="t" textboxrect="0,0,3649726,44768"/>
               </v:shape>
-              <v:shape id="Shape 44447" style="position:absolute;width:36497;height:444;left:95;top:2511;" coordsize="3649726,44450" path="m0,0l3649726,0l3649726,44450l0,44450l0,0">
-                <v:stroke weight="0pt" endcap="flat" joinstyle="miter" miterlimit="10" on="false" color="#000000" opacity="0"/>
-                <v:fill on="true" color="#0070c0"/>
+              <v:shape id="Shape 44440" o:spid="_x0000_s1250" style="position:absolute;left:95;top:2511;width:36497;height:444;visibility:visible;mso-wrap-style:square;v-text-anchor:top" coordsize="3649726,44450" o:gfxdata="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" path="m,l3649726,r,44450l,44450,,e" fillcolor="#0070c0" stroked="f" strokeweight="0">
+                <v:stroke miterlimit="83231f" joinstyle="miter"/>
+                <v:path arrowok="t" textboxrect="0,0,3649726,44450"/>
               </v:shape>
-              <v:shape id="Shape 44448" style="position:absolute;width:36592;height:91;left:0;top:2955;" coordsize="3659251,9144" path="m0,0l3659251,0l3659251,9144l0,9144l0,0">
-                <v:stroke weight="0pt" endcap="flat" joinstyle="miter" miterlimit="10" on="false" color="#000000" opacity="0"/>
-                <v:fill on="true" color="#0070c0"/>
+              <v:shape id="Shape 44441" o:spid="_x0000_s1251" style="position:absolute;top:2955;width:36592;height:92;visibility:visible;mso-wrap-style:square;v-text-anchor:top" coordsize="3659251,9144" o:gfxdata="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" path="m,l3659251,r,9144l,9144,,e" fillcolor="#0070c0" stroked="f" strokeweight="0">
+                <v:stroke miterlimit="83231f" joinstyle="miter"/>
+                <v:path arrowok="t" textboxrect="0,0,3659251,9144"/>
               </v:shape>
-              <v:shape id="Shape 44449" style="position:absolute;width:91;height:91;left:36496;top:2955;" coordsize="9144,9144" path="m0,0l9144,0l9144,9144l0,9144l0,0">
-                <v:stroke weight="0pt" endcap="flat" joinstyle="miter" miterlimit="10" on="false" color="#000000" opacity="0"/>
-                <v:fill on="true" color="#0070c0"/>
+              <v:shape id="Shape 44442" o:spid="_x0000_s1252" style="position:absolute;left:36496;top:2955;width:92;height:92;visibility:visible;mso-wrap-style:square;v-text-anchor:top" coordsize="9144,9144" o:gfxdata="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" path="m,l9144,r,9144l,9144,,e" fillcolor="#0070c0" stroked="f" strokeweight="0">
+                <v:stroke miterlimit="83231f" joinstyle="miter"/>
+                <v:path arrowok="t" textboxrect="0,0,9144,9144"/>
               </v:shape>
-              <v:shape id="Shape 44450" style="position:absolute;width:27569;height:91;left:36560;top:2955;" coordsize="2756916,9144" path="m0,0l2756916,0l2756916,9144l0,9144l0,0">
-                <v:stroke weight="0pt" endcap="flat" joinstyle="miter" miterlimit="10" on="false" color="#000000" opacity="0"/>
-                <v:fill on="true" color="#0070c0"/>
+              <v:shape id="Shape 44443" o:spid="_x0000_s1253" style="position:absolute;left:36560;top:2955;width:27569;height:92;visibility:visible;mso-wrap-style:square;v-text-anchor:top" coordsize="2756916,9144" o:gfxdata="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" path="m,l2756916,r,9144l,9144,,e" fillcolor="#0070c0" stroked="f" strokeweight="0">
+                <v:stroke miterlimit="83231f" joinstyle="miter"/>
+                <v:path arrowok="t" textboxrect="0,0,2756916,9144"/>
               </v:shape>
-              <w10:wrap type="square"/>
+              <w10:wrap type="square" anchorx="page" anchory="page"/>
             </v:group>
           </w:pict>
         </mc:Fallback>
@@ -28254,7 +28102,7 @@
       <mc:AlternateContent>
         <mc:Choice Requires="wpg">
           <w:drawing>
-            <wp:anchor distT="0" distB="0" distL="114300" distR="114300" simplePos="0" relativeHeight="251666432" behindDoc="1" locked="0" layoutInCell="1" allowOverlap="1">
+            <wp:anchor distT="0" distB="0" distL="114300" distR="114300" simplePos="0" relativeHeight="251666432" behindDoc="1" locked="0" layoutInCell="1" allowOverlap="1" wp14:anchorId="0950A235" wp14:editId="756B931B">
               <wp:simplePos x="0" y="0"/>
               <wp:positionH relativeFrom="page">
                 <wp:posOffset>0</wp:posOffset>
@@ -28297,7 +28145,7 @@
 </file>
 
 <file path=word/numbering.xml><?xml version="1.0" encoding="utf-8"?>
-<w:numbering xmlns:wpc="http://schemas.microsoft.com/office/word/2010/wordprocessingCanvas" xmlns:cx="http://schemas.microsoft.com/office/drawing/2014/chartex" xmlns:mc="http://schemas.openxmlformats.org/markup-compatibility/2006" xmlns:o="urn:schemas-microsoft-com:office:office" xmlns:r="http://schemas.openxmlformats.org/officeDocument/2006/relationships" xmlns:m="http://schemas.openxmlformats.org/officeDocument/2006/math" xmlns:v="urn:schemas-microsoft-com:vml" xmlns:wp14="http://schemas.microsoft.com/office/word/2010/wordprocessingDrawing" xmlns:wp="http://schemas.openxmlformats.org/drawingml/2006/wordprocessingDrawing" xmlns:w10="urn:schemas-microsoft-com:office:word" xmlns:w="http://schemas.openxmlformats.org/wordprocessingml/2006/main" xmlns:w14="http://schemas.microsoft.com/office/word/2010/wordml" xmlns:w15="http://schemas.microsoft.com/office/word/2012/wordml" xmlns:w16se="http://schemas.microsoft.com/office/word/2015/wordml/symex" xmlns:wpg="http://schemas.microsoft.com/office/word/2010/wordprocessingGroup" xmlns:wpi="http://schemas.microsoft.com/office/word/2010/wordprocessingInk" xmlns:wne="http://schemas.microsoft.com/office/word/2006/wordml" xmlns:wps="http://schemas.microsoft.com/office/word/2010/wordprocessingShape" mc:Ignorable="w14 w15 w16se wp14">
+<w:numbering xmlns:wpc="http://schemas.microsoft.com/office/word/2010/wordprocessingCanvas" xmlns:cx="http://schemas.microsoft.com/office/drawing/2014/chartex" xmlns:cx1="http://schemas.microsoft.com/office/drawing/2015/9/8/chartex" xmlns:cx2="http://schemas.microsoft.com/office/drawing/2015/10/21/chartex" xmlns:cx3="http://schemas.microsoft.com/office/drawing/2016/5/9/chartex" xmlns:cx4="http://schemas.microsoft.com/office/drawing/2016/5/10/chartex" xmlns:cx5="http://schemas.microsoft.com/office/drawing/2016/5/11/chartex" xmlns:cx6="http://schemas.microsoft.com/office/drawing/2016/5/12/chartex" xmlns:cx7="http://schemas.microsoft.com/office/drawing/2016/5/13/chartex" xmlns:cx8="http://schemas.microsoft.com/office/drawing/2016/5/14/chartex" xmlns:mc="http://schemas.openxmlformats.org/markup-compatibility/2006" xmlns:aink="http://schemas.microsoft.com/office/drawing/2016/ink" xmlns:am3d="http://schemas.microsoft.com/office/drawing/2017/model3d" xmlns:o="urn:schemas-microsoft-com:office:office" xmlns:oel="http://schemas.microsoft.com/office/2019/extlst" xmlns:r="http://schemas.openxmlformats.org/officeDocument/2006/relationships" xmlns:m="http://schemas.openxmlformats.org/officeDocument/2006/math" xmlns:v="urn:schemas-microsoft-com:vml" xmlns:wp14="http://schemas.microsoft.com/office/word/2010/wordprocessingDrawing" xmlns:wp="http://schemas.openxmlformats.org/drawingml/2006/wordprocessingDrawing" xmlns:w10="urn:schemas-microsoft-com:office:word" xmlns:w="http://schemas.openxmlformats.org/wordprocessingml/2006/main" xmlns:w14="http://schemas.microsoft.com/office/word/2010/wordml" xmlns:w15="http://schemas.microsoft.com/office/word/2012/wordml" xmlns:w16cex="http://schemas.microsoft.com/office/word/2018/wordml/cex" xmlns:w16cid="http://schemas.microsoft.com/office/word/2016/wordml/cid" xmlns:w16="http://schemas.microsoft.com/office/word/2018/wordml" xmlns:w16du="http://schemas.microsoft.com/office/word/2023/wordml/word16du" xmlns:w16sdtdh="http://schemas.microsoft.com/office/word/2020/wordml/sdtdatahash" xmlns:w16sdtfl="http://schemas.microsoft.com/office/word/2024/wordml/sdtformatlock" xmlns:w16se="http://schemas.microsoft.com/office/word/2015/wordml/symex" xmlns:wpg="http://schemas.microsoft.com/office/word/2010/wordprocessingGroup" xmlns:wpi="http://schemas.microsoft.com/office/word/2010/wordprocessingInk" xmlns:wne="http://schemas.microsoft.com/office/word/2006/wordml" xmlns:wps="http://schemas.microsoft.com/office/word/2010/wordprocessingShape" mc:Ignorable="w14 w15 w16se w16cid w16 w16cex w16sdtdh w16sdtfl w16du wp14">
   <w:abstractNum w:abstractNumId="0" w15:restartNumberingAfterBreak="0">
     <w:nsid w:val="163D5318"/>
     <w:multiLevelType w:val="multilevel"/>
@@ -28750,17 +28598,17 @@
       </w:rPr>
     </w:lvl>
   </w:abstractNum>
-  <w:num w:numId="1">
+  <w:num w:numId="1" w16cid:durableId="1455447842">
     <w:abstractNumId w:val="0"/>
   </w:num>
-  <w:num w:numId="2">
+  <w:num w:numId="2" w16cid:durableId="71005483">
     <w:abstractNumId w:val="1"/>
   </w:num>
 </w:numbering>
 </file>
 
 <file path=word/styles.xml><?xml version="1.0" encoding="utf-8"?>
-<w:styles xmlns:mc="http://schemas.openxmlformats.org/markup-compatibility/2006" xmlns:r="http://schemas.openxmlformats.org/officeDocument/2006/relationships" xmlns:w="http://schemas.openxmlformats.org/wordprocessingml/2006/main" xmlns:w14="http://schemas.microsoft.com/office/word/2010/wordml" xmlns:w15="http://schemas.microsoft.com/office/word/2012/wordml" xmlns:w16se="http://schemas.microsoft.com/office/word/2015/wordml/symex" mc:Ignorable="w14 w15 w16se">
+<w:styles xmlns:mc="http://schemas.openxmlformats.org/markup-compatibility/2006" xmlns:r="http://schemas.openxmlformats.org/officeDocument/2006/relationships" xmlns:w="http://schemas.openxmlformats.org/wordprocessingml/2006/main" xmlns:w14="http://schemas.microsoft.com/office/word/2010/wordml" xmlns:w15="http://schemas.microsoft.com/office/word/2012/wordml" xmlns:w16cex="http://schemas.microsoft.com/office/word/2018/wordml/cex" xmlns:w16cid="http://schemas.microsoft.com/office/word/2016/wordml/cid" xmlns:w16="http://schemas.microsoft.com/office/word/2018/wordml" xmlns:w16du="http://schemas.microsoft.com/office/word/2023/wordml/word16du" xmlns:w16sdtdh="http://schemas.microsoft.com/office/word/2020/wordml/sdtdatahash" xmlns:w16sdtfl="http://schemas.microsoft.com/office/word/2024/wordml/sdtformatlock" xmlns:w16se="http://schemas.microsoft.com/office/word/2015/wordml/symex" mc:Ignorable="w14 w15 w16se w16cid w16 w16cex w16sdtdh w16sdtfl w16du">
   <w:docDefaults>
     <w:rPrDefault>
       <w:rPr>
@@ -28776,7 +28624,7 @@
       </w:pPr>
     </w:pPrDefault>
   </w:docDefaults>
-  <w:latentStyles w:defLockedState="0" w:defUIPriority="99" w:defSemiHidden="0" w:defUnhideWhenUsed="0" w:defQFormat="0" w:count="371">
+  <w:latentStyles w:defLockedState="0" w:defUIPriority="99" w:defSemiHidden="0" w:defUnhideWhenUsed="0" w:defQFormat="0" w:count="376">
     <w:lsdException w:name="Normal" w:uiPriority="0" w:qFormat="1"/>
     <w:lsdException w:name="heading 1" w:uiPriority="9" w:qFormat="1"/>
     <w:lsdException w:name="heading 2" w:semiHidden="1" w:uiPriority="9" w:unhideWhenUsed="1" w:qFormat="1"/>
@@ -29148,6 +28996,11 @@
     <w:lsdException w:name="List Table 5 Dark Accent 6" w:uiPriority="50"/>
     <w:lsdException w:name="List Table 6 Colorful Accent 6" w:uiPriority="51"/>
     <w:lsdException w:name="List Table 7 Colorful Accent 6" w:uiPriority="52"/>
+    <w:lsdException w:name="Mention" w:semiHidden="1" w:unhideWhenUsed="1"/>
+    <w:lsdException w:name="Smart Hyperlink" w:semiHidden="1" w:unhideWhenUsed="1"/>
+    <w:lsdException w:name="Hashtag" w:semiHidden="1" w:unhideWhenUsed="1"/>
+    <w:lsdException w:name="Unresolved Mention" w:semiHidden="1" w:unhideWhenUsed="1"/>
+    <w:lsdException w:name="Smart Link" w:semiHidden="1" w:unhideWhenUsed="1"/>
   </w:latentStyles>
   <w:style w:type="paragraph" w:default="1" w:styleId="Normal">
     <w:name w:val="Normal"/>

</xml_diff>